<commit_message>
Clarify type comments in lexer.py
Updated comments in the TIPOS dictionary of lexer.py to clarify that types are for explicit typing. Expanded comment details for each type to indicate explicit typing usage.
</commit_message>
<xml_diff>
--- a/docs/HOOP.docx
+++ b/docs/HOOP.docx
@@ -10,6 +10,7 @@
           <w:bCs/>
           <w:sz w:val="28"/>
           <w:szCs w:val="28"/>
+          <w:lang w:val="en-US"/>
         </w:rPr>
       </w:pPr>
       <w:r>
@@ -19,87 +20,10 @@
           <w:bCs/>
           <w:sz w:val="28"/>
           <w:szCs w:val="28"/>
-        </w:rPr>
-        <w:t xml:space="preserve">HOOP – Human </w:t>
-      </w:r>
-      <w:proofErr w:type="spellStart"/>
-      <w:r>
-        <w:rPr>
-          <w:rFonts w:ascii="Times New Roman" w:hAnsi="Times New Roman" w:cs="Times New Roman"/>
-          <w:b/>
-          <w:bCs/>
-          <w:sz w:val="28"/>
-          <w:szCs w:val="28"/>
-        </w:rPr>
-        <w:t>Object</w:t>
-      </w:r>
-      <w:proofErr w:type="spellEnd"/>
-      <w:r>
-        <w:rPr>
-          <w:rFonts w:ascii="Times New Roman" w:hAnsi="Times New Roman" w:cs="Times New Roman"/>
-          <w:b/>
-          <w:bCs/>
-          <w:sz w:val="28"/>
-          <w:szCs w:val="28"/>
-        </w:rPr>
-        <w:t xml:space="preserve"> </w:t>
-      </w:r>
-      <w:proofErr w:type="spellStart"/>
-      <w:r>
-        <w:rPr>
-          <w:rFonts w:ascii="Times New Roman" w:hAnsi="Times New Roman" w:cs="Times New Roman"/>
-          <w:b/>
-          <w:bCs/>
-          <w:sz w:val="28"/>
-          <w:szCs w:val="28"/>
-        </w:rPr>
-        <w:t>Orientated</w:t>
-      </w:r>
-      <w:proofErr w:type="spellEnd"/>
-      <w:r>
-        <w:rPr>
-          <w:rFonts w:ascii="Times New Roman" w:hAnsi="Times New Roman" w:cs="Times New Roman"/>
-          <w:b/>
-          <w:bCs/>
-          <w:sz w:val="28"/>
-          <w:szCs w:val="28"/>
-        </w:rPr>
-        <w:t xml:space="preserve"> </w:t>
-      </w:r>
-      <w:proofErr w:type="spellStart"/>
-      <w:r>
-        <w:rPr>
-          <w:rFonts w:ascii="Times New Roman" w:hAnsi="Times New Roman" w:cs="Times New Roman"/>
-          <w:b/>
-          <w:bCs/>
-          <w:sz w:val="28"/>
-          <w:szCs w:val="28"/>
-        </w:rPr>
-        <w:t>Programming</w:t>
-      </w:r>
-      <w:proofErr w:type="spellEnd"/>
-      <w:r>
-        <w:rPr>
-          <w:rFonts w:ascii="Times New Roman" w:hAnsi="Times New Roman" w:cs="Times New Roman"/>
-          <w:b/>
-          <w:bCs/>
-          <w:sz w:val="28"/>
-          <w:szCs w:val="28"/>
-        </w:rPr>
-        <w:t xml:space="preserve"> </w:t>
-      </w:r>
-      <w:proofErr w:type="spellStart"/>
-      <w:r>
-        <w:rPr>
-          <w:rFonts w:ascii="Times New Roman" w:hAnsi="Times New Roman" w:cs="Times New Roman"/>
-          <w:b/>
-          <w:bCs/>
-          <w:sz w:val="28"/>
-          <w:szCs w:val="28"/>
-        </w:rPr>
-        <w:t>Language</w:t>
-      </w:r>
-      <w:proofErr w:type="spellEnd"/>
+          <w:lang w:val="en-US"/>
+        </w:rPr>
+        <w:t>HOOP – Human Object Orientated Programming Language</w:t>
+      </w:r>
     </w:p>
     <w:p>
       <w:pPr>
@@ -122,31 +46,7 @@
           <w:sz w:val="28"/>
           <w:szCs w:val="28"/>
         </w:rPr>
-        <w:t>HOOP</w:t>
-      </w:r>
-      <w:r>
-        <w:rPr>
-          <w:rFonts w:ascii="Times New Roman" w:hAnsi="Times New Roman" w:cs="Times New Roman"/>
-          <w:b/>
-          <w:bCs/>
-          <w:i/>
-          <w:iCs/>
-          <w:sz w:val="28"/>
-          <w:szCs w:val="28"/>
-        </w:rPr>
-        <w:t xml:space="preserve"> </w:t>
-      </w:r>
-      <w:r>
-        <w:rPr>
-          <w:rFonts w:ascii="Times New Roman" w:hAnsi="Times New Roman" w:cs="Times New Roman"/>
-          <w:b/>
-          <w:bCs/>
-          <w:i/>
-          <w:iCs/>
-          <w:sz w:val="28"/>
-          <w:szCs w:val="28"/>
-        </w:rPr>
-        <w:t>Documentación</w:t>
+        <w:t>HOOP Documentación</w:t>
       </w:r>
       <w:r>
         <w:rPr>
@@ -327,6 +227,7 @@
           <w:rFonts w:ascii="Times New Roman" w:eastAsia="Times New Roman" w:hAnsi="Times New Roman" w:cs="Times New Roman"/>
           <w:i/>
           <w:iCs/>
+          <w:highlight w:val="lightGray"/>
         </w:rPr>
         <w:t>mold</w:t>
       </w:r>
@@ -343,6 +244,7 @@
           <w:rFonts w:ascii="Times New Roman" w:eastAsia="Times New Roman" w:hAnsi="Times New Roman" w:cs="Times New Roman"/>
           <w:i/>
           <w:iCs/>
+          <w:highlight w:val="lightGray"/>
         </w:rPr>
         <w:t>action</w:t>
       </w:r>
@@ -359,6 +261,7 @@
           <w:rFonts w:ascii="Times New Roman" w:eastAsia="Times New Roman" w:hAnsi="Times New Roman" w:cs="Times New Roman"/>
           <w:i/>
           <w:iCs/>
+          <w:highlight w:val="lightGray"/>
         </w:rPr>
         <w:t>self</w:t>
       </w:r>
@@ -377,6 +280,2811 @@
         </w:rPr>
         <w:t>para referencia interna</w:t>
       </w:r>
+    </w:p>
+    <w:p>
+      <w:pPr>
+        <w:pStyle w:val="Prrafodelista"/>
+        <w:numPr>
+          <w:ilvl w:val="0"/>
+          <w:numId w:val="1"/>
+        </w:numPr>
+        <w:rPr>
+          <w:rFonts w:ascii="Times New Roman" w:eastAsia="Times New Roman" w:hAnsi="Times New Roman" w:cs="Times New Roman"/>
+        </w:rPr>
+      </w:pPr>
+      <w:r>
+        <w:rPr>
+          <w:rFonts w:ascii="Times New Roman" w:eastAsia="Times New Roman" w:hAnsi="Times New Roman" w:cs="Times New Roman"/>
+        </w:rPr>
+        <w:t xml:space="preserve">Posee un </w:t>
+      </w:r>
+      <w:r>
+        <w:rPr>
+          <w:rFonts w:ascii="Times New Roman" w:eastAsia="Times New Roman" w:hAnsi="Times New Roman" w:cs="Times New Roman"/>
+          <w:b/>
+          <w:bCs/>
+        </w:rPr>
+        <w:t>tipado hibrido</w:t>
+      </w:r>
+      <w:r>
+        <w:rPr>
+          <w:rFonts w:ascii="Times New Roman" w:eastAsia="Times New Roman" w:hAnsi="Times New Roman" w:cs="Times New Roman"/>
+        </w:rPr>
+        <w:t xml:space="preserve">, permitiendo al usuario decidir </w:t>
+      </w:r>
+      <w:r>
+        <w:rPr>
+          <w:rFonts w:ascii="Times New Roman" w:eastAsia="Times New Roman" w:hAnsi="Times New Roman" w:cs="Times New Roman"/>
+        </w:rPr>
+        <w:t>cuando sea explicito.</w:t>
+      </w:r>
+    </w:p>
+    <w:p>
+      <w:pPr>
+        <w:pStyle w:val="Prrafodelista"/>
+        <w:ind w:left="360"/>
+        <w:rPr>
+          <w:rFonts w:ascii="Times New Roman" w:eastAsia="Times New Roman" w:hAnsi="Times New Roman" w:cs="Times New Roman"/>
+        </w:rPr>
+      </w:pPr>
+    </w:p>
+    <w:p>
+      <w:pPr>
+        <w:pStyle w:val="Prrafodelista"/>
+        <w:ind w:left="360"/>
+        <w:rPr>
+          <w:rFonts w:ascii="Times New Roman" w:eastAsia="Times New Roman" w:hAnsi="Times New Roman" w:cs="Times New Roman"/>
+        </w:rPr>
+      </w:pPr>
+    </w:p>
+    <w:p>
+      <w:pPr>
+        <w:pStyle w:val="Prrafodelista"/>
+        <w:ind w:left="0"/>
+        <w:rPr>
+          <w:rFonts w:ascii="Times New Roman" w:eastAsia="Times New Roman" w:hAnsi="Times New Roman" w:cs="Times New Roman"/>
+          <w:b/>
+          <w:bCs/>
+        </w:rPr>
+      </w:pPr>
+      <w:r>
+        <w:rPr>
+          <w:rFonts w:ascii="Times New Roman" w:eastAsia="Times New Roman" w:hAnsi="Times New Roman" w:cs="Times New Roman"/>
+          <w:b/>
+          <w:bCs/>
+        </w:rPr>
+        <w:t>3</w:t>
+      </w:r>
+      <w:r>
+        <w:rPr>
+          <w:rFonts w:ascii="Times New Roman" w:eastAsia="Times New Roman" w:hAnsi="Times New Roman" w:cs="Times New Roman"/>
+          <w:b/>
+          <w:bCs/>
+        </w:rPr>
+        <w:t xml:space="preserve">. </w:t>
+      </w:r>
+      <w:r>
+        <w:rPr>
+          <w:rFonts w:ascii="Times New Roman" w:eastAsia="Times New Roman" w:hAnsi="Times New Roman" w:cs="Times New Roman"/>
+          <w:b/>
+          <w:bCs/>
+        </w:rPr>
+        <w:t>Funcionamiento de HOOP.</w:t>
+      </w:r>
+    </w:p>
+    <w:p>
+      <w:pPr>
+        <w:pStyle w:val="Prrafodelista"/>
+        <w:ind w:left="0"/>
+        <w:rPr>
+          <w:rFonts w:ascii="Times New Roman" w:eastAsia="Times New Roman" w:hAnsi="Times New Roman" w:cs="Times New Roman"/>
+          <w:b/>
+          <w:bCs/>
+        </w:rPr>
+      </w:pPr>
+    </w:p>
+    <w:p>
+      <w:pPr>
+        <w:pStyle w:val="Prrafodelista"/>
+        <w:ind w:left="0"/>
+        <w:rPr>
+          <w:rFonts w:ascii="Times New Roman" w:eastAsia="Times New Roman" w:hAnsi="Times New Roman" w:cs="Times New Roman"/>
+          <w:b/>
+          <w:bCs/>
+        </w:rPr>
+      </w:pPr>
+      <w:r>
+        <w:rPr>
+          <w:rFonts w:ascii="Times New Roman" w:eastAsia="Times New Roman" w:hAnsi="Times New Roman" w:cs="Times New Roman"/>
+          <w:b/>
+          <w:bCs/>
+        </w:rPr>
+        <w:t>3.1 Etapa de análisis léxico.</w:t>
+      </w:r>
+    </w:p>
+    <w:p>
+      <w:pPr>
+        <w:pStyle w:val="Prrafodelista"/>
+        <w:ind w:left="0"/>
+        <w:rPr>
+          <w:rFonts w:ascii="Times New Roman" w:eastAsia="Times New Roman" w:hAnsi="Times New Roman" w:cs="Times New Roman"/>
+          <w:b/>
+          <w:bCs/>
+        </w:rPr>
+      </w:pPr>
+    </w:p>
+    <w:p>
+      <w:pPr>
+        <w:pStyle w:val="Prrafodelista"/>
+        <w:ind w:left="0"/>
+        <w:rPr>
+          <w:rFonts w:ascii="Times New Roman" w:eastAsia="Times New Roman" w:hAnsi="Times New Roman" w:cs="Times New Roman"/>
+        </w:rPr>
+      </w:pPr>
+      <w:r>
+        <w:rPr>
+          <w:rFonts w:ascii="Times New Roman" w:eastAsia="Times New Roman" w:hAnsi="Times New Roman" w:cs="Times New Roman"/>
+        </w:rPr>
+        <w:t xml:space="preserve">Su </w:t>
+      </w:r>
+      <w:r>
+        <w:rPr>
+          <w:rFonts w:ascii="Times New Roman" w:eastAsia="Times New Roman" w:hAnsi="Times New Roman" w:cs="Times New Roman"/>
+        </w:rPr>
+        <w:t>“</w:t>
+      </w:r>
+      <w:r>
+        <w:rPr>
+          <w:rFonts w:ascii="Times New Roman" w:eastAsia="Times New Roman" w:hAnsi="Times New Roman" w:cs="Times New Roman"/>
+          <w:b/>
+          <w:bCs/>
+        </w:rPr>
+        <w:t>LEXER</w:t>
+      </w:r>
+      <w:r>
+        <w:rPr>
+          <w:rFonts w:ascii="Times New Roman" w:eastAsia="Times New Roman" w:hAnsi="Times New Roman" w:cs="Times New Roman"/>
+        </w:rPr>
+        <w:t>”</w:t>
+      </w:r>
+      <w:r>
+        <w:rPr>
+          <w:rFonts w:ascii="Times New Roman" w:eastAsia="Times New Roman" w:hAnsi="Times New Roman" w:cs="Times New Roman"/>
+        </w:rPr>
+        <w:t xml:space="preserve"> posee un flujo de creación de Tokens, recibiendo la entrada completa, pasando por </w:t>
+      </w:r>
+      <w:r>
+        <w:rPr>
+          <w:rFonts w:ascii="Times New Roman" w:eastAsia="Times New Roman" w:hAnsi="Times New Roman" w:cs="Times New Roman"/>
+        </w:rPr>
+        <w:t>la</w:t>
+      </w:r>
+      <w:r>
+        <w:rPr>
+          <w:rFonts w:ascii="Times New Roman" w:eastAsia="Times New Roman" w:hAnsi="Times New Roman" w:cs="Times New Roman"/>
+        </w:rPr>
+        <w:t xml:space="preserve"> lectura carácter por carácter, para luego agruparlos según los espacios </w:t>
+      </w:r>
+      <w:r>
+        <w:rPr>
+          <w:rFonts w:ascii="Times New Roman" w:eastAsia="Times New Roman" w:hAnsi="Times New Roman" w:cs="Times New Roman"/>
+        </w:rPr>
+        <w:t xml:space="preserve">vacíos </w:t>
+      </w:r>
+      <w:r>
+        <w:rPr>
+          <w:rFonts w:ascii="Times New Roman" w:eastAsia="Times New Roman" w:hAnsi="Times New Roman" w:cs="Times New Roman"/>
+        </w:rPr>
+        <w:t xml:space="preserve">encontrados, y clasificarlos según corresponda </w:t>
+      </w:r>
+      <w:r>
+        <w:rPr>
+          <w:rFonts w:ascii="Times New Roman" w:eastAsia="Times New Roman" w:hAnsi="Times New Roman" w:cs="Times New Roman"/>
+        </w:rPr>
+        <w:t>[KEYWORD, WHITESPACE, IDENTIFIER, WHITESPACE, OPERATOR, WHITESPACE, STRING]</w:t>
+      </w:r>
+      <w:r>
+        <w:rPr>
+          <w:rFonts w:ascii="Times New Roman" w:eastAsia="Times New Roman" w:hAnsi="Times New Roman" w:cs="Times New Roman"/>
+        </w:rPr>
+        <w:t xml:space="preserve">, por </w:t>
+      </w:r>
+      <w:r>
+        <w:rPr>
+          <w:rFonts w:ascii="Times New Roman" w:eastAsia="Times New Roman" w:hAnsi="Times New Roman" w:cs="Times New Roman"/>
+        </w:rPr>
+        <w:t>último</w:t>
+      </w:r>
+      <w:r>
+        <w:rPr>
+          <w:rFonts w:ascii="Times New Roman" w:eastAsia="Times New Roman" w:hAnsi="Times New Roman" w:cs="Times New Roman"/>
+        </w:rPr>
+        <w:t xml:space="preserve"> genera los tokens según corresponda con una estructura: TOKEN (&lt;</w:t>
+      </w:r>
+      <w:proofErr w:type="spellStart"/>
+      <w:r>
+        <w:rPr>
+          <w:rFonts w:ascii="Times New Roman" w:eastAsia="Times New Roman" w:hAnsi="Times New Roman" w:cs="Times New Roman"/>
+        </w:rPr>
+        <w:t>TokenType</w:t>
+      </w:r>
+      <w:proofErr w:type="spellEnd"/>
+      <w:r>
+        <w:rPr>
+          <w:rFonts w:ascii="Times New Roman" w:eastAsia="Times New Roman" w:hAnsi="Times New Roman" w:cs="Times New Roman"/>
+        </w:rPr>
+        <w:t>&gt;, &lt;</w:t>
+      </w:r>
+      <w:proofErr w:type="spellStart"/>
+      <w:r>
+        <w:rPr>
+          <w:rFonts w:ascii="Times New Roman" w:eastAsia="Times New Roman" w:hAnsi="Times New Roman" w:cs="Times New Roman"/>
+        </w:rPr>
+        <w:t>TokenContent</w:t>
+      </w:r>
+      <w:proofErr w:type="spellEnd"/>
+      <w:r>
+        <w:rPr>
+          <w:rFonts w:ascii="Times New Roman" w:eastAsia="Times New Roman" w:hAnsi="Times New Roman" w:cs="Times New Roman"/>
+        </w:rPr>
+        <w:t>&gt;, &lt;</w:t>
+      </w:r>
+      <w:proofErr w:type="spellStart"/>
+      <w:r>
+        <w:rPr>
+          <w:rFonts w:ascii="Times New Roman" w:eastAsia="Times New Roman" w:hAnsi="Times New Roman" w:cs="Times New Roman"/>
+        </w:rPr>
+        <w:t>TokenColumn</w:t>
+      </w:r>
+      <w:proofErr w:type="spellEnd"/>
+      <w:r>
+        <w:rPr>
+          <w:rFonts w:ascii="Times New Roman" w:eastAsia="Times New Roman" w:hAnsi="Times New Roman" w:cs="Times New Roman"/>
+        </w:rPr>
+        <w:t>&gt;, &lt;Token</w:t>
+      </w:r>
+      <w:r>
+        <w:t xml:space="preserve"> </w:t>
+      </w:r>
+      <w:proofErr w:type="spellStart"/>
+      <w:r>
+        <w:rPr>
+          <w:rFonts w:ascii="Times New Roman" w:eastAsia="Times New Roman" w:hAnsi="Times New Roman" w:cs="Times New Roman"/>
+        </w:rPr>
+        <w:t>Row</w:t>
+      </w:r>
+      <w:proofErr w:type="spellEnd"/>
+      <w:r>
+        <w:rPr>
+          <w:rFonts w:ascii="Times New Roman" w:eastAsia="Times New Roman" w:hAnsi="Times New Roman" w:cs="Times New Roman"/>
+        </w:rPr>
+        <w:t>&gt;)</w:t>
+      </w:r>
+    </w:p>
+    <w:p>
+      <w:pPr>
+        <w:pStyle w:val="Prrafodelista"/>
+        <w:ind w:left="0"/>
+        <w:rPr>
+          <w:rFonts w:ascii="Times New Roman" w:eastAsia="Times New Roman" w:hAnsi="Times New Roman" w:cs="Times New Roman"/>
+          <w:b/>
+          <w:bCs/>
+        </w:rPr>
+      </w:pPr>
+    </w:p>
+    <w:p>
+      <w:pPr>
+        <w:pStyle w:val="Prrafodelista"/>
+        <w:ind w:left="0"/>
+        <w:rPr>
+          <w:rFonts w:ascii="Times New Roman" w:eastAsia="Times New Roman" w:hAnsi="Times New Roman" w:cs="Times New Roman"/>
+          <w:b/>
+          <w:bCs/>
+        </w:rPr>
+      </w:pPr>
+      <w:r>
+        <w:rPr>
+          <w:rFonts w:ascii="Times New Roman" w:eastAsia="Times New Roman" w:hAnsi="Times New Roman" w:cs="Times New Roman"/>
+          <w:b/>
+          <w:bCs/>
+          <w:noProof/>
+        </w:rPr>
+        <mc:AlternateContent>
+          <mc:Choice Requires="wpg">
+            <w:drawing>
+              <wp:anchor distT="0" distB="0" distL="114300" distR="114300" simplePos="0" relativeHeight="251670528" behindDoc="0" locked="0" layoutInCell="1" allowOverlap="1" wp14:anchorId="1E3CF7FF" wp14:editId="5C1D58E9">
+                <wp:simplePos x="0" y="0"/>
+                <wp:positionH relativeFrom="margin">
+                  <wp:posOffset>-396065</wp:posOffset>
+                </wp:positionH>
+                <wp:positionV relativeFrom="paragraph">
+                  <wp:posOffset>250825</wp:posOffset>
+                </wp:positionV>
+                <wp:extent cx="6720144" cy="1143000"/>
+                <wp:effectExtent l="0" t="0" r="0" b="0"/>
+                <wp:wrapNone/>
+                <wp:docPr id="621496463" name="Grupo 6"/>
+                <wp:cNvGraphicFramePr/>
+                <a:graphic xmlns:a="http://schemas.openxmlformats.org/drawingml/2006/main">
+                  <a:graphicData uri="http://schemas.microsoft.com/office/word/2010/wordprocessingGroup">
+                    <wpg:wgp>
+                      <wpg:cNvGrpSpPr/>
+                      <wpg:grpSpPr>
+                        <a:xfrm>
+                          <a:off x="0" y="0"/>
+                          <a:ext cx="6720144" cy="1143000"/>
+                          <a:chOff x="0" y="0"/>
+                          <a:chExt cx="6720144" cy="1143000"/>
+                        </a:xfrm>
+                      </wpg:grpSpPr>
+                      <wpg:grpSp>
+                        <wpg:cNvPr id="1603899339" name="Grupo 5"/>
+                        <wpg:cNvGrpSpPr/>
+                        <wpg:grpSpPr>
+                          <a:xfrm>
+                            <a:off x="0" y="166254"/>
+                            <a:ext cx="1161535" cy="595280"/>
+                            <a:chOff x="0" y="8920"/>
+                            <a:chExt cx="1476952" cy="543665"/>
+                          </a:xfrm>
+                        </wpg:grpSpPr>
+                        <wps:wsp>
+                          <wps:cNvPr id="419741782" name="Rectángulo: esquinas redondeadas 1"/>
+                          <wps:cNvSpPr/>
+                          <wps:spPr>
+                            <a:xfrm>
+                              <a:off x="1" y="45336"/>
+                              <a:ext cx="1322569" cy="507249"/>
+                            </a:xfrm>
+                            <a:prstGeom prst="roundRect">
+                              <a:avLst/>
+                            </a:prstGeom>
+                            <a:solidFill>
+                              <a:srgbClr val="FDFDC0"/>
+                            </a:solidFill>
+                            <a:ln>
+                              <a:solidFill>
+                                <a:srgbClr val="C00000"/>
+                              </a:solidFill>
+                            </a:ln>
+                          </wps:spPr>
+                          <wps:style>
+                            <a:lnRef idx="2">
+                              <a:schemeClr val="accent1">
+                                <a:shade val="15000"/>
+                              </a:schemeClr>
+                            </a:lnRef>
+                            <a:fillRef idx="1">
+                              <a:schemeClr val="accent1"/>
+                            </a:fillRef>
+                            <a:effectRef idx="0">
+                              <a:schemeClr val="accent1"/>
+                            </a:effectRef>
+                            <a:fontRef idx="minor">
+                              <a:schemeClr val="lt1"/>
+                            </a:fontRef>
+                          </wps:style>
+                          <wps:bodyPr rot="0" spcFirstLastPara="0" vertOverflow="overflow" horzOverflow="overflow" vert="horz" wrap="square" lIns="91440" tIns="45720" rIns="91440" bIns="45720" numCol="1" spcCol="0" rtlCol="0" fromWordArt="0" anchor="ctr" anchorCtr="0" forceAA="0" compatLnSpc="1">
+                            <a:prstTxWarp prst="textNoShape">
+                              <a:avLst/>
+                            </a:prstTxWarp>
+                            <a:noAutofit/>
+                          </wps:bodyPr>
+                        </wps:wsp>
+                        <wps:wsp>
+                          <wps:cNvPr id="1732206978" name="Conector recto 2"/>
+                          <wps:cNvCnPr/>
+                          <wps:spPr>
+                            <a:xfrm>
+                              <a:off x="0" y="163817"/>
+                              <a:ext cx="1322705" cy="0"/>
+                            </a:xfrm>
+                            <a:prstGeom prst="line">
+                              <a:avLst/>
+                            </a:prstGeom>
+                            <a:ln>
+                              <a:solidFill>
+                                <a:srgbClr val="C00000"/>
+                              </a:solidFill>
+                            </a:ln>
+                          </wps:spPr>
+                          <wps:style>
+                            <a:lnRef idx="2">
+                              <a:schemeClr val="accent1"/>
+                            </a:lnRef>
+                            <a:fillRef idx="0">
+                              <a:schemeClr val="accent1"/>
+                            </a:fillRef>
+                            <a:effectRef idx="1">
+                              <a:schemeClr val="accent1"/>
+                            </a:effectRef>
+                            <a:fontRef idx="minor">
+                              <a:schemeClr val="tx1"/>
+                            </a:fontRef>
+                          </wps:style>
+                          <wps:bodyPr/>
+                        </wps:wsp>
+                        <wps:wsp>
+                          <wps:cNvPr id="1897550271" name="Cuadro de texto 3"/>
+                          <wps:cNvSpPr txBox="1"/>
+                          <wps:spPr>
+                            <a:xfrm>
+                              <a:off x="343469" y="8920"/>
+                              <a:ext cx="766865" cy="224287"/>
+                            </a:xfrm>
+                            <a:prstGeom prst="rect">
+                              <a:avLst/>
+                            </a:prstGeom>
+                            <a:noFill/>
+                            <a:ln w="6350">
+                              <a:noFill/>
+                            </a:ln>
+                          </wps:spPr>
+                          <wps:txbx>
+                            <w:txbxContent>
+                              <w:p>
+                                <w:pPr>
+                                  <w:rPr>
+                                    <w:rFonts w:ascii="Calibri" w:hAnsi="Calibri" w:cs="Calibri"/>
+                                    <w:sz w:val="2"/>
+                                    <w:szCs w:val="2"/>
+                                    <w:lang w:val="es-MX"/>
+                                  </w:rPr>
+                                </w:pPr>
+                                <w:r>
+                                  <w:rPr>
+                                    <w:rFonts w:ascii="Calibri" w:eastAsia="Times New Roman" w:hAnsi="Calibri" w:cs="Calibri"/>
+                                    <w:b/>
+                                    <w:bCs/>
+                                    <w:sz w:val="16"/>
+                                    <w:szCs w:val="16"/>
+                                    <w:lang w:val="es-MX"/>
+                                  </w:rPr>
+                                  <w:t>entrada</w:t>
+                                </w:r>
+                              </w:p>
+                            </w:txbxContent>
+                          </wps:txbx>
+                          <wps:bodyPr rot="0" spcFirstLastPara="0" vertOverflow="overflow" horzOverflow="overflow" vert="horz" wrap="square" lIns="91440" tIns="45720" rIns="91440" bIns="45720" numCol="1" spcCol="0" rtlCol="0" fromWordArt="0" anchor="t" anchorCtr="0" forceAA="0" compatLnSpc="1">
+                            <a:prstTxWarp prst="textNoShape">
+                              <a:avLst/>
+                            </a:prstTxWarp>
+                            <a:noAutofit/>
+                          </wps:bodyPr>
+                        </wps:wsp>
+                        <wps:wsp>
+                          <wps:cNvPr id="1766463698" name="Cuadro de texto 3"/>
+                          <wps:cNvSpPr txBox="1"/>
+                          <wps:spPr>
+                            <a:xfrm>
+                              <a:off x="18286" y="265455"/>
+                              <a:ext cx="1458666" cy="256939"/>
+                            </a:xfrm>
+                            <a:prstGeom prst="rect">
+                              <a:avLst/>
+                            </a:prstGeom>
+                            <a:noFill/>
+                            <a:ln w="6350">
+                              <a:noFill/>
+                            </a:ln>
+                          </wps:spPr>
+                          <wps:txbx>
+                            <w:txbxContent>
+                              <w:p>
+                                <w:pPr>
+                                  <w:rPr>
+                                    <w:rFonts w:ascii="Calibri" w:hAnsi="Calibri" w:cs="Calibri"/>
+                                    <w:sz w:val="2"/>
+                                    <w:szCs w:val="2"/>
+                                    <w:lang w:val="es-MX"/>
+                                  </w:rPr>
+                                </w:pPr>
+                                <w:r>
+                                  <w:rPr>
+                                    <w:rFonts w:ascii="Calibri" w:eastAsia="Times New Roman" w:hAnsi="Calibri" w:cs="Calibri"/>
+                                    <w:sz w:val="14"/>
+                                    <w:szCs w:val="14"/>
+                                  </w:rPr>
+                                  <w:t>"data nombre set 'Ken'"</w:t>
+                                </w:r>
+                              </w:p>
+                            </w:txbxContent>
+                          </wps:txbx>
+                          <wps:bodyPr rot="0" spcFirstLastPara="0" vertOverflow="overflow" horzOverflow="overflow" vert="horz" wrap="square" lIns="91440" tIns="45720" rIns="91440" bIns="45720" numCol="1" spcCol="0" rtlCol="0" fromWordArt="0" anchor="t" anchorCtr="0" forceAA="0" compatLnSpc="1">
+                            <a:prstTxWarp prst="textNoShape">
+                              <a:avLst/>
+                            </a:prstTxWarp>
+                            <a:noAutofit/>
+                          </wps:bodyPr>
+                        </wps:wsp>
+                      </wpg:grpSp>
+                      <wpg:grpSp>
+                        <wpg:cNvPr id="886329695" name="Grupo 5"/>
+                        <wpg:cNvGrpSpPr/>
+                        <wpg:grpSpPr>
+                          <a:xfrm>
+                            <a:off x="1235034" y="178130"/>
+                            <a:ext cx="1196340" cy="826135"/>
+                            <a:chOff x="-56843" y="0"/>
+                            <a:chExt cx="1501490" cy="896473"/>
+                          </a:xfrm>
+                        </wpg:grpSpPr>
+                        <wps:wsp>
+                          <wps:cNvPr id="782827068" name="Rectángulo: esquinas redondeadas 1"/>
+                          <wps:cNvSpPr/>
+                          <wps:spPr>
+                            <a:xfrm>
+                              <a:off x="0" y="45321"/>
+                              <a:ext cx="1313392" cy="613706"/>
+                            </a:xfrm>
+                            <a:prstGeom prst="roundRect">
+                              <a:avLst/>
+                            </a:prstGeom>
+                            <a:solidFill>
+                              <a:srgbClr val="FDFDC0"/>
+                            </a:solidFill>
+                            <a:ln>
+                              <a:solidFill>
+                                <a:srgbClr val="C00000"/>
+                              </a:solidFill>
+                            </a:ln>
+                          </wps:spPr>
+                          <wps:style>
+                            <a:lnRef idx="2">
+                              <a:schemeClr val="accent1">
+                                <a:shade val="15000"/>
+                              </a:schemeClr>
+                            </a:lnRef>
+                            <a:fillRef idx="1">
+                              <a:schemeClr val="accent1"/>
+                            </a:fillRef>
+                            <a:effectRef idx="0">
+                              <a:schemeClr val="accent1"/>
+                            </a:effectRef>
+                            <a:fontRef idx="minor">
+                              <a:schemeClr val="lt1"/>
+                            </a:fontRef>
+                          </wps:style>
+                          <wps:bodyPr rot="0" spcFirstLastPara="0" vertOverflow="overflow" horzOverflow="overflow" vert="horz" wrap="square" lIns="91440" tIns="45720" rIns="91440" bIns="45720" numCol="1" spcCol="0" rtlCol="0" fromWordArt="0" anchor="ctr" anchorCtr="0" forceAA="0" compatLnSpc="1">
+                            <a:prstTxWarp prst="textNoShape">
+                              <a:avLst/>
+                            </a:prstTxWarp>
+                            <a:noAutofit/>
+                          </wps:bodyPr>
+                        </wps:wsp>
+                        <wps:wsp>
+                          <wps:cNvPr id="1710639318" name="Conector recto 2"/>
+                          <wps:cNvCnPr/>
+                          <wps:spPr>
+                            <a:xfrm>
+                              <a:off x="2944" y="184720"/>
+                              <a:ext cx="1322705" cy="0"/>
+                            </a:xfrm>
+                            <a:prstGeom prst="line">
+                              <a:avLst/>
+                            </a:prstGeom>
+                            <a:ln>
+                              <a:solidFill>
+                                <a:srgbClr val="C00000"/>
+                              </a:solidFill>
+                            </a:ln>
+                          </wps:spPr>
+                          <wps:style>
+                            <a:lnRef idx="2">
+                              <a:schemeClr val="accent1"/>
+                            </a:lnRef>
+                            <a:fillRef idx="0">
+                              <a:schemeClr val="accent1"/>
+                            </a:fillRef>
+                            <a:effectRef idx="1">
+                              <a:schemeClr val="accent1"/>
+                            </a:effectRef>
+                            <a:fontRef idx="minor">
+                              <a:schemeClr val="tx1"/>
+                            </a:fontRef>
+                          </wps:style>
+                          <wps:bodyPr/>
+                        </wps:wsp>
+                        <wps:wsp>
+                          <wps:cNvPr id="2005523793" name="Cuadro de texto 3"/>
+                          <wps:cNvSpPr txBox="1"/>
+                          <wps:spPr>
+                            <a:xfrm>
+                              <a:off x="276669" y="0"/>
+                              <a:ext cx="970146" cy="224287"/>
+                            </a:xfrm>
+                            <a:prstGeom prst="rect">
+                              <a:avLst/>
+                            </a:prstGeom>
+                            <a:noFill/>
+                            <a:ln w="6350">
+                              <a:noFill/>
+                            </a:ln>
+                          </wps:spPr>
+                          <wps:txbx>
+                            <w:txbxContent>
+                              <w:p>
+                                <w:pPr>
+                                  <w:rPr>
+                                    <w:rFonts w:ascii="Calibri" w:eastAsia="Times New Roman" w:hAnsi="Calibri" w:cs="Calibri"/>
+                                    <w:b/>
+                                    <w:bCs/>
+                                    <w:sz w:val="16"/>
+                                    <w:szCs w:val="16"/>
+                                    <w:lang w:val="es-MX"/>
+                                  </w:rPr>
+                                </w:pPr>
+                                <w:r>
+                                  <w:rPr>
+                                    <w:rFonts w:ascii="Calibri" w:eastAsia="Times New Roman" w:hAnsi="Calibri" w:cs="Calibri"/>
+                                    <w:b/>
+                                    <w:bCs/>
+                                    <w:sz w:val="16"/>
+                                    <w:szCs w:val="16"/>
+                                    <w:lang w:val="es-MX"/>
+                                  </w:rPr>
+                                  <w:t>caracteres</w:t>
+                                </w:r>
+                              </w:p>
+                            </w:txbxContent>
+                          </wps:txbx>
+                          <wps:bodyPr rot="0" spcFirstLastPara="0" vertOverflow="overflow" horzOverflow="overflow" vert="horz" wrap="square" lIns="91440" tIns="45720" rIns="91440" bIns="45720" numCol="1" spcCol="0" rtlCol="0" fromWordArt="0" anchor="t" anchorCtr="0" forceAA="0" compatLnSpc="1">
+                            <a:prstTxWarp prst="textNoShape">
+                              <a:avLst/>
+                            </a:prstTxWarp>
+                            <a:noAutofit/>
+                          </wps:bodyPr>
+                        </wps:wsp>
+                        <wps:wsp>
+                          <wps:cNvPr id="922500483" name="Cuadro de texto 3"/>
+                          <wps:cNvSpPr txBox="1"/>
+                          <wps:spPr>
+                            <a:xfrm>
+                              <a:off x="-56843" y="172858"/>
+                              <a:ext cx="1501490" cy="723615"/>
+                            </a:xfrm>
+                            <a:prstGeom prst="rect">
+                              <a:avLst/>
+                            </a:prstGeom>
+                            <a:noFill/>
+                            <a:ln w="6350">
+                              <a:noFill/>
+                            </a:ln>
+                          </wps:spPr>
+                          <wps:txbx>
+                            <w:txbxContent>
+                              <w:p>
+                                <w:pPr>
+                                  <w:spacing w:line="240" w:lineRule="auto"/>
+                                  <w:jc w:val="both"/>
+                                  <w:rPr>
+                                    <w:rFonts w:ascii="Calibri" w:eastAsia="Times New Roman" w:hAnsi="Calibri" w:cs="Calibri"/>
+                                    <w:sz w:val="14"/>
+                                    <w:szCs w:val="14"/>
+                                  </w:rPr>
+                                </w:pPr>
+                                <w:r>
+                                  <w:rPr>
+                                    <w:rFonts w:ascii="Calibri" w:eastAsia="Times New Roman" w:hAnsi="Calibri" w:cs="Calibri"/>
+                                    <w:b/>
+                                    <w:bCs/>
+                                    <w:sz w:val="14"/>
+                                    <w:szCs w:val="14"/>
+                                  </w:rPr>
+                                  <w:t>[</w:t>
+                                </w:r>
+                                <w:r>
+                                  <w:rPr>
+                                    <w:rFonts w:ascii="Calibri" w:eastAsia="Times New Roman" w:hAnsi="Calibri" w:cs="Calibri"/>
+                                    <w:sz w:val="14"/>
+                                    <w:szCs w:val="14"/>
+                                  </w:rPr>
+                                  <w:t>'</w:t>
+                                </w:r>
+                                <w:proofErr w:type="spellStart"/>
+                                <w:r>
+                                  <w:rPr>
+                                    <w:rFonts w:ascii="Calibri" w:eastAsia="Times New Roman" w:hAnsi="Calibri" w:cs="Calibri"/>
+                                    <w:sz w:val="14"/>
+                                    <w:szCs w:val="14"/>
+                                  </w:rPr>
+                                  <w:t>d','a','t','a</w:t>
+                                </w:r>
+                                <w:proofErr w:type="spellEnd"/>
+                                <w:r>
+                                  <w:rPr>
+                                    <w:rFonts w:ascii="Calibri" w:eastAsia="Times New Roman" w:hAnsi="Calibri" w:cs="Calibri"/>
+                                    <w:sz w:val="14"/>
+                                    <w:szCs w:val="14"/>
+                                  </w:rPr>
+                                  <w:t>',' ','</w:t>
+                                </w:r>
+                                <w:proofErr w:type="spellStart"/>
+                                <w:r>
+                                  <w:rPr>
+                                    <w:rFonts w:ascii="Calibri" w:eastAsia="Times New Roman" w:hAnsi="Calibri" w:cs="Calibri"/>
+                                    <w:sz w:val="14"/>
+                                    <w:szCs w:val="14"/>
+                                  </w:rPr>
+                                  <w:t>n','o','m','b','r','e</w:t>
+                                </w:r>
+                                <w:proofErr w:type="spellEnd"/>
+                                <w:r>
+                                  <w:rPr>
+                                    <w:rFonts w:ascii="Calibri" w:eastAsia="Times New Roman" w:hAnsi="Calibri" w:cs="Calibri"/>
+                                    <w:sz w:val="14"/>
+                                    <w:szCs w:val="14"/>
+                                  </w:rPr>
+                                  <w:t>',' ','</w:t>
+                                </w:r>
+                                <w:proofErr w:type="spellStart"/>
+                                <w:r>
+                                  <w:rPr>
+                                    <w:rFonts w:ascii="Calibri" w:eastAsia="Times New Roman" w:hAnsi="Calibri" w:cs="Calibri"/>
+                                    <w:sz w:val="14"/>
+                                    <w:szCs w:val="14"/>
+                                  </w:rPr>
+                                  <w:t>s','e','t</w:t>
+                                </w:r>
+                                <w:proofErr w:type="spellEnd"/>
+                                <w:r>
+                                  <w:rPr>
+                                    <w:rFonts w:ascii="Calibri" w:eastAsia="Times New Roman" w:hAnsi="Calibri" w:cs="Calibri"/>
+                                    <w:sz w:val="14"/>
+                                    <w:szCs w:val="14"/>
+                                  </w:rPr>
+                                  <w:t>',' ','\'','</w:t>
+                                </w:r>
+                                <w:proofErr w:type="spellStart"/>
+                                <w:r>
+                                  <w:rPr>
+                                    <w:rFonts w:ascii="Calibri" w:eastAsia="Times New Roman" w:hAnsi="Calibri" w:cs="Calibri"/>
+                                    <w:sz w:val="14"/>
+                                    <w:szCs w:val="14"/>
+                                  </w:rPr>
+                                  <w:t>K</w:t>
+                                </w:r>
+                                <w:r>
+                                  <w:rPr>
+                                    <w:rFonts w:ascii="Calibri" w:eastAsia="Times New Roman" w:hAnsi="Calibri" w:cs="Calibri"/>
+                                    <w:sz w:val="14"/>
+                                    <w:szCs w:val="14"/>
+                                  </w:rPr>
+                                  <w:t>','</w:t>
+                                </w:r>
+                                <w:r>
+                                  <w:rPr>
+                                    <w:rFonts w:ascii="Calibri" w:eastAsia="Times New Roman" w:hAnsi="Calibri" w:cs="Calibri"/>
+                                    <w:sz w:val="14"/>
+                                    <w:szCs w:val="14"/>
+                                  </w:rPr>
+                                  <w:t>e</w:t>
+                                </w:r>
+                                <w:r>
+                                  <w:rPr>
+                                    <w:rFonts w:ascii="Calibri" w:eastAsia="Times New Roman" w:hAnsi="Calibri" w:cs="Calibri"/>
+                                    <w:sz w:val="14"/>
+                                    <w:szCs w:val="14"/>
+                                  </w:rPr>
+                                  <w:t>','n</w:t>
+                                </w:r>
+                                <w:proofErr w:type="spellEnd"/>
+                                <w:r>
+                                  <w:rPr>
+                                    <w:rFonts w:ascii="Calibri" w:eastAsia="Times New Roman" w:hAnsi="Calibri" w:cs="Calibri"/>
+                                    <w:sz w:val="14"/>
+                                    <w:szCs w:val="14"/>
+                                  </w:rPr>
+                                  <w:t>','\''</w:t>
+                                </w:r>
+                                <w:r>
+                                  <w:rPr>
+                                    <w:rFonts w:ascii="Calibri" w:eastAsia="Times New Roman" w:hAnsi="Calibri" w:cs="Calibri"/>
+                                    <w:b/>
+                                    <w:bCs/>
+                                    <w:sz w:val="14"/>
+                                    <w:szCs w:val="14"/>
+                                  </w:rPr>
+                                  <w:t>]</w:t>
+                                </w:r>
+                              </w:p>
+                            </w:txbxContent>
+                          </wps:txbx>
+                          <wps:bodyPr rot="0" spcFirstLastPara="0" vertOverflow="overflow" horzOverflow="overflow" vert="horz" wrap="square" lIns="91440" tIns="45720" rIns="91440" bIns="45720" numCol="1" spcCol="0" rtlCol="0" fromWordArt="0" anchor="t" anchorCtr="0" forceAA="0" compatLnSpc="1">
+                            <a:prstTxWarp prst="textNoShape">
+                              <a:avLst/>
+                            </a:prstTxWarp>
+                            <a:noAutofit/>
+                          </wps:bodyPr>
+                        </wps:wsp>
+                      </wpg:grpSp>
+                      <wpg:grpSp>
+                        <wpg:cNvPr id="2107293444" name="Grupo 5"/>
+                        <wpg:cNvGrpSpPr/>
+                        <wpg:grpSpPr>
+                          <a:xfrm>
+                            <a:off x="2529444" y="178130"/>
+                            <a:ext cx="1098806" cy="783752"/>
+                            <a:chOff x="-56876" y="-9824"/>
+                            <a:chExt cx="1379593" cy="1035794"/>
+                          </a:xfrm>
+                        </wpg:grpSpPr>
+                        <wps:wsp>
+                          <wps:cNvPr id="1951627461" name="Rectángulo: esquinas redondeadas 1"/>
+                          <wps:cNvSpPr/>
+                          <wps:spPr>
+                            <a:xfrm>
+                              <a:off x="0" y="45321"/>
+                              <a:ext cx="1322717" cy="747794"/>
+                            </a:xfrm>
+                            <a:prstGeom prst="roundRect">
+                              <a:avLst/>
+                            </a:prstGeom>
+                            <a:solidFill>
+                              <a:srgbClr val="FDFDC0"/>
+                            </a:solidFill>
+                            <a:ln>
+                              <a:solidFill>
+                                <a:srgbClr val="C00000"/>
+                              </a:solidFill>
+                            </a:ln>
+                          </wps:spPr>
+                          <wps:style>
+                            <a:lnRef idx="2">
+                              <a:schemeClr val="accent1">
+                                <a:shade val="15000"/>
+                              </a:schemeClr>
+                            </a:lnRef>
+                            <a:fillRef idx="1">
+                              <a:schemeClr val="accent1"/>
+                            </a:fillRef>
+                            <a:effectRef idx="0">
+                              <a:schemeClr val="accent1"/>
+                            </a:effectRef>
+                            <a:fontRef idx="minor">
+                              <a:schemeClr val="lt1"/>
+                            </a:fontRef>
+                          </wps:style>
+                          <wps:bodyPr rot="0" spcFirstLastPara="0" vertOverflow="overflow" horzOverflow="overflow" vert="horz" wrap="square" lIns="91440" tIns="45720" rIns="91440" bIns="45720" numCol="1" spcCol="0" rtlCol="0" fromWordArt="0" anchor="ctr" anchorCtr="0" forceAA="0" compatLnSpc="1">
+                            <a:prstTxWarp prst="textNoShape">
+                              <a:avLst/>
+                            </a:prstTxWarp>
+                            <a:noAutofit/>
+                          </wps:bodyPr>
+                        </wps:wsp>
+                        <wps:wsp>
+                          <wps:cNvPr id="2028848465" name="Conector recto 2"/>
+                          <wps:cNvCnPr/>
+                          <wps:spPr>
+                            <a:xfrm>
+                              <a:off x="0" y="211597"/>
+                              <a:ext cx="1322705" cy="0"/>
+                            </a:xfrm>
+                            <a:prstGeom prst="line">
+                              <a:avLst/>
+                            </a:prstGeom>
+                            <a:ln>
+                              <a:solidFill>
+                                <a:srgbClr val="C00000"/>
+                              </a:solidFill>
+                            </a:ln>
+                          </wps:spPr>
+                          <wps:style>
+                            <a:lnRef idx="2">
+                              <a:schemeClr val="accent1"/>
+                            </a:lnRef>
+                            <a:fillRef idx="0">
+                              <a:schemeClr val="accent1"/>
+                            </a:fillRef>
+                            <a:effectRef idx="1">
+                              <a:schemeClr val="accent1"/>
+                            </a:effectRef>
+                            <a:fontRef idx="minor">
+                              <a:schemeClr val="tx1"/>
+                            </a:fontRef>
+                          </wps:style>
+                          <wps:bodyPr/>
+                        </wps:wsp>
+                        <wps:wsp>
+                          <wps:cNvPr id="1183163508" name="Cuadro de texto 3"/>
+                          <wps:cNvSpPr txBox="1"/>
+                          <wps:spPr>
+                            <a:xfrm>
+                              <a:off x="258603" y="-9824"/>
+                              <a:ext cx="950696" cy="318759"/>
+                            </a:xfrm>
+                            <a:prstGeom prst="rect">
+                              <a:avLst/>
+                            </a:prstGeom>
+                            <a:noFill/>
+                            <a:ln w="6350">
+                              <a:noFill/>
+                            </a:ln>
+                          </wps:spPr>
+                          <wps:txbx>
+                            <w:txbxContent>
+                              <w:p>
+                                <w:pPr>
+                                  <w:rPr>
+                                    <w:rFonts w:ascii="Calibri" w:eastAsia="Times New Roman" w:hAnsi="Calibri" w:cs="Calibri"/>
+                                    <w:b/>
+                                    <w:bCs/>
+                                    <w:sz w:val="16"/>
+                                    <w:szCs w:val="16"/>
+                                    <w:lang w:val="es-MX"/>
+                                  </w:rPr>
+                                </w:pPr>
+                                <w:r>
+                                  <w:rPr>
+                                    <w:rFonts w:ascii="Calibri" w:eastAsia="Times New Roman" w:hAnsi="Calibri" w:cs="Calibri"/>
+                                    <w:b/>
+                                    <w:bCs/>
+                                    <w:sz w:val="16"/>
+                                    <w:szCs w:val="16"/>
+                                    <w:lang w:val="es-MX"/>
+                                  </w:rPr>
+                                  <w:t>agrupación</w:t>
+                                </w:r>
+                              </w:p>
+                            </w:txbxContent>
+                          </wps:txbx>
+                          <wps:bodyPr rot="0" spcFirstLastPara="0" vertOverflow="overflow" horzOverflow="overflow" vert="horz" wrap="square" lIns="91440" tIns="45720" rIns="91440" bIns="45720" numCol="1" spcCol="0" rtlCol="0" fromWordArt="0" anchor="t" anchorCtr="0" forceAA="0" compatLnSpc="1">
+                            <a:prstTxWarp prst="textNoShape">
+                              <a:avLst/>
+                            </a:prstTxWarp>
+                            <a:noAutofit/>
+                          </wps:bodyPr>
+                        </wps:wsp>
+                        <wps:wsp>
+                          <wps:cNvPr id="1322683580" name="Cuadro de texto 3"/>
+                          <wps:cNvSpPr txBox="1"/>
+                          <wps:spPr>
+                            <a:xfrm>
+                              <a:off x="-56876" y="170587"/>
+                              <a:ext cx="1350365" cy="855383"/>
+                            </a:xfrm>
+                            <a:prstGeom prst="rect">
+                              <a:avLst/>
+                            </a:prstGeom>
+                            <a:noFill/>
+                            <a:ln w="6350">
+                              <a:noFill/>
+                            </a:ln>
+                          </wps:spPr>
+                          <wps:txbx>
+                            <w:txbxContent>
+                              <w:p>
+                                <w:pPr>
+                                  <w:jc w:val="both"/>
+                                  <w:rPr>
+                                    <w:rFonts w:ascii="Calibri" w:eastAsia="Times New Roman" w:hAnsi="Calibri" w:cs="Calibri"/>
+                                    <w:sz w:val="14"/>
+                                    <w:szCs w:val="14"/>
+                                  </w:rPr>
+                                </w:pPr>
+                                <w:r>
+                                  <w:rPr>
+                                    <w:rFonts w:ascii="Calibri" w:eastAsia="Times New Roman" w:hAnsi="Calibri" w:cs="Calibri"/>
+                                    <w:b/>
+                                    <w:bCs/>
+                                    <w:sz w:val="14"/>
+                                    <w:szCs w:val="14"/>
+                                  </w:rPr>
+                                  <w:t>[</w:t>
+                                </w:r>
+                                <w:r>
+                                  <w:rPr>
+                                    <w:rFonts w:ascii="Calibri" w:eastAsia="Times New Roman" w:hAnsi="Calibri" w:cs="Calibri"/>
+                                    <w:sz w:val="14"/>
+                                    <w:szCs w:val="14"/>
+                                  </w:rPr>
+                                  <w:t>"data", " ", "nombre", " ", "set", " ", "'Juan'"</w:t>
+                                </w:r>
+                                <w:r>
+                                  <w:rPr>
+                                    <w:rFonts w:ascii="Calibri" w:eastAsia="Times New Roman" w:hAnsi="Calibri" w:cs="Calibri"/>
+                                    <w:b/>
+                                    <w:bCs/>
+                                    <w:sz w:val="14"/>
+                                    <w:szCs w:val="14"/>
+                                  </w:rPr>
+                                  <w:t>]</w:t>
+                                </w:r>
+                              </w:p>
+                              <w:p>
+                                <w:pPr>
+                                  <w:spacing w:line="240" w:lineRule="auto"/>
+                                  <w:jc w:val="both"/>
+                                  <w:rPr>
+                                    <w:rFonts w:ascii="Calibri" w:eastAsia="Times New Roman" w:hAnsi="Calibri" w:cs="Calibri"/>
+                                    <w:sz w:val="16"/>
+                                    <w:szCs w:val="16"/>
+                                  </w:rPr>
+                                </w:pPr>
+                              </w:p>
+                            </w:txbxContent>
+                          </wps:txbx>
+                          <wps:bodyPr rot="0" spcFirstLastPara="0" vertOverflow="overflow" horzOverflow="overflow" vert="horz" wrap="square" lIns="91440" tIns="45720" rIns="91440" bIns="45720" numCol="1" spcCol="0" rtlCol="0" fromWordArt="0" anchor="t" anchorCtr="0" forceAA="0" compatLnSpc="1">
+                            <a:prstTxWarp prst="textNoShape">
+                              <a:avLst/>
+                            </a:prstTxWarp>
+                            <a:noAutofit/>
+                          </wps:bodyPr>
+                        </wps:wsp>
+                      </wpg:grpSp>
+                      <wpg:grpSp>
+                        <wpg:cNvPr id="100739262" name="Grupo 5"/>
+                        <wpg:cNvGrpSpPr/>
+                        <wpg:grpSpPr>
+                          <a:xfrm>
+                            <a:off x="3811979" y="190005"/>
+                            <a:ext cx="1108865" cy="729047"/>
+                            <a:chOff x="-21474" y="-3827"/>
+                            <a:chExt cx="1395739" cy="951909"/>
+                          </a:xfrm>
+                        </wpg:grpSpPr>
+                        <wps:wsp>
+                          <wps:cNvPr id="1619017437" name="Rectángulo: esquinas redondeadas 1"/>
+                          <wps:cNvSpPr/>
+                          <wps:spPr>
+                            <a:xfrm>
+                              <a:off x="0" y="45321"/>
+                              <a:ext cx="1322717" cy="747794"/>
+                            </a:xfrm>
+                            <a:prstGeom prst="roundRect">
+                              <a:avLst/>
+                            </a:prstGeom>
+                            <a:solidFill>
+                              <a:srgbClr val="FDFDC0"/>
+                            </a:solidFill>
+                            <a:ln>
+                              <a:solidFill>
+                                <a:srgbClr val="C00000"/>
+                              </a:solidFill>
+                            </a:ln>
+                          </wps:spPr>
+                          <wps:style>
+                            <a:lnRef idx="2">
+                              <a:schemeClr val="accent1">
+                                <a:shade val="15000"/>
+                              </a:schemeClr>
+                            </a:lnRef>
+                            <a:fillRef idx="1">
+                              <a:schemeClr val="accent1"/>
+                            </a:fillRef>
+                            <a:effectRef idx="0">
+                              <a:schemeClr val="accent1"/>
+                            </a:effectRef>
+                            <a:fontRef idx="minor">
+                              <a:schemeClr val="lt1"/>
+                            </a:fontRef>
+                          </wps:style>
+                          <wps:bodyPr rot="0" spcFirstLastPara="0" vertOverflow="overflow" horzOverflow="overflow" vert="horz" wrap="square" lIns="91440" tIns="45720" rIns="91440" bIns="45720" numCol="1" spcCol="0" rtlCol="0" fromWordArt="0" anchor="ctr" anchorCtr="0" forceAA="0" compatLnSpc="1">
+                            <a:prstTxWarp prst="textNoShape">
+                              <a:avLst/>
+                            </a:prstTxWarp>
+                            <a:noAutofit/>
+                          </wps:bodyPr>
+                        </wps:wsp>
+                        <wps:wsp>
+                          <wps:cNvPr id="558292196" name="Conector recto 2"/>
+                          <wps:cNvCnPr/>
+                          <wps:spPr>
+                            <a:xfrm>
+                              <a:off x="0" y="211597"/>
+                              <a:ext cx="1322705" cy="0"/>
+                            </a:xfrm>
+                            <a:prstGeom prst="line">
+                              <a:avLst/>
+                            </a:prstGeom>
+                            <a:ln>
+                              <a:solidFill>
+                                <a:srgbClr val="C00000"/>
+                              </a:solidFill>
+                            </a:ln>
+                          </wps:spPr>
+                          <wps:style>
+                            <a:lnRef idx="2">
+                              <a:schemeClr val="accent1"/>
+                            </a:lnRef>
+                            <a:fillRef idx="0">
+                              <a:schemeClr val="accent1"/>
+                            </a:fillRef>
+                            <a:effectRef idx="1">
+                              <a:schemeClr val="accent1"/>
+                            </a:effectRef>
+                            <a:fontRef idx="minor">
+                              <a:schemeClr val="tx1"/>
+                            </a:fontRef>
+                          </wps:style>
+                          <wps:bodyPr/>
+                        </wps:wsp>
+                        <wps:wsp>
+                          <wps:cNvPr id="802275383" name="Cuadro de texto 3"/>
+                          <wps:cNvSpPr txBox="1"/>
+                          <wps:spPr>
+                            <a:xfrm>
+                              <a:off x="262359" y="-3827"/>
+                              <a:ext cx="954702" cy="257887"/>
+                            </a:xfrm>
+                            <a:prstGeom prst="rect">
+                              <a:avLst/>
+                            </a:prstGeom>
+                            <a:noFill/>
+                            <a:ln w="6350">
+                              <a:noFill/>
+                            </a:ln>
+                          </wps:spPr>
+                          <wps:txbx>
+                            <w:txbxContent>
+                              <w:p>
+                                <w:pPr>
+                                  <w:rPr>
+                                    <w:rFonts w:ascii="Calibri" w:eastAsia="Times New Roman" w:hAnsi="Calibri" w:cs="Calibri"/>
+                                    <w:b/>
+                                    <w:bCs/>
+                                    <w:sz w:val="18"/>
+                                    <w:szCs w:val="18"/>
+                                    <w:lang w:val="es-MX"/>
+                                  </w:rPr>
+                                </w:pPr>
+                                <w:r>
+                                  <w:rPr>
+                                    <w:rFonts w:ascii="Calibri" w:eastAsia="Times New Roman" w:hAnsi="Calibri" w:cs="Calibri"/>
+                                    <w:b/>
+                                    <w:bCs/>
+                                    <w:sz w:val="16"/>
+                                    <w:szCs w:val="16"/>
+                                    <w:lang w:val="es-MX"/>
+                                  </w:rPr>
+                                  <w:t>clasificación</w:t>
+                                </w:r>
+                                <w:r>
+                                  <w:rPr>
+                                    <w:rFonts w:ascii="Calibri" w:eastAsia="Times New Roman" w:hAnsi="Calibri" w:cs="Calibri"/>
+                                    <w:b/>
+                                    <w:bCs/>
+                                    <w:sz w:val="18"/>
+                                    <w:szCs w:val="18"/>
+                                    <w:lang w:val="es-MX"/>
+                                  </w:rPr>
+                                  <w:t xml:space="preserve"> </w:t>
+                                </w:r>
+                              </w:p>
+                            </w:txbxContent>
+                          </wps:txbx>
+                          <wps:bodyPr rot="0" spcFirstLastPara="0" vertOverflow="overflow" horzOverflow="overflow" vert="horz" wrap="square" lIns="91440" tIns="45720" rIns="91440" bIns="45720" numCol="1" spcCol="0" rtlCol="0" fromWordArt="0" anchor="t" anchorCtr="0" forceAA="0" compatLnSpc="1">
+                            <a:prstTxWarp prst="textNoShape">
+                              <a:avLst/>
+                            </a:prstTxWarp>
+                            <a:noAutofit/>
+                          </wps:bodyPr>
+                        </wps:wsp>
+                        <wps:wsp>
+                          <wps:cNvPr id="1834451234" name="Cuadro de texto 3"/>
+                          <wps:cNvSpPr txBox="1"/>
+                          <wps:spPr>
+                            <a:xfrm>
+                              <a:off x="-21474" y="199542"/>
+                              <a:ext cx="1395739" cy="748540"/>
+                            </a:xfrm>
+                            <a:prstGeom prst="rect">
+                              <a:avLst/>
+                            </a:prstGeom>
+                            <a:noFill/>
+                            <a:ln w="6350">
+                              <a:noFill/>
+                            </a:ln>
+                          </wps:spPr>
+                          <wps:txbx>
+                            <w:txbxContent>
+                              <w:p>
+                                <w:pPr>
+                                  <w:spacing w:line="240" w:lineRule="auto"/>
+                                  <w:rPr>
+                                    <w:rFonts w:ascii="Calibri" w:eastAsia="Times New Roman" w:hAnsi="Calibri" w:cs="Calibri"/>
+                                    <w:sz w:val="12"/>
+                                    <w:szCs w:val="12"/>
+                                    <w:lang w:val="en-US"/>
+                                  </w:rPr>
+                                </w:pPr>
+                                <w:r>
+                                  <w:rPr>
+                                    <w:rFonts w:ascii="Calibri" w:eastAsia="Times New Roman" w:hAnsi="Calibri" w:cs="Calibri"/>
+                                    <w:b/>
+                                    <w:bCs/>
+                                    <w:sz w:val="12"/>
+                                    <w:szCs w:val="12"/>
+                                    <w:lang w:val="en-US"/>
+                                  </w:rPr>
+                                  <w:t>[</w:t>
+                                </w:r>
+                                <w:r>
+                                  <w:rPr>
+                                    <w:rFonts w:ascii="Calibri" w:eastAsia="Times New Roman" w:hAnsi="Calibri" w:cs="Calibri"/>
+                                    <w:sz w:val="12"/>
+                                    <w:szCs w:val="12"/>
+                                    <w:lang w:val="en-US"/>
+                                  </w:rPr>
+                                  <w:t>KEYWORD,</w:t>
+                                </w:r>
+                                <w:r>
+                                  <w:rPr>
+                                    <w:rFonts w:ascii="Calibri" w:eastAsia="Times New Roman" w:hAnsi="Calibri" w:cs="Calibri"/>
+                                    <w:sz w:val="12"/>
+                                    <w:szCs w:val="12"/>
+                                    <w:lang w:val="en-US"/>
+                                  </w:rPr>
+                                  <w:t xml:space="preserve"> </w:t>
+                                </w:r>
+                                <w:r>
+                                  <w:rPr>
+                                    <w:rFonts w:ascii="Calibri" w:eastAsia="Times New Roman" w:hAnsi="Calibri" w:cs="Calibri"/>
+                                    <w:sz w:val="12"/>
+                                    <w:szCs w:val="12"/>
+                                    <w:lang w:val="en-US"/>
+                                  </w:rPr>
+                                  <w:t>WHITESPACE, IDENTIFIER, WHITESPACE, OPERATOR, WHITESPACE, STRING</w:t>
+                                </w:r>
+                                <w:r>
+                                  <w:rPr>
+                                    <w:rFonts w:ascii="Calibri" w:eastAsia="Times New Roman" w:hAnsi="Calibri" w:cs="Calibri"/>
+                                    <w:b/>
+                                    <w:bCs/>
+                                    <w:sz w:val="12"/>
+                                    <w:szCs w:val="12"/>
+                                    <w:lang w:val="en-US"/>
+                                  </w:rPr>
+                                  <w:t>]</w:t>
+                                </w:r>
+                              </w:p>
+                            </w:txbxContent>
+                          </wps:txbx>
+                          <wps:bodyPr rot="0" spcFirstLastPara="0" vertOverflow="overflow" horzOverflow="overflow" vert="horz" wrap="square" lIns="91440" tIns="45720" rIns="91440" bIns="45720" numCol="1" spcCol="0" rtlCol="0" fromWordArt="0" anchor="t" anchorCtr="0" forceAA="0" compatLnSpc="1">
+                            <a:prstTxWarp prst="textNoShape">
+                              <a:avLst/>
+                            </a:prstTxWarp>
+                            <a:noAutofit/>
+                          </wps:bodyPr>
+                        </wps:wsp>
+                      </wpg:grpSp>
+                      <wpg:grpSp>
+                        <wpg:cNvPr id="1480687868" name="Grupo 5"/>
+                        <wpg:cNvGrpSpPr/>
+                        <wpg:grpSpPr>
+                          <a:xfrm>
+                            <a:off x="5130140" y="0"/>
+                            <a:ext cx="1590004" cy="1143000"/>
+                            <a:chOff x="0" y="8245"/>
+                            <a:chExt cx="1590807" cy="1070874"/>
+                          </a:xfrm>
+                        </wpg:grpSpPr>
+                        <wps:wsp>
+                          <wps:cNvPr id="2123541754" name="Rectángulo: esquinas redondeadas 1"/>
+                          <wps:cNvSpPr/>
+                          <wps:spPr>
+                            <a:xfrm>
+                              <a:off x="0" y="45321"/>
+                              <a:ext cx="1322717" cy="936339"/>
+                            </a:xfrm>
+                            <a:prstGeom prst="roundRect">
+                              <a:avLst/>
+                            </a:prstGeom>
+                            <a:solidFill>
+                              <a:srgbClr val="FDFDC0"/>
+                            </a:solidFill>
+                            <a:ln>
+                              <a:solidFill>
+                                <a:srgbClr val="C00000"/>
+                              </a:solidFill>
+                            </a:ln>
+                          </wps:spPr>
+                          <wps:style>
+                            <a:lnRef idx="2">
+                              <a:schemeClr val="accent1">
+                                <a:shade val="15000"/>
+                              </a:schemeClr>
+                            </a:lnRef>
+                            <a:fillRef idx="1">
+                              <a:schemeClr val="accent1"/>
+                            </a:fillRef>
+                            <a:effectRef idx="0">
+                              <a:schemeClr val="accent1"/>
+                            </a:effectRef>
+                            <a:fontRef idx="minor">
+                              <a:schemeClr val="lt1"/>
+                            </a:fontRef>
+                          </wps:style>
+                          <wps:bodyPr rot="0" spcFirstLastPara="0" vertOverflow="overflow" horzOverflow="overflow" vert="horz" wrap="square" lIns="91440" tIns="45720" rIns="91440" bIns="45720" numCol="1" spcCol="0" rtlCol="0" fromWordArt="0" anchor="ctr" anchorCtr="0" forceAA="0" compatLnSpc="1">
+                            <a:prstTxWarp prst="textNoShape">
+                              <a:avLst/>
+                            </a:prstTxWarp>
+                            <a:noAutofit/>
+                          </wps:bodyPr>
+                        </wps:wsp>
+                        <wps:wsp>
+                          <wps:cNvPr id="2101641689" name="Conector recto 2"/>
+                          <wps:cNvCnPr/>
+                          <wps:spPr>
+                            <a:xfrm>
+                              <a:off x="0" y="211597"/>
+                              <a:ext cx="1322705" cy="0"/>
+                            </a:xfrm>
+                            <a:prstGeom prst="line">
+                              <a:avLst/>
+                            </a:prstGeom>
+                            <a:ln>
+                              <a:solidFill>
+                                <a:srgbClr val="C00000"/>
+                              </a:solidFill>
+                            </a:ln>
+                          </wps:spPr>
+                          <wps:style>
+                            <a:lnRef idx="2">
+                              <a:schemeClr val="accent1"/>
+                            </a:lnRef>
+                            <a:fillRef idx="0">
+                              <a:schemeClr val="accent1"/>
+                            </a:fillRef>
+                            <a:effectRef idx="1">
+                              <a:schemeClr val="accent1"/>
+                            </a:effectRef>
+                            <a:fontRef idx="minor">
+                              <a:schemeClr val="tx1"/>
+                            </a:fontRef>
+                          </wps:style>
+                          <wps:bodyPr/>
+                        </wps:wsp>
+                        <wps:wsp>
+                          <wps:cNvPr id="1845964601" name="Cuadro de texto 3"/>
+                          <wps:cNvSpPr txBox="1"/>
+                          <wps:spPr>
+                            <a:xfrm>
+                              <a:off x="411175" y="8245"/>
+                              <a:ext cx="622410" cy="257887"/>
+                            </a:xfrm>
+                            <a:prstGeom prst="rect">
+                              <a:avLst/>
+                            </a:prstGeom>
+                            <a:noFill/>
+                            <a:ln w="6350">
+                              <a:noFill/>
+                            </a:ln>
+                          </wps:spPr>
+                          <wps:txbx>
+                            <w:txbxContent>
+                              <w:p>
+                                <w:pPr>
+                                  <w:rPr>
+                                    <w:rFonts w:ascii="Calibri" w:eastAsia="Times New Roman" w:hAnsi="Calibri" w:cs="Calibri"/>
+                                    <w:b/>
+                                    <w:bCs/>
+                                    <w:sz w:val="16"/>
+                                    <w:szCs w:val="16"/>
+                                    <w:lang w:val="es-MX"/>
+                                  </w:rPr>
+                                </w:pPr>
+                                <w:r>
+                                  <w:rPr>
+                                    <w:rFonts w:ascii="Calibri" w:eastAsia="Times New Roman" w:hAnsi="Calibri" w:cs="Calibri"/>
+                                    <w:b/>
+                                    <w:bCs/>
+                                    <w:sz w:val="16"/>
+                                    <w:szCs w:val="16"/>
+                                    <w:lang w:val="es-MX"/>
+                                  </w:rPr>
+                                  <w:t>tokens</w:t>
+                                </w:r>
+                                <w:r>
+                                  <w:rPr>
+                                    <w:rFonts w:ascii="Calibri" w:eastAsia="Times New Roman" w:hAnsi="Calibri" w:cs="Calibri"/>
+                                    <w:b/>
+                                    <w:bCs/>
+                                    <w:sz w:val="16"/>
+                                    <w:szCs w:val="16"/>
+                                    <w:lang w:val="es-MX"/>
+                                  </w:rPr>
+                                  <w:t xml:space="preserve"> </w:t>
+                                </w:r>
+                              </w:p>
+                            </w:txbxContent>
+                          </wps:txbx>
+                          <wps:bodyPr rot="0" spcFirstLastPara="0" vertOverflow="overflow" horzOverflow="overflow" vert="horz" wrap="square" lIns="91440" tIns="45720" rIns="91440" bIns="45720" numCol="1" spcCol="0" rtlCol="0" fromWordArt="0" anchor="t" anchorCtr="0" forceAA="0" compatLnSpc="1">
+                            <a:prstTxWarp prst="textNoShape">
+                              <a:avLst/>
+                            </a:prstTxWarp>
+                            <a:noAutofit/>
+                          </wps:bodyPr>
+                        </wps:wsp>
+                        <wps:wsp>
+                          <wps:cNvPr id="1723286874" name="Cuadro de texto 3"/>
+                          <wps:cNvSpPr txBox="1"/>
+                          <wps:spPr>
+                            <a:xfrm>
+                              <a:off x="41886" y="225656"/>
+                              <a:ext cx="1548921" cy="853463"/>
+                            </a:xfrm>
+                            <a:prstGeom prst="rect">
+                              <a:avLst/>
+                            </a:prstGeom>
+                            <a:noFill/>
+                            <a:ln w="6350">
+                              <a:noFill/>
+                            </a:ln>
+                          </wps:spPr>
+                          <wps:txbx>
+                            <w:txbxContent>
+                              <w:p>
+                                <w:pPr>
+                                  <w:spacing w:line="240" w:lineRule="auto"/>
+                                  <w:jc w:val="both"/>
+                                  <w:rPr>
+                                    <w:rFonts w:ascii="Calibri" w:eastAsia="Times New Roman" w:hAnsi="Calibri" w:cs="Calibri"/>
+                                    <w:sz w:val="12"/>
+                                    <w:szCs w:val="12"/>
+                                    <w:lang w:val="en-US"/>
+                                  </w:rPr>
+                                </w:pPr>
+                                <w:r>
+                                  <w:rPr>
+                                    <w:rFonts w:ascii="Calibri" w:eastAsia="Times New Roman" w:hAnsi="Calibri" w:cs="Calibri"/>
+                                    <w:sz w:val="12"/>
+                                    <w:szCs w:val="12"/>
+                                    <w:lang w:val="en-US"/>
+                                  </w:rPr>
+                                  <w:t>[</w:t>
+                                </w:r>
+                                <w:r>
+                                  <w:rPr>
+                                    <w:rFonts w:ascii="Calibri" w:eastAsia="Times New Roman" w:hAnsi="Calibri" w:cs="Calibri"/>
+                                    <w:sz w:val="12"/>
+                                    <w:szCs w:val="12"/>
+                                    <w:lang w:val="en-US"/>
+                                  </w:rPr>
+                                  <w:t xml:space="preserve"> </w:t>
+                                </w:r>
+                                <w:r>
+                                  <w:rPr>
+                                    <w:rFonts w:ascii="Calibri" w:eastAsia="Times New Roman" w:hAnsi="Calibri" w:cs="Calibri"/>
+                                    <w:b/>
+                                    <w:bCs/>
+                                    <w:sz w:val="12"/>
+                                    <w:szCs w:val="12"/>
+                                    <w:lang w:val="en-US"/>
+                                  </w:rPr>
+                                  <w:t>Token</w:t>
+                                </w:r>
+                                <w:r>
+                                  <w:rPr>
+                                    <w:rFonts w:ascii="Calibri" w:eastAsia="Times New Roman" w:hAnsi="Calibri" w:cs="Calibri"/>
+                                    <w:sz w:val="12"/>
+                                    <w:szCs w:val="12"/>
+                                    <w:lang w:val="en-US"/>
+                                  </w:rPr>
+                                  <w:t xml:space="preserve"> (</w:t>
+                                </w:r>
+                                <w:r>
+                                  <w:rPr>
+                                    <w:rFonts w:ascii="Calibri" w:eastAsia="Times New Roman" w:hAnsi="Calibri" w:cs="Calibri"/>
+                                    <w:sz w:val="12"/>
+                                    <w:szCs w:val="12"/>
+                                    <w:lang w:val="en-US"/>
+                                  </w:rPr>
+                                  <w:t>KEYWORD, "data", 1, 1),</w:t>
+                                </w:r>
+                              </w:p>
+                              <w:p>
+                                <w:pPr>
+                                  <w:spacing w:line="240" w:lineRule="auto"/>
+                                  <w:jc w:val="both"/>
+                                  <w:rPr>
+                                    <w:rFonts w:ascii="Calibri" w:eastAsia="Times New Roman" w:hAnsi="Calibri" w:cs="Calibri"/>
+                                    <w:sz w:val="12"/>
+                                    <w:szCs w:val="12"/>
+                                    <w:lang w:val="en-US"/>
+                                  </w:rPr>
+                                </w:pPr>
+                                <w:r>
+                                  <w:rPr>
+                                    <w:rFonts w:ascii="Calibri" w:eastAsia="Times New Roman" w:hAnsi="Calibri" w:cs="Calibri"/>
+                                    <w:b/>
+                                    <w:bCs/>
+                                    <w:sz w:val="12"/>
+                                    <w:szCs w:val="12"/>
+                                    <w:lang w:val="en-US"/>
+                                  </w:rPr>
+                                  <w:t>Token</w:t>
+                                </w:r>
+                                <w:r>
+                                  <w:rPr>
+                                    <w:rFonts w:ascii="Calibri" w:eastAsia="Times New Roman" w:hAnsi="Calibri" w:cs="Calibri"/>
+                                    <w:sz w:val="12"/>
+                                    <w:szCs w:val="12"/>
+                                    <w:lang w:val="en-US"/>
+                                  </w:rPr>
+                                  <w:t xml:space="preserve"> (</w:t>
+                                </w:r>
+                                <w:r>
+                                  <w:rPr>
+                                    <w:rFonts w:ascii="Calibri" w:eastAsia="Times New Roman" w:hAnsi="Calibri" w:cs="Calibri"/>
+                                    <w:sz w:val="12"/>
+                                    <w:szCs w:val="12"/>
+                                    <w:lang w:val="en-US"/>
+                                  </w:rPr>
+                                  <w:t>IDENTIFIER, "</w:t>
+                                </w:r>
+                                <w:proofErr w:type="spellStart"/>
+                                <w:r>
+                                  <w:rPr>
+                                    <w:rFonts w:ascii="Calibri" w:eastAsia="Times New Roman" w:hAnsi="Calibri" w:cs="Calibri"/>
+                                    <w:sz w:val="12"/>
+                                    <w:szCs w:val="12"/>
+                                    <w:lang w:val="en-US"/>
+                                  </w:rPr>
+                                  <w:t>nombre</w:t>
+                                </w:r>
+                                <w:proofErr w:type="spellEnd"/>
+                                <w:r>
+                                  <w:rPr>
+                                    <w:rFonts w:ascii="Calibri" w:eastAsia="Times New Roman" w:hAnsi="Calibri" w:cs="Calibri"/>
+                                    <w:sz w:val="12"/>
+                                    <w:szCs w:val="12"/>
+                                    <w:lang w:val="en-US"/>
+                                  </w:rPr>
+                                  <w:t xml:space="preserve">", 1, 6), </w:t>
+                                </w:r>
+                              </w:p>
+                              <w:p>
+                                <w:pPr>
+                                  <w:spacing w:line="240" w:lineRule="auto"/>
+                                  <w:jc w:val="both"/>
+                                  <w:rPr>
+                                    <w:rFonts w:ascii="Calibri" w:eastAsia="Times New Roman" w:hAnsi="Calibri" w:cs="Calibri"/>
+                                    <w:sz w:val="12"/>
+                                    <w:szCs w:val="12"/>
+                                    <w:lang w:val="en-US"/>
+                                  </w:rPr>
+                                </w:pPr>
+                                <w:r>
+                                  <w:rPr>
+                                    <w:rFonts w:ascii="Calibri" w:eastAsia="Times New Roman" w:hAnsi="Calibri" w:cs="Calibri"/>
+                                    <w:b/>
+                                    <w:bCs/>
+                                    <w:sz w:val="12"/>
+                                    <w:szCs w:val="12"/>
+                                    <w:lang w:val="en-US"/>
+                                  </w:rPr>
+                                  <w:t>Token</w:t>
+                                </w:r>
+                                <w:r>
+                                  <w:rPr>
+                                    <w:rFonts w:ascii="Calibri" w:eastAsia="Times New Roman" w:hAnsi="Calibri" w:cs="Calibri"/>
+                                    <w:sz w:val="12"/>
+                                    <w:szCs w:val="12"/>
+                                    <w:lang w:val="en-US"/>
+                                  </w:rPr>
+                                  <w:t xml:space="preserve"> (</w:t>
+                                </w:r>
+                                <w:r>
+                                  <w:rPr>
+                                    <w:rFonts w:ascii="Calibri" w:eastAsia="Times New Roman" w:hAnsi="Calibri" w:cs="Calibri"/>
+                                    <w:sz w:val="12"/>
+                                    <w:szCs w:val="12"/>
+                                    <w:lang w:val="en-US"/>
+                                  </w:rPr>
+                                  <w:t>OPERATOR, "set", 1, 12),</w:t>
+                                </w:r>
+                              </w:p>
+                              <w:p>
+                                <w:pPr>
+                                  <w:spacing w:line="240" w:lineRule="auto"/>
+                                  <w:jc w:val="both"/>
+                                  <w:rPr>
+                                    <w:rFonts w:ascii="Calibri" w:eastAsia="Times New Roman" w:hAnsi="Calibri" w:cs="Calibri"/>
+                                    <w:sz w:val="12"/>
+                                    <w:szCs w:val="12"/>
+                                    <w:lang w:val="en-US"/>
+                                  </w:rPr>
+                                </w:pPr>
+                                <w:r>
+                                  <w:rPr>
+                                    <w:rFonts w:ascii="Calibri" w:eastAsia="Times New Roman" w:hAnsi="Calibri" w:cs="Calibri"/>
+                                    <w:b/>
+                                    <w:bCs/>
+                                    <w:sz w:val="12"/>
+                                    <w:szCs w:val="12"/>
+                                    <w:lang w:val="en-US"/>
+                                  </w:rPr>
+                                  <w:t>Token</w:t>
+                                </w:r>
+                                <w:r>
+                                  <w:rPr>
+                                    <w:rFonts w:ascii="Calibri" w:eastAsia="Times New Roman" w:hAnsi="Calibri" w:cs="Calibri"/>
+                                    <w:sz w:val="12"/>
+                                    <w:szCs w:val="12"/>
+                                    <w:lang w:val="en-US"/>
+                                  </w:rPr>
+                                  <w:t xml:space="preserve"> (</w:t>
+                                </w:r>
+                                <w:r>
+                                  <w:rPr>
+                                    <w:rFonts w:ascii="Calibri" w:eastAsia="Times New Roman" w:hAnsi="Calibri" w:cs="Calibri"/>
+                                    <w:sz w:val="12"/>
+                                    <w:szCs w:val="12"/>
+                                    <w:lang w:val="en-US"/>
+                                  </w:rPr>
+                                  <w:t>STRING, "Juan", 1, 16</w:t>
+                                </w:r>
+                                <w:r>
+                                  <w:rPr>
+                                    <w:rFonts w:ascii="Calibri" w:eastAsia="Times New Roman" w:hAnsi="Calibri" w:cs="Calibri"/>
+                                    <w:sz w:val="12"/>
+                                    <w:szCs w:val="12"/>
+                                    <w:lang w:val="en-US"/>
+                                  </w:rPr>
+                                  <w:t>)</w:t>
+                                </w:r>
+                                <w:r>
+                                  <w:rPr>
+                                    <w:rFonts w:ascii="Calibri" w:eastAsia="Times New Roman" w:hAnsi="Calibri" w:cs="Calibri"/>
+                                    <w:sz w:val="12"/>
+                                    <w:szCs w:val="12"/>
+                                    <w:lang w:val="en-US"/>
+                                  </w:rPr>
+                                  <w:t>]</w:t>
+                                </w:r>
+                              </w:p>
+                              <w:p>
+                                <w:pPr>
+                                  <w:spacing w:line="240" w:lineRule="auto"/>
+                                  <w:jc w:val="both"/>
+                                  <w:rPr>
+                                    <w:rFonts w:ascii="Calibri" w:eastAsia="Times New Roman" w:hAnsi="Calibri" w:cs="Calibri"/>
+                                    <w:sz w:val="16"/>
+                                    <w:szCs w:val="16"/>
+                                    <w:lang w:val="en-US"/>
+                                  </w:rPr>
+                                </w:pPr>
+                              </w:p>
+                            </w:txbxContent>
+                          </wps:txbx>
+                          <wps:bodyPr rot="0" spcFirstLastPara="0" vertOverflow="overflow" horzOverflow="overflow" vert="horz" wrap="square" lIns="91440" tIns="45720" rIns="91440" bIns="45720" numCol="1" spcCol="0" rtlCol="0" fromWordArt="0" anchor="t" anchorCtr="0" forceAA="0" compatLnSpc="1">
+                            <a:prstTxWarp prst="textNoShape">
+                              <a:avLst/>
+                            </a:prstTxWarp>
+                            <a:noAutofit/>
+                          </wps:bodyPr>
+                        </wps:wsp>
+                      </wpg:grpSp>
+                    </wpg:wgp>
+                  </a:graphicData>
+                </a:graphic>
+              </wp:anchor>
+            </w:drawing>
+          </mc:Choice>
+          <mc:Fallback>
+            <w:pict>
+              <v:group w14:anchorId="1E3CF7FF" id="Grupo 6" o:spid="_x0000_s1026" style="position:absolute;margin-left:-31.2pt;margin-top:19.75pt;width:529.15pt;height:90pt;z-index:251670528;mso-position-horizontal-relative:margin" coordsize="67201,11430" o:gfxdata="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">
+                <v:group id="Grupo 5" o:spid="_x0000_s1027" style="position:absolute;top:1662;width:11615;height:5953" coordorigin=",89" coordsize="14769,5436" o:gfxdata="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">
+                  <v:roundrect id="Rectángulo: esquinas redondeadas 1" o:spid="_x0000_s1028" style="position:absolute;top:453;width:13225;height:5072;visibility:visible;mso-wrap-style:square;v-text-anchor:middle" arcsize="10923f" o:gfxdata="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" fillcolor="#fdfdc0" strokecolor="#c00000" strokeweight="1.5pt">
+                    <v:stroke joinstyle="miter"/>
+                  </v:roundrect>
+                  <v:line id="Conector recto 2" o:spid="_x0000_s1029" style="position:absolute;visibility:visible;mso-wrap-style:square" from="0,1638" to="13227,1638" o:connectortype="straight" o:gfxdata="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" strokecolor="#c00000" strokeweight="1.5pt">
+                    <v:stroke joinstyle="miter"/>
+                  </v:line>
+                  <v:shapetype id="_x0000_t202" coordsize="21600,21600" o:spt="202" path="m,l,21600r21600,l21600,xe">
+                    <v:stroke joinstyle="miter"/>
+                    <v:path gradientshapeok="t" o:connecttype="rect"/>
+                  </v:shapetype>
+                  <v:shape id="Cuadro de texto 3" o:spid="_x0000_s1030" type="#_x0000_t202" style="position:absolute;left:3434;top:89;width:7669;height:2243;visibility:visible;mso-wrap-style:square;v-text-anchor:top" o:gfxdata="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" filled="f" stroked="f" strokeweight=".5pt">
+                    <v:textbox>
+                      <w:txbxContent>
+                        <w:p>
+                          <w:pPr>
+                            <w:rPr>
+                              <w:rFonts w:ascii="Calibri" w:hAnsi="Calibri" w:cs="Calibri"/>
+                              <w:sz w:val="2"/>
+                              <w:szCs w:val="2"/>
+                              <w:lang w:val="es-MX"/>
+                            </w:rPr>
+                          </w:pPr>
+                          <w:r>
+                            <w:rPr>
+                              <w:rFonts w:ascii="Calibri" w:eastAsia="Times New Roman" w:hAnsi="Calibri" w:cs="Calibri"/>
+                              <w:b/>
+                              <w:bCs/>
+                              <w:sz w:val="16"/>
+                              <w:szCs w:val="16"/>
+                              <w:lang w:val="es-MX"/>
+                            </w:rPr>
+                            <w:t>entrada</w:t>
+                          </w:r>
+                        </w:p>
+                      </w:txbxContent>
+                    </v:textbox>
+                  </v:shape>
+                  <v:shape id="Cuadro de texto 3" o:spid="_x0000_s1031" type="#_x0000_t202" style="position:absolute;left:182;top:2654;width:14587;height:2569;visibility:visible;mso-wrap-style:square;v-text-anchor:top" o:gfxdata="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" filled="f" stroked="f" strokeweight=".5pt">
+                    <v:textbox>
+                      <w:txbxContent>
+                        <w:p>
+                          <w:pPr>
+                            <w:rPr>
+                              <w:rFonts w:ascii="Calibri" w:hAnsi="Calibri" w:cs="Calibri"/>
+                              <w:sz w:val="2"/>
+                              <w:szCs w:val="2"/>
+                              <w:lang w:val="es-MX"/>
+                            </w:rPr>
+                          </w:pPr>
+                          <w:r>
+                            <w:rPr>
+                              <w:rFonts w:ascii="Calibri" w:eastAsia="Times New Roman" w:hAnsi="Calibri" w:cs="Calibri"/>
+                              <w:sz w:val="14"/>
+                              <w:szCs w:val="14"/>
+                            </w:rPr>
+                            <w:t>"data nombre set 'Ken'"</w:t>
+                          </w:r>
+                        </w:p>
+                      </w:txbxContent>
+                    </v:textbox>
+                  </v:shape>
+                </v:group>
+                <v:group id="Grupo 5" o:spid="_x0000_s1032" style="position:absolute;left:12350;top:1781;width:11963;height:8261" coordorigin="-568" coordsize="15014,8964" o:gfxdata="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">
+                  <v:roundrect id="Rectángulo: esquinas redondeadas 1" o:spid="_x0000_s1033" style="position:absolute;top:453;width:13133;height:6137;visibility:visible;mso-wrap-style:square;v-text-anchor:middle" arcsize="10923f" o:gfxdata="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" fillcolor="#fdfdc0" strokecolor="#c00000" strokeweight="1.5pt">
+                    <v:stroke joinstyle="miter"/>
+                  </v:roundrect>
+                  <v:line id="Conector recto 2" o:spid="_x0000_s1034" style="position:absolute;visibility:visible;mso-wrap-style:square" from="29,1847" to="13256,1847" o:connectortype="straight" o:gfxdata="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" strokecolor="#c00000" strokeweight="1.5pt">
+                    <v:stroke joinstyle="miter"/>
+                  </v:line>
+                  <v:shape id="Cuadro de texto 3" o:spid="_x0000_s1035" type="#_x0000_t202" style="position:absolute;left:2766;width:9702;height:2242;visibility:visible;mso-wrap-style:square;v-text-anchor:top" o:gfxdata="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" filled="f" stroked="f" strokeweight=".5pt">
+                    <v:textbox>
+                      <w:txbxContent>
+                        <w:p>
+                          <w:pPr>
+                            <w:rPr>
+                              <w:rFonts w:ascii="Calibri" w:eastAsia="Times New Roman" w:hAnsi="Calibri" w:cs="Calibri"/>
+                              <w:b/>
+                              <w:bCs/>
+                              <w:sz w:val="16"/>
+                              <w:szCs w:val="16"/>
+                              <w:lang w:val="es-MX"/>
+                            </w:rPr>
+                          </w:pPr>
+                          <w:r>
+                            <w:rPr>
+                              <w:rFonts w:ascii="Calibri" w:eastAsia="Times New Roman" w:hAnsi="Calibri" w:cs="Calibri"/>
+                              <w:b/>
+                              <w:bCs/>
+                              <w:sz w:val="16"/>
+                              <w:szCs w:val="16"/>
+                              <w:lang w:val="es-MX"/>
+                            </w:rPr>
+                            <w:t>caracteres</w:t>
+                          </w:r>
+                        </w:p>
+                      </w:txbxContent>
+                    </v:textbox>
+                  </v:shape>
+                  <v:shape id="Cuadro de texto 3" o:spid="_x0000_s1036" type="#_x0000_t202" style="position:absolute;left:-568;top:1728;width:15014;height:7236;visibility:visible;mso-wrap-style:square;v-text-anchor:top" o:gfxdata="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" filled="f" stroked="f" strokeweight=".5pt">
+                    <v:textbox>
+                      <w:txbxContent>
+                        <w:p>
+                          <w:pPr>
+                            <w:spacing w:line="240" w:lineRule="auto"/>
+                            <w:jc w:val="both"/>
+                            <w:rPr>
+                              <w:rFonts w:ascii="Calibri" w:eastAsia="Times New Roman" w:hAnsi="Calibri" w:cs="Calibri"/>
+                              <w:sz w:val="14"/>
+                              <w:szCs w:val="14"/>
+                            </w:rPr>
+                          </w:pPr>
+                          <w:r>
+                            <w:rPr>
+                              <w:rFonts w:ascii="Calibri" w:eastAsia="Times New Roman" w:hAnsi="Calibri" w:cs="Calibri"/>
+                              <w:b/>
+                              <w:bCs/>
+                              <w:sz w:val="14"/>
+                              <w:szCs w:val="14"/>
+                            </w:rPr>
+                            <w:t>[</w:t>
+                          </w:r>
+                          <w:r>
+                            <w:rPr>
+                              <w:rFonts w:ascii="Calibri" w:eastAsia="Times New Roman" w:hAnsi="Calibri" w:cs="Calibri"/>
+                              <w:sz w:val="14"/>
+                              <w:szCs w:val="14"/>
+                            </w:rPr>
+                            <w:t>'</w:t>
+                          </w:r>
+                          <w:proofErr w:type="spellStart"/>
+                          <w:r>
+                            <w:rPr>
+                              <w:rFonts w:ascii="Calibri" w:eastAsia="Times New Roman" w:hAnsi="Calibri" w:cs="Calibri"/>
+                              <w:sz w:val="14"/>
+                              <w:szCs w:val="14"/>
+                            </w:rPr>
+                            <w:t>d','a','t','a</w:t>
+                          </w:r>
+                          <w:proofErr w:type="spellEnd"/>
+                          <w:r>
+                            <w:rPr>
+                              <w:rFonts w:ascii="Calibri" w:eastAsia="Times New Roman" w:hAnsi="Calibri" w:cs="Calibri"/>
+                              <w:sz w:val="14"/>
+                              <w:szCs w:val="14"/>
+                            </w:rPr>
+                            <w:t>',' ','</w:t>
+                          </w:r>
+                          <w:proofErr w:type="spellStart"/>
+                          <w:r>
+                            <w:rPr>
+                              <w:rFonts w:ascii="Calibri" w:eastAsia="Times New Roman" w:hAnsi="Calibri" w:cs="Calibri"/>
+                              <w:sz w:val="14"/>
+                              <w:szCs w:val="14"/>
+                            </w:rPr>
+                            <w:t>n','o','m','b','r','e</w:t>
+                          </w:r>
+                          <w:proofErr w:type="spellEnd"/>
+                          <w:r>
+                            <w:rPr>
+                              <w:rFonts w:ascii="Calibri" w:eastAsia="Times New Roman" w:hAnsi="Calibri" w:cs="Calibri"/>
+                              <w:sz w:val="14"/>
+                              <w:szCs w:val="14"/>
+                            </w:rPr>
+                            <w:t>',' ','</w:t>
+                          </w:r>
+                          <w:proofErr w:type="spellStart"/>
+                          <w:r>
+                            <w:rPr>
+                              <w:rFonts w:ascii="Calibri" w:eastAsia="Times New Roman" w:hAnsi="Calibri" w:cs="Calibri"/>
+                              <w:sz w:val="14"/>
+                              <w:szCs w:val="14"/>
+                            </w:rPr>
+                            <w:t>s','e','t</w:t>
+                          </w:r>
+                          <w:proofErr w:type="spellEnd"/>
+                          <w:r>
+                            <w:rPr>
+                              <w:rFonts w:ascii="Calibri" w:eastAsia="Times New Roman" w:hAnsi="Calibri" w:cs="Calibri"/>
+                              <w:sz w:val="14"/>
+                              <w:szCs w:val="14"/>
+                            </w:rPr>
+                            <w:t>',' ','\'','</w:t>
+                          </w:r>
+                          <w:proofErr w:type="spellStart"/>
+                          <w:r>
+                            <w:rPr>
+                              <w:rFonts w:ascii="Calibri" w:eastAsia="Times New Roman" w:hAnsi="Calibri" w:cs="Calibri"/>
+                              <w:sz w:val="14"/>
+                              <w:szCs w:val="14"/>
+                            </w:rPr>
+                            <w:t>K</w:t>
+                          </w:r>
+                          <w:r>
+                            <w:rPr>
+                              <w:rFonts w:ascii="Calibri" w:eastAsia="Times New Roman" w:hAnsi="Calibri" w:cs="Calibri"/>
+                              <w:sz w:val="14"/>
+                              <w:szCs w:val="14"/>
+                            </w:rPr>
+                            <w:t>','</w:t>
+                          </w:r>
+                          <w:r>
+                            <w:rPr>
+                              <w:rFonts w:ascii="Calibri" w:eastAsia="Times New Roman" w:hAnsi="Calibri" w:cs="Calibri"/>
+                              <w:sz w:val="14"/>
+                              <w:szCs w:val="14"/>
+                            </w:rPr>
+                            <w:t>e</w:t>
+                          </w:r>
+                          <w:r>
+                            <w:rPr>
+                              <w:rFonts w:ascii="Calibri" w:eastAsia="Times New Roman" w:hAnsi="Calibri" w:cs="Calibri"/>
+                              <w:sz w:val="14"/>
+                              <w:szCs w:val="14"/>
+                            </w:rPr>
+                            <w:t>','n</w:t>
+                          </w:r>
+                          <w:proofErr w:type="spellEnd"/>
+                          <w:r>
+                            <w:rPr>
+                              <w:rFonts w:ascii="Calibri" w:eastAsia="Times New Roman" w:hAnsi="Calibri" w:cs="Calibri"/>
+                              <w:sz w:val="14"/>
+                              <w:szCs w:val="14"/>
+                            </w:rPr>
+                            <w:t>','\''</w:t>
+                          </w:r>
+                          <w:r>
+                            <w:rPr>
+                              <w:rFonts w:ascii="Calibri" w:eastAsia="Times New Roman" w:hAnsi="Calibri" w:cs="Calibri"/>
+                              <w:b/>
+                              <w:bCs/>
+                              <w:sz w:val="14"/>
+                              <w:szCs w:val="14"/>
+                            </w:rPr>
+                            <w:t>]</w:t>
+                          </w:r>
+                        </w:p>
+                      </w:txbxContent>
+                    </v:textbox>
+                  </v:shape>
+                </v:group>
+                <v:group id="Grupo 5" o:spid="_x0000_s1037" style="position:absolute;left:25294;top:1781;width:10988;height:7837" coordorigin="-568,-98" coordsize="13795,10357" o:gfxdata="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">
+                  <v:roundrect id="Rectángulo: esquinas redondeadas 1" o:spid="_x0000_s1038" style="position:absolute;top:453;width:13227;height:7478;visibility:visible;mso-wrap-style:square;v-text-anchor:middle" arcsize="10923f" o:gfxdata="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" fillcolor="#fdfdc0" strokecolor="#c00000" strokeweight="1.5pt">
+                    <v:stroke joinstyle="miter"/>
+                  </v:roundrect>
+                  <v:line id="Conector recto 2" o:spid="_x0000_s1039" style="position:absolute;visibility:visible;mso-wrap-style:square" from="0,2115" to="13227,2115" o:connectortype="straight" o:gfxdata="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" strokecolor="#c00000" strokeweight="1.5pt">
+                    <v:stroke joinstyle="miter"/>
+                  </v:line>
+                  <v:shape id="Cuadro de texto 3" o:spid="_x0000_s1040" type="#_x0000_t202" style="position:absolute;left:2586;top:-98;width:9506;height:3187;visibility:visible;mso-wrap-style:square;v-text-anchor:top" o:gfxdata="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" filled="f" stroked="f" strokeweight=".5pt">
+                    <v:textbox>
+                      <w:txbxContent>
+                        <w:p>
+                          <w:pPr>
+                            <w:rPr>
+                              <w:rFonts w:ascii="Calibri" w:eastAsia="Times New Roman" w:hAnsi="Calibri" w:cs="Calibri"/>
+                              <w:b/>
+                              <w:bCs/>
+                              <w:sz w:val="16"/>
+                              <w:szCs w:val="16"/>
+                              <w:lang w:val="es-MX"/>
+                            </w:rPr>
+                          </w:pPr>
+                          <w:r>
+                            <w:rPr>
+                              <w:rFonts w:ascii="Calibri" w:eastAsia="Times New Roman" w:hAnsi="Calibri" w:cs="Calibri"/>
+                              <w:b/>
+                              <w:bCs/>
+                              <w:sz w:val="16"/>
+                              <w:szCs w:val="16"/>
+                              <w:lang w:val="es-MX"/>
+                            </w:rPr>
+                            <w:t>agrupación</w:t>
+                          </w:r>
+                        </w:p>
+                      </w:txbxContent>
+                    </v:textbox>
+                  </v:shape>
+                  <v:shape id="Cuadro de texto 3" o:spid="_x0000_s1041" type="#_x0000_t202" style="position:absolute;left:-568;top:1705;width:13502;height:8554;visibility:visible;mso-wrap-style:square;v-text-anchor:top" o:gfxdata="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" filled="f" stroked="f" strokeweight=".5pt">
+                    <v:textbox>
+                      <w:txbxContent>
+                        <w:p>
+                          <w:pPr>
+                            <w:jc w:val="both"/>
+                            <w:rPr>
+                              <w:rFonts w:ascii="Calibri" w:eastAsia="Times New Roman" w:hAnsi="Calibri" w:cs="Calibri"/>
+                              <w:sz w:val="14"/>
+                              <w:szCs w:val="14"/>
+                            </w:rPr>
+                          </w:pPr>
+                          <w:r>
+                            <w:rPr>
+                              <w:rFonts w:ascii="Calibri" w:eastAsia="Times New Roman" w:hAnsi="Calibri" w:cs="Calibri"/>
+                              <w:b/>
+                              <w:bCs/>
+                              <w:sz w:val="14"/>
+                              <w:szCs w:val="14"/>
+                            </w:rPr>
+                            <w:t>[</w:t>
+                          </w:r>
+                          <w:r>
+                            <w:rPr>
+                              <w:rFonts w:ascii="Calibri" w:eastAsia="Times New Roman" w:hAnsi="Calibri" w:cs="Calibri"/>
+                              <w:sz w:val="14"/>
+                              <w:szCs w:val="14"/>
+                            </w:rPr>
+                            <w:t>"data", " ", "nombre", " ", "set", " ", "'Juan'"</w:t>
+                          </w:r>
+                          <w:r>
+                            <w:rPr>
+                              <w:rFonts w:ascii="Calibri" w:eastAsia="Times New Roman" w:hAnsi="Calibri" w:cs="Calibri"/>
+                              <w:b/>
+                              <w:bCs/>
+                              <w:sz w:val="14"/>
+                              <w:szCs w:val="14"/>
+                            </w:rPr>
+                            <w:t>]</w:t>
+                          </w:r>
+                        </w:p>
+                        <w:p>
+                          <w:pPr>
+                            <w:spacing w:line="240" w:lineRule="auto"/>
+                            <w:jc w:val="both"/>
+                            <w:rPr>
+                              <w:rFonts w:ascii="Calibri" w:eastAsia="Times New Roman" w:hAnsi="Calibri" w:cs="Calibri"/>
+                              <w:sz w:val="16"/>
+                              <w:szCs w:val="16"/>
+                            </w:rPr>
+                          </w:pPr>
+                        </w:p>
+                      </w:txbxContent>
+                    </v:textbox>
+                  </v:shape>
+                </v:group>
+                <v:group id="Grupo 5" o:spid="_x0000_s1042" style="position:absolute;left:38119;top:1900;width:11089;height:7290" coordorigin="-214,-38" coordsize="13957,9519" o:gfxdata="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">
+                  <v:roundrect id="Rectángulo: esquinas redondeadas 1" o:spid="_x0000_s1043" style="position:absolute;top:453;width:13227;height:7478;visibility:visible;mso-wrap-style:square;v-text-anchor:middle" arcsize="10923f" o:gfxdata="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" fillcolor="#fdfdc0" strokecolor="#c00000" strokeweight="1.5pt">
+                    <v:stroke joinstyle="miter"/>
+                  </v:roundrect>
+                  <v:line id="Conector recto 2" o:spid="_x0000_s1044" style="position:absolute;visibility:visible;mso-wrap-style:square" from="0,2115" to="13227,2115" o:connectortype="straight" o:gfxdata="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" strokecolor="#c00000" strokeweight="1.5pt">
+                    <v:stroke joinstyle="miter"/>
+                  </v:line>
+                  <v:shape id="Cuadro de texto 3" o:spid="_x0000_s1045" type="#_x0000_t202" style="position:absolute;left:2623;top:-38;width:9547;height:2578;visibility:visible;mso-wrap-style:square;v-text-anchor:top" o:gfxdata="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" filled="f" stroked="f" strokeweight=".5pt">
+                    <v:textbox>
+                      <w:txbxContent>
+                        <w:p>
+                          <w:pPr>
+                            <w:rPr>
+                              <w:rFonts w:ascii="Calibri" w:eastAsia="Times New Roman" w:hAnsi="Calibri" w:cs="Calibri"/>
+                              <w:b/>
+                              <w:bCs/>
+                              <w:sz w:val="18"/>
+                              <w:szCs w:val="18"/>
+                              <w:lang w:val="es-MX"/>
+                            </w:rPr>
+                          </w:pPr>
+                          <w:r>
+                            <w:rPr>
+                              <w:rFonts w:ascii="Calibri" w:eastAsia="Times New Roman" w:hAnsi="Calibri" w:cs="Calibri"/>
+                              <w:b/>
+                              <w:bCs/>
+                              <w:sz w:val="16"/>
+                              <w:szCs w:val="16"/>
+                              <w:lang w:val="es-MX"/>
+                            </w:rPr>
+                            <w:t>clasificación</w:t>
+                          </w:r>
+                          <w:r>
+                            <w:rPr>
+                              <w:rFonts w:ascii="Calibri" w:eastAsia="Times New Roman" w:hAnsi="Calibri" w:cs="Calibri"/>
+                              <w:b/>
+                              <w:bCs/>
+                              <w:sz w:val="18"/>
+                              <w:szCs w:val="18"/>
+                              <w:lang w:val="es-MX"/>
+                            </w:rPr>
+                            <w:t xml:space="preserve"> </w:t>
+                          </w:r>
+                        </w:p>
+                      </w:txbxContent>
+                    </v:textbox>
+                  </v:shape>
+                  <v:shape id="Cuadro de texto 3" o:spid="_x0000_s1046" type="#_x0000_t202" style="position:absolute;left:-214;top:1995;width:13956;height:7485;visibility:visible;mso-wrap-style:square;v-text-anchor:top" o:gfxdata="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" filled="f" stroked="f" strokeweight=".5pt">
+                    <v:textbox>
+                      <w:txbxContent>
+                        <w:p>
+                          <w:pPr>
+                            <w:spacing w:line="240" w:lineRule="auto"/>
+                            <w:rPr>
+                              <w:rFonts w:ascii="Calibri" w:eastAsia="Times New Roman" w:hAnsi="Calibri" w:cs="Calibri"/>
+                              <w:sz w:val="12"/>
+                              <w:szCs w:val="12"/>
+                              <w:lang w:val="en-US"/>
+                            </w:rPr>
+                          </w:pPr>
+                          <w:r>
+                            <w:rPr>
+                              <w:rFonts w:ascii="Calibri" w:eastAsia="Times New Roman" w:hAnsi="Calibri" w:cs="Calibri"/>
+                              <w:b/>
+                              <w:bCs/>
+                              <w:sz w:val="12"/>
+                              <w:szCs w:val="12"/>
+                              <w:lang w:val="en-US"/>
+                            </w:rPr>
+                            <w:t>[</w:t>
+                          </w:r>
+                          <w:r>
+                            <w:rPr>
+                              <w:rFonts w:ascii="Calibri" w:eastAsia="Times New Roman" w:hAnsi="Calibri" w:cs="Calibri"/>
+                              <w:sz w:val="12"/>
+                              <w:szCs w:val="12"/>
+                              <w:lang w:val="en-US"/>
+                            </w:rPr>
+                            <w:t>KEYWORD,</w:t>
+                          </w:r>
+                          <w:r>
+                            <w:rPr>
+                              <w:rFonts w:ascii="Calibri" w:eastAsia="Times New Roman" w:hAnsi="Calibri" w:cs="Calibri"/>
+                              <w:sz w:val="12"/>
+                              <w:szCs w:val="12"/>
+                              <w:lang w:val="en-US"/>
+                            </w:rPr>
+                            <w:t xml:space="preserve"> </w:t>
+                          </w:r>
+                          <w:r>
+                            <w:rPr>
+                              <w:rFonts w:ascii="Calibri" w:eastAsia="Times New Roman" w:hAnsi="Calibri" w:cs="Calibri"/>
+                              <w:sz w:val="12"/>
+                              <w:szCs w:val="12"/>
+                              <w:lang w:val="en-US"/>
+                            </w:rPr>
+                            <w:t>WHITESPACE, IDENTIFIER, WHITESPACE, OPERATOR, WHITESPACE, STRING</w:t>
+                          </w:r>
+                          <w:r>
+                            <w:rPr>
+                              <w:rFonts w:ascii="Calibri" w:eastAsia="Times New Roman" w:hAnsi="Calibri" w:cs="Calibri"/>
+                              <w:b/>
+                              <w:bCs/>
+                              <w:sz w:val="12"/>
+                              <w:szCs w:val="12"/>
+                              <w:lang w:val="en-US"/>
+                            </w:rPr>
+                            <w:t>]</w:t>
+                          </w:r>
+                        </w:p>
+                      </w:txbxContent>
+                    </v:textbox>
+                  </v:shape>
+                </v:group>
+                <v:group id="Grupo 5" o:spid="_x0000_s1047" style="position:absolute;left:51301;width:15900;height:11430" coordorigin=",82" coordsize="15908,10708" o:gfxdata="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">
+                  <v:roundrect id="Rectángulo: esquinas redondeadas 1" o:spid="_x0000_s1048" style="position:absolute;top:453;width:13227;height:9363;visibility:visible;mso-wrap-style:square;v-text-anchor:middle" arcsize="10923f" o:gfxdata="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" fillcolor="#fdfdc0" strokecolor="#c00000" strokeweight="1.5pt">
+                    <v:stroke joinstyle="miter"/>
+                  </v:roundrect>
+                  <v:line id="Conector recto 2" o:spid="_x0000_s1049" style="position:absolute;visibility:visible;mso-wrap-style:square" from="0,2115" to="13227,2115" o:connectortype="straight" o:gfxdata="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" strokecolor="#c00000" strokeweight="1.5pt">
+                    <v:stroke joinstyle="miter"/>
+                  </v:line>
+                  <v:shape id="Cuadro de texto 3" o:spid="_x0000_s1050" type="#_x0000_t202" style="position:absolute;left:4111;top:82;width:6224;height:2579;visibility:visible;mso-wrap-style:square;v-text-anchor:top" o:gfxdata="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" filled="f" stroked="f" strokeweight=".5pt">
+                    <v:textbox>
+                      <w:txbxContent>
+                        <w:p>
+                          <w:pPr>
+                            <w:rPr>
+                              <w:rFonts w:ascii="Calibri" w:eastAsia="Times New Roman" w:hAnsi="Calibri" w:cs="Calibri"/>
+                              <w:b/>
+                              <w:bCs/>
+                              <w:sz w:val="16"/>
+                              <w:szCs w:val="16"/>
+                              <w:lang w:val="es-MX"/>
+                            </w:rPr>
+                          </w:pPr>
+                          <w:r>
+                            <w:rPr>
+                              <w:rFonts w:ascii="Calibri" w:eastAsia="Times New Roman" w:hAnsi="Calibri" w:cs="Calibri"/>
+                              <w:b/>
+                              <w:bCs/>
+                              <w:sz w:val="16"/>
+                              <w:szCs w:val="16"/>
+                              <w:lang w:val="es-MX"/>
+                            </w:rPr>
+                            <w:t>tokens</w:t>
+                          </w:r>
+                          <w:r>
+                            <w:rPr>
+                              <w:rFonts w:ascii="Calibri" w:eastAsia="Times New Roman" w:hAnsi="Calibri" w:cs="Calibri"/>
+                              <w:b/>
+                              <w:bCs/>
+                              <w:sz w:val="16"/>
+                              <w:szCs w:val="16"/>
+                              <w:lang w:val="es-MX"/>
+                            </w:rPr>
+                            <w:t xml:space="preserve"> </w:t>
+                          </w:r>
+                        </w:p>
+                      </w:txbxContent>
+                    </v:textbox>
+                  </v:shape>
+                  <v:shape id="Cuadro de texto 3" o:spid="_x0000_s1051" type="#_x0000_t202" style="position:absolute;left:418;top:2256;width:15490;height:8535;visibility:visible;mso-wrap-style:square;v-text-anchor:top" o:gfxdata="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" filled="f" stroked="f" strokeweight=".5pt">
+                    <v:textbox>
+                      <w:txbxContent>
+                        <w:p>
+                          <w:pPr>
+                            <w:spacing w:line="240" w:lineRule="auto"/>
+                            <w:jc w:val="both"/>
+                            <w:rPr>
+                              <w:rFonts w:ascii="Calibri" w:eastAsia="Times New Roman" w:hAnsi="Calibri" w:cs="Calibri"/>
+                              <w:sz w:val="12"/>
+                              <w:szCs w:val="12"/>
+                              <w:lang w:val="en-US"/>
+                            </w:rPr>
+                          </w:pPr>
+                          <w:r>
+                            <w:rPr>
+                              <w:rFonts w:ascii="Calibri" w:eastAsia="Times New Roman" w:hAnsi="Calibri" w:cs="Calibri"/>
+                              <w:sz w:val="12"/>
+                              <w:szCs w:val="12"/>
+                              <w:lang w:val="en-US"/>
+                            </w:rPr>
+                            <w:t>[</w:t>
+                          </w:r>
+                          <w:r>
+                            <w:rPr>
+                              <w:rFonts w:ascii="Calibri" w:eastAsia="Times New Roman" w:hAnsi="Calibri" w:cs="Calibri"/>
+                              <w:sz w:val="12"/>
+                              <w:szCs w:val="12"/>
+                              <w:lang w:val="en-US"/>
+                            </w:rPr>
+                            <w:t xml:space="preserve"> </w:t>
+                          </w:r>
+                          <w:r>
+                            <w:rPr>
+                              <w:rFonts w:ascii="Calibri" w:eastAsia="Times New Roman" w:hAnsi="Calibri" w:cs="Calibri"/>
+                              <w:b/>
+                              <w:bCs/>
+                              <w:sz w:val="12"/>
+                              <w:szCs w:val="12"/>
+                              <w:lang w:val="en-US"/>
+                            </w:rPr>
+                            <w:t>Token</w:t>
+                          </w:r>
+                          <w:r>
+                            <w:rPr>
+                              <w:rFonts w:ascii="Calibri" w:eastAsia="Times New Roman" w:hAnsi="Calibri" w:cs="Calibri"/>
+                              <w:sz w:val="12"/>
+                              <w:szCs w:val="12"/>
+                              <w:lang w:val="en-US"/>
+                            </w:rPr>
+                            <w:t xml:space="preserve"> (</w:t>
+                          </w:r>
+                          <w:r>
+                            <w:rPr>
+                              <w:rFonts w:ascii="Calibri" w:eastAsia="Times New Roman" w:hAnsi="Calibri" w:cs="Calibri"/>
+                              <w:sz w:val="12"/>
+                              <w:szCs w:val="12"/>
+                              <w:lang w:val="en-US"/>
+                            </w:rPr>
+                            <w:t>KEYWORD, "data", 1, 1),</w:t>
+                          </w:r>
+                        </w:p>
+                        <w:p>
+                          <w:pPr>
+                            <w:spacing w:line="240" w:lineRule="auto"/>
+                            <w:jc w:val="both"/>
+                            <w:rPr>
+                              <w:rFonts w:ascii="Calibri" w:eastAsia="Times New Roman" w:hAnsi="Calibri" w:cs="Calibri"/>
+                              <w:sz w:val="12"/>
+                              <w:szCs w:val="12"/>
+                              <w:lang w:val="en-US"/>
+                            </w:rPr>
+                          </w:pPr>
+                          <w:r>
+                            <w:rPr>
+                              <w:rFonts w:ascii="Calibri" w:eastAsia="Times New Roman" w:hAnsi="Calibri" w:cs="Calibri"/>
+                              <w:b/>
+                              <w:bCs/>
+                              <w:sz w:val="12"/>
+                              <w:szCs w:val="12"/>
+                              <w:lang w:val="en-US"/>
+                            </w:rPr>
+                            <w:t>Token</w:t>
+                          </w:r>
+                          <w:r>
+                            <w:rPr>
+                              <w:rFonts w:ascii="Calibri" w:eastAsia="Times New Roman" w:hAnsi="Calibri" w:cs="Calibri"/>
+                              <w:sz w:val="12"/>
+                              <w:szCs w:val="12"/>
+                              <w:lang w:val="en-US"/>
+                            </w:rPr>
+                            <w:t xml:space="preserve"> (</w:t>
+                          </w:r>
+                          <w:r>
+                            <w:rPr>
+                              <w:rFonts w:ascii="Calibri" w:eastAsia="Times New Roman" w:hAnsi="Calibri" w:cs="Calibri"/>
+                              <w:sz w:val="12"/>
+                              <w:szCs w:val="12"/>
+                              <w:lang w:val="en-US"/>
+                            </w:rPr>
+                            <w:t>IDENTIFIER, "</w:t>
+                          </w:r>
+                          <w:proofErr w:type="spellStart"/>
+                          <w:r>
+                            <w:rPr>
+                              <w:rFonts w:ascii="Calibri" w:eastAsia="Times New Roman" w:hAnsi="Calibri" w:cs="Calibri"/>
+                              <w:sz w:val="12"/>
+                              <w:szCs w:val="12"/>
+                              <w:lang w:val="en-US"/>
+                            </w:rPr>
+                            <w:t>nombre</w:t>
+                          </w:r>
+                          <w:proofErr w:type="spellEnd"/>
+                          <w:r>
+                            <w:rPr>
+                              <w:rFonts w:ascii="Calibri" w:eastAsia="Times New Roman" w:hAnsi="Calibri" w:cs="Calibri"/>
+                              <w:sz w:val="12"/>
+                              <w:szCs w:val="12"/>
+                              <w:lang w:val="en-US"/>
+                            </w:rPr>
+                            <w:t xml:space="preserve">", 1, 6), </w:t>
+                          </w:r>
+                        </w:p>
+                        <w:p>
+                          <w:pPr>
+                            <w:spacing w:line="240" w:lineRule="auto"/>
+                            <w:jc w:val="both"/>
+                            <w:rPr>
+                              <w:rFonts w:ascii="Calibri" w:eastAsia="Times New Roman" w:hAnsi="Calibri" w:cs="Calibri"/>
+                              <w:sz w:val="12"/>
+                              <w:szCs w:val="12"/>
+                              <w:lang w:val="en-US"/>
+                            </w:rPr>
+                          </w:pPr>
+                          <w:r>
+                            <w:rPr>
+                              <w:rFonts w:ascii="Calibri" w:eastAsia="Times New Roman" w:hAnsi="Calibri" w:cs="Calibri"/>
+                              <w:b/>
+                              <w:bCs/>
+                              <w:sz w:val="12"/>
+                              <w:szCs w:val="12"/>
+                              <w:lang w:val="en-US"/>
+                            </w:rPr>
+                            <w:t>Token</w:t>
+                          </w:r>
+                          <w:r>
+                            <w:rPr>
+                              <w:rFonts w:ascii="Calibri" w:eastAsia="Times New Roman" w:hAnsi="Calibri" w:cs="Calibri"/>
+                              <w:sz w:val="12"/>
+                              <w:szCs w:val="12"/>
+                              <w:lang w:val="en-US"/>
+                            </w:rPr>
+                            <w:t xml:space="preserve"> (</w:t>
+                          </w:r>
+                          <w:r>
+                            <w:rPr>
+                              <w:rFonts w:ascii="Calibri" w:eastAsia="Times New Roman" w:hAnsi="Calibri" w:cs="Calibri"/>
+                              <w:sz w:val="12"/>
+                              <w:szCs w:val="12"/>
+                              <w:lang w:val="en-US"/>
+                            </w:rPr>
+                            <w:t>OPERATOR, "set", 1, 12),</w:t>
+                          </w:r>
+                        </w:p>
+                        <w:p>
+                          <w:pPr>
+                            <w:spacing w:line="240" w:lineRule="auto"/>
+                            <w:jc w:val="both"/>
+                            <w:rPr>
+                              <w:rFonts w:ascii="Calibri" w:eastAsia="Times New Roman" w:hAnsi="Calibri" w:cs="Calibri"/>
+                              <w:sz w:val="12"/>
+                              <w:szCs w:val="12"/>
+                              <w:lang w:val="en-US"/>
+                            </w:rPr>
+                          </w:pPr>
+                          <w:r>
+                            <w:rPr>
+                              <w:rFonts w:ascii="Calibri" w:eastAsia="Times New Roman" w:hAnsi="Calibri" w:cs="Calibri"/>
+                              <w:b/>
+                              <w:bCs/>
+                              <w:sz w:val="12"/>
+                              <w:szCs w:val="12"/>
+                              <w:lang w:val="en-US"/>
+                            </w:rPr>
+                            <w:t>Token</w:t>
+                          </w:r>
+                          <w:r>
+                            <w:rPr>
+                              <w:rFonts w:ascii="Calibri" w:eastAsia="Times New Roman" w:hAnsi="Calibri" w:cs="Calibri"/>
+                              <w:sz w:val="12"/>
+                              <w:szCs w:val="12"/>
+                              <w:lang w:val="en-US"/>
+                            </w:rPr>
+                            <w:t xml:space="preserve"> (</w:t>
+                          </w:r>
+                          <w:r>
+                            <w:rPr>
+                              <w:rFonts w:ascii="Calibri" w:eastAsia="Times New Roman" w:hAnsi="Calibri" w:cs="Calibri"/>
+                              <w:sz w:val="12"/>
+                              <w:szCs w:val="12"/>
+                              <w:lang w:val="en-US"/>
+                            </w:rPr>
+                            <w:t>STRING, "Juan", 1, 16</w:t>
+                          </w:r>
+                          <w:r>
+                            <w:rPr>
+                              <w:rFonts w:ascii="Calibri" w:eastAsia="Times New Roman" w:hAnsi="Calibri" w:cs="Calibri"/>
+                              <w:sz w:val="12"/>
+                              <w:szCs w:val="12"/>
+                              <w:lang w:val="en-US"/>
+                            </w:rPr>
+                            <w:t>)</w:t>
+                          </w:r>
+                          <w:r>
+                            <w:rPr>
+                              <w:rFonts w:ascii="Calibri" w:eastAsia="Times New Roman" w:hAnsi="Calibri" w:cs="Calibri"/>
+                              <w:sz w:val="12"/>
+                              <w:szCs w:val="12"/>
+                              <w:lang w:val="en-US"/>
+                            </w:rPr>
+                            <w:t>]</w:t>
+                          </w:r>
+                        </w:p>
+                        <w:p>
+                          <w:pPr>
+                            <w:spacing w:line="240" w:lineRule="auto"/>
+                            <w:jc w:val="both"/>
+                            <w:rPr>
+                              <w:rFonts w:ascii="Calibri" w:eastAsia="Times New Roman" w:hAnsi="Calibri" w:cs="Calibri"/>
+                              <w:sz w:val="16"/>
+                              <w:szCs w:val="16"/>
+                              <w:lang w:val="en-US"/>
+                            </w:rPr>
+                          </w:pPr>
+                        </w:p>
+                      </w:txbxContent>
+                    </v:textbox>
+                  </v:shape>
+                </v:group>
+                <w10:wrap anchorx="margin"/>
+              </v:group>
+            </w:pict>
+          </mc:Fallback>
+        </mc:AlternateContent>
+      </w:r>
+    </w:p>
+    <w:p>
+      <w:pPr>
+        <w:pStyle w:val="Prrafodelista"/>
+        <w:ind w:left="0"/>
+        <w:rPr>
+          <w:rFonts w:ascii="Times New Roman" w:eastAsia="Times New Roman" w:hAnsi="Times New Roman" w:cs="Times New Roman"/>
+          <w:b/>
+          <w:bCs/>
+        </w:rPr>
+      </w:pPr>
+    </w:p>
+    <w:p>
+      <w:pPr>
+        <w:pStyle w:val="Prrafodelista"/>
+        <w:ind w:left="0"/>
+        <w:rPr>
+          <w:rFonts w:ascii="Times New Roman" w:eastAsia="Times New Roman" w:hAnsi="Times New Roman" w:cs="Times New Roman"/>
+          <w:b/>
+          <w:bCs/>
+        </w:rPr>
+      </w:pPr>
+    </w:p>
+    <w:p>
+      <w:pPr>
+        <w:pStyle w:val="Prrafodelista"/>
+        <w:ind w:left="0"/>
+        <w:rPr>
+          <w:rFonts w:ascii="Times New Roman" w:eastAsia="Times New Roman" w:hAnsi="Times New Roman" w:cs="Times New Roman"/>
+          <w:b/>
+          <w:bCs/>
+        </w:rPr>
+      </w:pPr>
+      <w:r>
+        <w:rPr>
+          <w:rFonts w:ascii="Times New Roman" w:eastAsia="Times New Roman" w:hAnsi="Times New Roman" w:cs="Times New Roman"/>
+          <w:b/>
+          <w:bCs/>
+          <w:noProof/>
+        </w:rPr>
+        <mc:AlternateContent>
+          <mc:Choice Requires="wps">
+            <w:drawing>
+              <wp:anchor distT="0" distB="0" distL="114300" distR="114300" simplePos="0" relativeHeight="251677696" behindDoc="0" locked="0" layoutInCell="1" allowOverlap="1" wp14:anchorId="76514470" wp14:editId="7202D4C1">
+                <wp:simplePos x="0" y="0"/>
+                <wp:positionH relativeFrom="column">
+                  <wp:posOffset>4493895</wp:posOffset>
+                </wp:positionH>
+                <wp:positionV relativeFrom="paragraph">
+                  <wp:posOffset>147320</wp:posOffset>
+                </wp:positionV>
+                <wp:extent cx="237744" cy="0"/>
+                <wp:effectExtent l="0" t="76200" r="10160" b="114300"/>
+                <wp:wrapNone/>
+                <wp:docPr id="392398601" name="Conector recto de flecha 7"/>
+                <wp:cNvGraphicFramePr/>
+                <a:graphic xmlns:a="http://schemas.openxmlformats.org/drawingml/2006/main">
+                  <a:graphicData uri="http://schemas.microsoft.com/office/word/2010/wordprocessingShape">
+                    <wps:wsp>
+                      <wps:cNvCnPr/>
+                      <wps:spPr>
+                        <a:xfrm>
+                          <a:off x="0" y="0"/>
+                          <a:ext cx="237744" cy="0"/>
+                        </a:xfrm>
+                        <a:prstGeom prst="straightConnector1">
+                          <a:avLst/>
+                        </a:prstGeom>
+                        <a:ln>
+                          <a:solidFill>
+                            <a:srgbClr val="C00000"/>
+                          </a:solidFill>
+                          <a:headEnd type="none" w="med" len="med"/>
+                          <a:tailEnd type="arrow" w="med" len="med"/>
+                        </a:ln>
+                      </wps:spPr>
+                      <wps:style>
+                        <a:lnRef idx="1">
+                          <a:schemeClr val="dk1"/>
+                        </a:lnRef>
+                        <a:fillRef idx="0">
+                          <a:schemeClr val="dk1"/>
+                        </a:fillRef>
+                        <a:effectRef idx="0">
+                          <a:schemeClr val="dk1"/>
+                        </a:effectRef>
+                        <a:fontRef idx="minor">
+                          <a:schemeClr val="tx1"/>
+                        </a:fontRef>
+                      </wps:style>
+                      <wps:bodyPr/>
+                    </wps:wsp>
+                  </a:graphicData>
+                </a:graphic>
+                <wp14:sizeRelH relativeFrom="margin">
+                  <wp14:pctWidth>0</wp14:pctWidth>
+                </wp14:sizeRelH>
+                <wp14:sizeRelV relativeFrom="margin">
+                  <wp14:pctHeight>0</wp14:pctHeight>
+                </wp14:sizeRelV>
+              </wp:anchor>
+            </w:drawing>
+          </mc:Choice>
+          <mc:Fallback>
+            <w:pict>
+              <v:shapetype w14:anchorId="43B3717B" id="_x0000_t32" coordsize="21600,21600" o:spt="32" o:oned="t" path="m,l21600,21600e" filled="f">
+                <v:path arrowok="t" fillok="f" o:connecttype="none"/>
+                <o:lock v:ext="edit" shapetype="t"/>
+              </v:shapetype>
+              <v:shape id="Conector recto de flecha 7" o:spid="_x0000_s1026" type="#_x0000_t32" style="position:absolute;margin-left:353.85pt;margin-top:11.6pt;width:18.7pt;height:0;z-index:251677696;visibility:visible;mso-wrap-style:square;mso-width-percent:0;mso-height-percent:0;mso-wrap-distance-left:9pt;mso-wrap-distance-top:0;mso-wrap-distance-right:9pt;mso-wrap-distance-bottom:0;mso-position-horizontal:absolute;mso-position-horizontal-relative:text;mso-position-vertical:absolute;mso-position-vertical-relative:text;mso-width-percent:0;mso-height-percent:0;mso-width-relative:margin;mso-height-relative:margin" o:gfxdata="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" strokecolor="#c00000" strokeweight="1pt">
+                <v:stroke endarrow="open" joinstyle="miter"/>
+              </v:shape>
+            </w:pict>
+          </mc:Fallback>
+        </mc:AlternateContent>
+      </w:r>
+      <w:r>
+        <w:rPr>
+          <w:rFonts w:ascii="Times New Roman" w:eastAsia="Times New Roman" w:hAnsi="Times New Roman" w:cs="Times New Roman"/>
+          <w:b/>
+          <w:bCs/>
+          <w:noProof/>
+        </w:rPr>
+        <mc:AlternateContent>
+          <mc:Choice Requires="wps">
+            <w:drawing>
+              <wp:anchor distT="0" distB="0" distL="114300" distR="114300" simplePos="0" relativeHeight="251675648" behindDoc="0" locked="0" layoutInCell="1" allowOverlap="1" wp14:anchorId="0D84810C" wp14:editId="31E64EA5">
+                <wp:simplePos x="0" y="0"/>
+                <wp:positionH relativeFrom="column">
+                  <wp:posOffset>3241920</wp:posOffset>
+                </wp:positionH>
+                <wp:positionV relativeFrom="paragraph">
+                  <wp:posOffset>147141</wp:posOffset>
+                </wp:positionV>
+                <wp:extent cx="192024" cy="0"/>
+                <wp:effectExtent l="0" t="76200" r="17780" b="114300"/>
+                <wp:wrapNone/>
+                <wp:docPr id="1848793371" name="Conector recto de flecha 7"/>
+                <wp:cNvGraphicFramePr/>
+                <a:graphic xmlns:a="http://schemas.openxmlformats.org/drawingml/2006/main">
+                  <a:graphicData uri="http://schemas.microsoft.com/office/word/2010/wordprocessingShape">
+                    <wps:wsp>
+                      <wps:cNvCnPr/>
+                      <wps:spPr>
+                        <a:xfrm flipV="1">
+                          <a:off x="0" y="0"/>
+                          <a:ext cx="192024" cy="0"/>
+                        </a:xfrm>
+                        <a:prstGeom prst="straightConnector1">
+                          <a:avLst/>
+                        </a:prstGeom>
+                        <a:ln>
+                          <a:solidFill>
+                            <a:srgbClr val="C00000"/>
+                          </a:solidFill>
+                          <a:headEnd type="none" w="med" len="med"/>
+                          <a:tailEnd type="arrow" w="med" len="med"/>
+                        </a:ln>
+                      </wps:spPr>
+                      <wps:style>
+                        <a:lnRef idx="1">
+                          <a:schemeClr val="dk1"/>
+                        </a:lnRef>
+                        <a:fillRef idx="0">
+                          <a:schemeClr val="dk1"/>
+                        </a:fillRef>
+                        <a:effectRef idx="0">
+                          <a:schemeClr val="dk1"/>
+                        </a:effectRef>
+                        <a:fontRef idx="minor">
+                          <a:schemeClr val="tx1"/>
+                        </a:fontRef>
+                      </wps:style>
+                      <wps:bodyPr/>
+                    </wps:wsp>
+                  </a:graphicData>
+                </a:graphic>
+                <wp14:sizeRelH relativeFrom="margin">
+                  <wp14:pctWidth>0</wp14:pctWidth>
+                </wp14:sizeRelH>
+                <wp14:sizeRelV relativeFrom="margin">
+                  <wp14:pctHeight>0</wp14:pctHeight>
+                </wp14:sizeRelV>
+              </wp:anchor>
+            </w:drawing>
+          </mc:Choice>
+          <mc:Fallback>
+            <w:pict>
+              <v:shape w14:anchorId="27881B78" id="Conector recto de flecha 7" o:spid="_x0000_s1026" type="#_x0000_t32" style="position:absolute;margin-left:255.25pt;margin-top:11.6pt;width:15.1pt;height:0;flip:y;z-index:251675648;visibility:visible;mso-wrap-style:square;mso-width-percent:0;mso-height-percent:0;mso-wrap-distance-left:9pt;mso-wrap-distance-top:0;mso-wrap-distance-right:9pt;mso-wrap-distance-bottom:0;mso-position-horizontal:absolute;mso-position-horizontal-relative:text;mso-position-vertical:absolute;mso-position-vertical-relative:text;mso-width-percent:0;mso-height-percent:0;mso-width-relative:margin;mso-height-relative:margin" o:gfxdata="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" strokecolor="#c00000" strokeweight="1pt">
+                <v:stroke endarrow="open" joinstyle="miter"/>
+              </v:shape>
+            </w:pict>
+          </mc:Fallback>
+        </mc:AlternateContent>
+      </w:r>
+      <w:r>
+        <w:rPr>
+          <w:rFonts w:ascii="Times New Roman" w:eastAsia="Times New Roman" w:hAnsi="Times New Roman" w:cs="Times New Roman"/>
+          <w:b/>
+          <w:bCs/>
+          <w:noProof/>
+        </w:rPr>
+        <mc:AlternateContent>
+          <mc:Choice Requires="wps">
+            <w:drawing>
+              <wp:anchor distT="0" distB="0" distL="114300" distR="114300" simplePos="0" relativeHeight="251673600" behindDoc="0" locked="0" layoutInCell="1" allowOverlap="1" wp14:anchorId="3A3C43A3" wp14:editId="7E2E6EE4">
+                <wp:simplePos x="0" y="0"/>
+                <wp:positionH relativeFrom="column">
+                  <wp:posOffset>1941830</wp:posOffset>
+                </wp:positionH>
+                <wp:positionV relativeFrom="paragraph">
+                  <wp:posOffset>140970</wp:posOffset>
+                </wp:positionV>
+                <wp:extent cx="237744" cy="0"/>
+                <wp:effectExtent l="0" t="76200" r="10160" b="114300"/>
+                <wp:wrapNone/>
+                <wp:docPr id="1338015557" name="Conector recto de flecha 7"/>
+                <wp:cNvGraphicFramePr/>
+                <a:graphic xmlns:a="http://schemas.openxmlformats.org/drawingml/2006/main">
+                  <a:graphicData uri="http://schemas.microsoft.com/office/word/2010/wordprocessingShape">
+                    <wps:wsp>
+                      <wps:cNvCnPr/>
+                      <wps:spPr>
+                        <a:xfrm flipV="1">
+                          <a:off x="0" y="0"/>
+                          <a:ext cx="237744" cy="0"/>
+                        </a:xfrm>
+                        <a:prstGeom prst="straightConnector1">
+                          <a:avLst/>
+                        </a:prstGeom>
+                        <a:ln>
+                          <a:solidFill>
+                            <a:srgbClr val="C00000"/>
+                          </a:solidFill>
+                          <a:headEnd type="none" w="med" len="med"/>
+                          <a:tailEnd type="arrow" w="med" len="med"/>
+                        </a:ln>
+                      </wps:spPr>
+                      <wps:style>
+                        <a:lnRef idx="1">
+                          <a:schemeClr val="dk1"/>
+                        </a:lnRef>
+                        <a:fillRef idx="0">
+                          <a:schemeClr val="dk1"/>
+                        </a:fillRef>
+                        <a:effectRef idx="0">
+                          <a:schemeClr val="dk1"/>
+                        </a:effectRef>
+                        <a:fontRef idx="minor">
+                          <a:schemeClr val="tx1"/>
+                        </a:fontRef>
+                      </wps:style>
+                      <wps:bodyPr/>
+                    </wps:wsp>
+                  </a:graphicData>
+                </a:graphic>
+                <wp14:sizeRelH relativeFrom="margin">
+                  <wp14:pctWidth>0</wp14:pctWidth>
+                </wp14:sizeRelH>
+                <wp14:sizeRelV relativeFrom="margin">
+                  <wp14:pctHeight>0</wp14:pctHeight>
+                </wp14:sizeRelV>
+              </wp:anchor>
+            </w:drawing>
+          </mc:Choice>
+          <mc:Fallback>
+            <w:pict>
+              <v:shape w14:anchorId="7420FD90" id="Conector recto de flecha 7" o:spid="_x0000_s1026" type="#_x0000_t32" style="position:absolute;margin-left:152.9pt;margin-top:11.1pt;width:18.7pt;height:0;flip:y;z-index:251673600;visibility:visible;mso-wrap-style:square;mso-width-percent:0;mso-height-percent:0;mso-wrap-distance-left:9pt;mso-wrap-distance-top:0;mso-wrap-distance-right:9pt;mso-wrap-distance-bottom:0;mso-position-horizontal:absolute;mso-position-horizontal-relative:text;mso-position-vertical:absolute;mso-position-vertical-relative:text;mso-width-percent:0;mso-height-percent:0;mso-width-relative:margin;mso-height-relative:margin" o:gfxdata="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" strokecolor="#c00000" strokeweight="1pt">
+                <v:stroke endarrow="open" joinstyle="miter"/>
+              </v:shape>
+            </w:pict>
+          </mc:Fallback>
+        </mc:AlternateContent>
+      </w:r>
+      <w:r>
+        <w:rPr>
+          <w:rFonts w:ascii="Times New Roman" w:eastAsia="Times New Roman" w:hAnsi="Times New Roman" w:cs="Times New Roman"/>
+          <w:b/>
+          <w:bCs/>
+          <w:noProof/>
+        </w:rPr>
+        <mc:AlternateContent>
+          <mc:Choice Requires="wps">
+            <w:drawing>
+              <wp:anchor distT="0" distB="0" distL="114300" distR="114300" simplePos="0" relativeHeight="251671552" behindDoc="0" locked="0" layoutInCell="1" allowOverlap="1" wp14:anchorId="7CBF1653" wp14:editId="6027E4CD">
+                <wp:simplePos x="0" y="0"/>
+                <wp:positionH relativeFrom="column">
+                  <wp:posOffset>656590</wp:posOffset>
+                </wp:positionH>
+                <wp:positionV relativeFrom="paragraph">
+                  <wp:posOffset>146050</wp:posOffset>
+                </wp:positionV>
+                <wp:extent cx="222250" cy="0"/>
+                <wp:effectExtent l="0" t="76200" r="25400" b="114300"/>
+                <wp:wrapNone/>
+                <wp:docPr id="81957720" name="Conector recto de flecha 7"/>
+                <wp:cNvGraphicFramePr/>
+                <a:graphic xmlns:a="http://schemas.openxmlformats.org/drawingml/2006/main">
+                  <a:graphicData uri="http://schemas.microsoft.com/office/word/2010/wordprocessingShape">
+                    <wps:wsp>
+                      <wps:cNvCnPr/>
+                      <wps:spPr>
+                        <a:xfrm flipV="1">
+                          <a:off x="0" y="0"/>
+                          <a:ext cx="222250" cy="0"/>
+                        </a:xfrm>
+                        <a:prstGeom prst="straightConnector1">
+                          <a:avLst/>
+                        </a:prstGeom>
+                        <a:ln>
+                          <a:solidFill>
+                            <a:srgbClr val="C00000"/>
+                          </a:solidFill>
+                          <a:headEnd type="none" w="med" len="med"/>
+                          <a:tailEnd type="arrow" w="med" len="med"/>
+                        </a:ln>
+                      </wps:spPr>
+                      <wps:style>
+                        <a:lnRef idx="1">
+                          <a:schemeClr val="dk1"/>
+                        </a:lnRef>
+                        <a:fillRef idx="0">
+                          <a:schemeClr val="dk1"/>
+                        </a:fillRef>
+                        <a:effectRef idx="0">
+                          <a:schemeClr val="dk1"/>
+                        </a:effectRef>
+                        <a:fontRef idx="minor">
+                          <a:schemeClr val="tx1"/>
+                        </a:fontRef>
+                      </wps:style>
+                      <wps:bodyPr/>
+                    </wps:wsp>
+                  </a:graphicData>
+                </a:graphic>
+                <wp14:sizeRelH relativeFrom="margin">
+                  <wp14:pctWidth>0</wp14:pctWidth>
+                </wp14:sizeRelH>
+                <wp14:sizeRelV relativeFrom="margin">
+                  <wp14:pctHeight>0</wp14:pctHeight>
+                </wp14:sizeRelV>
+              </wp:anchor>
+            </w:drawing>
+          </mc:Choice>
+          <mc:Fallback>
+            <w:pict>
+              <v:shape w14:anchorId="0CD01930" id="Conector recto de flecha 7" o:spid="_x0000_s1026" type="#_x0000_t32" style="position:absolute;margin-left:51.7pt;margin-top:11.5pt;width:17.5pt;height:0;flip:y;z-index:251671552;visibility:visible;mso-wrap-style:square;mso-width-percent:0;mso-height-percent:0;mso-wrap-distance-left:9pt;mso-wrap-distance-top:0;mso-wrap-distance-right:9pt;mso-wrap-distance-bottom:0;mso-position-horizontal:absolute;mso-position-horizontal-relative:text;mso-position-vertical:absolute;mso-position-vertical-relative:text;mso-width-percent:0;mso-height-percent:0;mso-width-relative:margin;mso-height-relative:margin" o:gfxdata="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" strokecolor="#c00000" strokeweight="1pt">
+                <v:stroke endarrow="open" joinstyle="miter"/>
+              </v:shape>
+            </w:pict>
+          </mc:Fallback>
+        </mc:AlternateContent>
+      </w:r>
+    </w:p>
+    <w:p>
+      <w:pPr>
+        <w:pStyle w:val="Prrafodelista"/>
+        <w:ind w:left="0"/>
+        <w:rPr>
+          <w:rFonts w:ascii="Times New Roman" w:eastAsia="Times New Roman" w:hAnsi="Times New Roman" w:cs="Times New Roman"/>
+          <w:b/>
+          <w:bCs/>
+        </w:rPr>
+      </w:pPr>
+      <w:r>
+        <w:rPr>
+          <w:rFonts w:ascii="Times New Roman" w:eastAsia="Times New Roman" w:hAnsi="Times New Roman" w:cs="Times New Roman"/>
+          <w:b/>
+          <w:bCs/>
+        </w:rPr>
+        <w:t xml:space="preserve"> </w:t>
+      </w:r>
+    </w:p>
+    <w:p>
+      <w:pPr>
+        <w:pStyle w:val="Prrafodelista"/>
+        <w:ind w:left="0"/>
+        <w:rPr>
+          <w:rFonts w:ascii="Times New Roman" w:eastAsia="Times New Roman" w:hAnsi="Times New Roman" w:cs="Times New Roman"/>
+        </w:rPr>
+      </w:pPr>
     </w:p>
     <w:sectPr>
       <w:pgSz w:w="12240" w:h="15840"/>
@@ -505,8 +3213,124 @@
       </w:rPr>
     </w:lvl>
   </w:abstractNum>
+  <w:abstractNum w:abstractNumId="1" w15:restartNumberingAfterBreak="0">
+    <w:nsid w:val="42F91347"/>
+    <w:multiLevelType w:val="hybridMultilevel"/>
+    <w:tmpl w:val="57C6AB5A"/>
+    <w:lvl w:ilvl="0" w:tplc="540A0001">
+      <w:start w:val="1"/>
+      <w:numFmt w:val="bullet"/>
+      <w:lvlText w:val=""/>
+      <w:lvlJc w:val="left"/>
+      <w:pPr>
+        <w:ind w:left="720" w:hanging="360"/>
+      </w:pPr>
+      <w:rPr>
+        <w:rFonts w:ascii="Symbol" w:hAnsi="Symbol" w:hint="default"/>
+      </w:rPr>
+    </w:lvl>
+    <w:lvl w:ilvl="1" w:tplc="540A0003" w:tentative="1">
+      <w:start w:val="1"/>
+      <w:numFmt w:val="bullet"/>
+      <w:lvlText w:val="o"/>
+      <w:lvlJc w:val="left"/>
+      <w:pPr>
+        <w:ind w:left="1440" w:hanging="360"/>
+      </w:pPr>
+      <w:rPr>
+        <w:rFonts w:ascii="Courier New" w:hAnsi="Courier New" w:cs="Courier New" w:hint="default"/>
+      </w:rPr>
+    </w:lvl>
+    <w:lvl w:ilvl="2" w:tplc="540A0005" w:tentative="1">
+      <w:start w:val="1"/>
+      <w:numFmt w:val="bullet"/>
+      <w:lvlText w:val=""/>
+      <w:lvlJc w:val="left"/>
+      <w:pPr>
+        <w:ind w:left="2160" w:hanging="360"/>
+      </w:pPr>
+      <w:rPr>
+        <w:rFonts w:ascii="Wingdings" w:hAnsi="Wingdings" w:hint="default"/>
+      </w:rPr>
+    </w:lvl>
+    <w:lvl w:ilvl="3" w:tplc="540A0001" w:tentative="1">
+      <w:start w:val="1"/>
+      <w:numFmt w:val="bullet"/>
+      <w:lvlText w:val=""/>
+      <w:lvlJc w:val="left"/>
+      <w:pPr>
+        <w:ind w:left="2880" w:hanging="360"/>
+      </w:pPr>
+      <w:rPr>
+        <w:rFonts w:ascii="Symbol" w:hAnsi="Symbol" w:hint="default"/>
+      </w:rPr>
+    </w:lvl>
+    <w:lvl w:ilvl="4" w:tplc="540A0003" w:tentative="1">
+      <w:start w:val="1"/>
+      <w:numFmt w:val="bullet"/>
+      <w:lvlText w:val="o"/>
+      <w:lvlJc w:val="left"/>
+      <w:pPr>
+        <w:ind w:left="3600" w:hanging="360"/>
+      </w:pPr>
+      <w:rPr>
+        <w:rFonts w:ascii="Courier New" w:hAnsi="Courier New" w:cs="Courier New" w:hint="default"/>
+      </w:rPr>
+    </w:lvl>
+    <w:lvl w:ilvl="5" w:tplc="540A0005" w:tentative="1">
+      <w:start w:val="1"/>
+      <w:numFmt w:val="bullet"/>
+      <w:lvlText w:val=""/>
+      <w:lvlJc w:val="left"/>
+      <w:pPr>
+        <w:ind w:left="4320" w:hanging="360"/>
+      </w:pPr>
+      <w:rPr>
+        <w:rFonts w:ascii="Wingdings" w:hAnsi="Wingdings" w:hint="default"/>
+      </w:rPr>
+    </w:lvl>
+    <w:lvl w:ilvl="6" w:tplc="540A0001" w:tentative="1">
+      <w:start w:val="1"/>
+      <w:numFmt w:val="bullet"/>
+      <w:lvlText w:val=""/>
+      <w:lvlJc w:val="left"/>
+      <w:pPr>
+        <w:ind w:left="5040" w:hanging="360"/>
+      </w:pPr>
+      <w:rPr>
+        <w:rFonts w:ascii="Symbol" w:hAnsi="Symbol" w:hint="default"/>
+      </w:rPr>
+    </w:lvl>
+    <w:lvl w:ilvl="7" w:tplc="540A0003" w:tentative="1">
+      <w:start w:val="1"/>
+      <w:numFmt w:val="bullet"/>
+      <w:lvlText w:val="o"/>
+      <w:lvlJc w:val="left"/>
+      <w:pPr>
+        <w:ind w:left="5760" w:hanging="360"/>
+      </w:pPr>
+      <w:rPr>
+        <w:rFonts w:ascii="Courier New" w:hAnsi="Courier New" w:cs="Courier New" w:hint="default"/>
+      </w:rPr>
+    </w:lvl>
+    <w:lvl w:ilvl="8" w:tplc="540A0005" w:tentative="1">
+      <w:start w:val="1"/>
+      <w:numFmt w:val="bullet"/>
+      <w:lvlText w:val=""/>
+      <w:lvlJc w:val="left"/>
+      <w:pPr>
+        <w:ind w:left="6480" w:hanging="360"/>
+      </w:pPr>
+      <w:rPr>
+        <w:rFonts w:ascii="Wingdings" w:hAnsi="Wingdings" w:hint="default"/>
+      </w:rPr>
+    </w:lvl>
+  </w:abstractNum>
   <w:num w:numId="1" w16cid:durableId="2072849751">
     <w:abstractNumId w:val="0"/>
+  </w:num>
+  <w:num w:numId="2" w16cid:durableId="871771764">
+    <w:abstractNumId w:val="1"/>
   </w:num>
 </w:numbering>
 </file>

</xml_diff>

<commit_message>
Fix typos in lexer comments and docstrings
Corrected several Spanish words in comments and docstrings in AnalizadorLexico to use 'lexico', 'caracter', and 'segun' instead of their accented forms for consistency.
</commit_message>
<xml_diff>
--- a/docs/HOOP.docx
+++ b/docs/HOOP.docx
@@ -790,15 +790,7 @@
           <w:b/>
           <w:bCs/>
         </w:rPr>
-        <w:t xml:space="preserve">2.1 </w:t>
-      </w:r>
-      <w:r>
-        <w:rPr>
-          <w:rFonts w:ascii="Times New Roman" w:eastAsia="Times New Roman" w:hAnsi="Times New Roman" w:cs="Times New Roman"/>
-          <w:b/>
-          <w:bCs/>
-        </w:rPr>
-        <w:t>Control de flujo</w:t>
+        <w:t>2.1 Control de flujo</w:t>
       </w:r>
     </w:p>
     <w:tbl>
@@ -1644,31 +1636,7 @@
           <w:b/>
           <w:bCs/>
         </w:rPr>
-        <w:t>2.2.</w:t>
-      </w:r>
-      <w:r>
-        <w:rPr>
-          <w:rFonts w:ascii="Times New Roman" w:eastAsia="Times New Roman" w:hAnsi="Times New Roman" w:cs="Times New Roman"/>
-          <w:b/>
-          <w:bCs/>
-        </w:rPr>
-        <w:t>4</w:t>
-      </w:r>
-      <w:r>
-        <w:rPr>
-          <w:rFonts w:ascii="Times New Roman" w:eastAsia="Times New Roman" w:hAnsi="Times New Roman" w:cs="Times New Roman"/>
-          <w:b/>
-          <w:bCs/>
-        </w:rPr>
-        <w:t xml:space="preserve"> </w:t>
-      </w:r>
-      <w:r>
-        <w:rPr>
-          <w:rFonts w:ascii="Times New Roman" w:eastAsia="Times New Roman" w:hAnsi="Times New Roman" w:cs="Times New Roman"/>
-          <w:b/>
-          <w:bCs/>
-        </w:rPr>
-        <w:t>Funciones</w:t>
+        <w:t>2.2.4 Funciones</w:t>
       </w:r>
     </w:p>
     <w:tbl>
@@ -1851,15 +1819,7 @@
           <w:b/>
           <w:bCs/>
         </w:rPr>
-        <w:t xml:space="preserve">2.2.5 </w:t>
-      </w:r>
-      <w:r>
-        <w:rPr>
-          <w:rFonts w:ascii="Times New Roman" w:eastAsia="Times New Roman" w:hAnsi="Times New Roman" w:cs="Times New Roman"/>
-          <w:b/>
-          <w:bCs/>
-        </w:rPr>
-        <w:t>Objetos / referencias</w:t>
+        <w:t>2.2.5 Objetos / referencias</w:t>
       </w:r>
     </w:p>
     <w:tbl>
@@ -2575,13 +2535,6 @@
           <w:bCs/>
         </w:rPr>
         <w:tab/>
-      </w:r>
-      <w:r>
-        <w:rPr>
-          <w:rFonts w:ascii="Times New Roman" w:eastAsia="Times New Roman" w:hAnsi="Times New Roman" w:cs="Times New Roman"/>
-          <w:b/>
-          <w:bCs/>
-        </w:rPr>
         <w:t>2.2.</w:t>
       </w:r>
       <w:r>
@@ -6097,64 +6050,13 @@
     </w:tbl>
     <w:p>
       <w:pPr>
-        <w:pStyle w:val="Prrafodelista"/>
-        <w:ind w:left="0"/>
-        <w:rPr>
-          <w:rFonts w:ascii="Times New Roman" w:eastAsia="Times New Roman" w:hAnsi="Times New Roman" w:cs="Times New Roman"/>
-          <w:b/>
-          <w:bCs/>
+        <w:rPr>
+          <w:rFonts w:ascii="Times New Roman" w:eastAsia="Times New Roman" w:hAnsi="Times New Roman" w:cs="Times New Roman"/>
         </w:rPr>
       </w:pPr>
     </w:p>
     <w:p>
       <w:pPr>
-        <w:pStyle w:val="Prrafodelista"/>
-        <w:ind w:left="360"/>
-        <w:rPr>
-          <w:rFonts w:ascii="Times New Roman" w:eastAsia="Times New Roman" w:hAnsi="Times New Roman" w:cs="Times New Roman"/>
-        </w:rPr>
-      </w:pPr>
-    </w:p>
-    <w:p>
-      <w:pPr>
-        <w:pStyle w:val="Prrafodelista"/>
-        <w:ind w:left="360"/>
-        <w:rPr>
-          <w:rFonts w:ascii="Times New Roman" w:eastAsia="Times New Roman" w:hAnsi="Times New Roman" w:cs="Times New Roman"/>
-        </w:rPr>
-      </w:pPr>
-    </w:p>
-    <w:p>
-      <w:pPr>
-        <w:pStyle w:val="Prrafodelista"/>
-        <w:ind w:left="360"/>
-        <w:rPr>
-          <w:rFonts w:ascii="Times New Roman" w:eastAsia="Times New Roman" w:hAnsi="Times New Roman" w:cs="Times New Roman"/>
-        </w:rPr>
-      </w:pPr>
-    </w:p>
-    <w:p>
-      <w:pPr>
-        <w:pStyle w:val="Prrafodelista"/>
-        <w:ind w:left="360"/>
-        <w:rPr>
-          <w:rFonts w:ascii="Times New Roman" w:eastAsia="Times New Roman" w:hAnsi="Times New Roman" w:cs="Times New Roman"/>
-        </w:rPr>
-      </w:pPr>
-    </w:p>
-    <w:p>
-      <w:pPr>
-        <w:pStyle w:val="Prrafodelista"/>
-        <w:ind w:left="360"/>
-        <w:rPr>
-          <w:rFonts w:ascii="Times New Roman" w:eastAsia="Times New Roman" w:hAnsi="Times New Roman" w:cs="Times New Roman"/>
-        </w:rPr>
-      </w:pPr>
-    </w:p>
-    <w:p>
-      <w:pPr>
-        <w:pStyle w:val="Prrafodelista"/>
-        <w:ind w:left="360"/>
         <w:rPr>
           <w:rFonts w:ascii="Times New Roman" w:eastAsia="Times New Roman" w:hAnsi="Times New Roman" w:cs="Times New Roman"/>
         </w:rPr>
@@ -6242,7 +6144,6 @@
         <w:ind w:left="0"/>
         <w:rPr>
           <w:rFonts w:ascii="Times New Roman" w:eastAsia="Times New Roman" w:hAnsi="Times New Roman" w:cs="Times New Roman"/>
-          <w:lang w:val="es-US"/>
         </w:rPr>
       </w:pPr>
       <w:r>
@@ -6317,66 +6218,7 @@
         <w:rPr>
           <w:rFonts w:ascii="Times New Roman" w:eastAsia="Times New Roman" w:hAnsi="Times New Roman" w:cs="Times New Roman"/>
         </w:rPr>
-        <w:t xml:space="preserve"> genera los tokens según corresponda con una estructura: TOKEN (&lt;</w:t>
-      </w:r>
-      <w:proofErr w:type="spellStart"/>
-      <w:r>
-        <w:rPr>
-          <w:rFonts w:ascii="Times New Roman" w:eastAsia="Times New Roman" w:hAnsi="Times New Roman" w:cs="Times New Roman"/>
-        </w:rPr>
-        <w:t>TokenType</w:t>
-      </w:r>
-      <w:proofErr w:type="spellEnd"/>
-      <w:r>
-        <w:rPr>
-          <w:rFonts w:ascii="Times New Roman" w:eastAsia="Times New Roman" w:hAnsi="Times New Roman" w:cs="Times New Roman"/>
-        </w:rPr>
-        <w:t>&gt;, &lt;</w:t>
-      </w:r>
-      <w:proofErr w:type="spellStart"/>
-      <w:r>
-        <w:rPr>
-          <w:rFonts w:ascii="Times New Roman" w:eastAsia="Times New Roman" w:hAnsi="Times New Roman" w:cs="Times New Roman"/>
-        </w:rPr>
-        <w:t>TokenContent</w:t>
-      </w:r>
-      <w:proofErr w:type="spellEnd"/>
-      <w:r>
-        <w:rPr>
-          <w:rFonts w:ascii="Times New Roman" w:eastAsia="Times New Roman" w:hAnsi="Times New Roman" w:cs="Times New Roman"/>
-        </w:rPr>
-        <w:t>&gt;, &lt;</w:t>
-      </w:r>
-      <w:proofErr w:type="spellStart"/>
-      <w:r>
-        <w:rPr>
-          <w:rFonts w:ascii="Times New Roman" w:eastAsia="Times New Roman" w:hAnsi="Times New Roman" w:cs="Times New Roman"/>
-        </w:rPr>
-        <w:t>TokenColumn</w:t>
-      </w:r>
-      <w:proofErr w:type="spellEnd"/>
-      <w:r>
-        <w:rPr>
-          <w:rFonts w:ascii="Times New Roman" w:eastAsia="Times New Roman" w:hAnsi="Times New Roman" w:cs="Times New Roman"/>
-        </w:rPr>
-        <w:t>&gt;, &lt;Token</w:t>
-      </w:r>
-      <w:r>
-        <w:t xml:space="preserve"> </w:t>
-      </w:r>
-      <w:proofErr w:type="spellStart"/>
-      <w:r>
-        <w:rPr>
-          <w:rFonts w:ascii="Times New Roman" w:eastAsia="Times New Roman" w:hAnsi="Times New Roman" w:cs="Times New Roman"/>
-        </w:rPr>
-        <w:t>Row</w:t>
-      </w:r>
-      <w:proofErr w:type="spellEnd"/>
-      <w:r>
-        <w:rPr>
-          <w:rFonts w:ascii="Times New Roman" w:eastAsia="Times New Roman" w:hAnsi="Times New Roman" w:cs="Times New Roman"/>
-        </w:rPr>
-        <w:t>&gt;)</w:t>
+        <w:t xml:space="preserve"> genera los tokens según corresponda con una estructura: </w:t>
       </w:r>
     </w:p>
     <w:p>
@@ -6385,8 +6227,87 @@
         <w:ind w:left="0"/>
         <w:rPr>
           <w:rFonts w:ascii="Times New Roman" w:eastAsia="Times New Roman" w:hAnsi="Times New Roman" w:cs="Times New Roman"/>
+          <w:lang w:val="en-US"/>
+        </w:rPr>
+      </w:pPr>
+      <w:r>
+        <w:rPr>
+          <w:rFonts w:ascii="Times New Roman" w:eastAsia="Times New Roman" w:hAnsi="Times New Roman" w:cs="Times New Roman"/>
+          <w:lang w:val="en-US"/>
+        </w:rPr>
+        <w:t>TOKEN (&lt;</w:t>
+      </w:r>
+      <w:proofErr w:type="spellStart"/>
+      <w:r>
+        <w:rPr>
+          <w:rFonts w:ascii="Times New Roman" w:eastAsia="Times New Roman" w:hAnsi="Times New Roman" w:cs="Times New Roman"/>
+          <w:lang w:val="en-US"/>
+        </w:rPr>
+        <w:t>TokenType</w:t>
+      </w:r>
+      <w:proofErr w:type="spellEnd"/>
+      <w:r>
+        <w:rPr>
+          <w:rFonts w:ascii="Times New Roman" w:eastAsia="Times New Roman" w:hAnsi="Times New Roman" w:cs="Times New Roman"/>
+          <w:lang w:val="en-US"/>
+        </w:rPr>
+        <w:t>&gt;, &lt;</w:t>
+      </w:r>
+      <w:proofErr w:type="spellStart"/>
+      <w:r>
+        <w:rPr>
+          <w:rFonts w:ascii="Times New Roman" w:eastAsia="Times New Roman" w:hAnsi="Times New Roman" w:cs="Times New Roman"/>
+          <w:lang w:val="en-US"/>
+        </w:rPr>
+        <w:t>TokenContent</w:t>
+      </w:r>
+      <w:proofErr w:type="spellEnd"/>
+      <w:r>
+        <w:rPr>
+          <w:rFonts w:ascii="Times New Roman" w:eastAsia="Times New Roman" w:hAnsi="Times New Roman" w:cs="Times New Roman"/>
+          <w:lang w:val="en-US"/>
+        </w:rPr>
+        <w:t>&gt;, &lt;</w:t>
+      </w:r>
+      <w:proofErr w:type="spellStart"/>
+      <w:r>
+        <w:rPr>
+          <w:rFonts w:ascii="Times New Roman" w:eastAsia="Times New Roman" w:hAnsi="Times New Roman" w:cs="Times New Roman"/>
+          <w:lang w:val="en-US"/>
+        </w:rPr>
+        <w:t>TokenColumn</w:t>
+      </w:r>
+      <w:proofErr w:type="spellEnd"/>
+      <w:r>
+        <w:rPr>
+          <w:rFonts w:ascii="Times New Roman" w:eastAsia="Times New Roman" w:hAnsi="Times New Roman" w:cs="Times New Roman"/>
+          <w:lang w:val="en-US"/>
+        </w:rPr>
+        <w:t>&gt;, &lt;Token</w:t>
+      </w:r>
+      <w:r>
+        <w:rPr>
+          <w:lang w:val="en-US"/>
+        </w:rPr>
+        <w:t xml:space="preserve"> </w:t>
+      </w:r>
+      <w:r>
+        <w:rPr>
+          <w:rFonts w:ascii="Times New Roman" w:eastAsia="Times New Roman" w:hAnsi="Times New Roman" w:cs="Times New Roman"/>
+          <w:lang w:val="en-US"/>
+        </w:rPr>
+        <w:t>Row&gt;)</w:t>
+      </w:r>
+    </w:p>
+    <w:p>
+      <w:pPr>
+        <w:pStyle w:val="Prrafodelista"/>
+        <w:ind w:left="0"/>
+        <w:rPr>
+          <w:rFonts w:ascii="Times New Roman" w:eastAsia="Times New Roman" w:hAnsi="Times New Roman" w:cs="Times New Roman"/>
           <w:b/>
           <w:bCs/>
+          <w:lang w:val="en-US"/>
         </w:rPr>
       </w:pPr>
     </w:p>
@@ -6398,6 +6319,7 @@
           <w:rFonts w:ascii="Times New Roman" w:eastAsia="Times New Roman" w:hAnsi="Times New Roman" w:cs="Times New Roman"/>
           <w:b/>
           <w:bCs/>
+          <w:lang w:val="en-US"/>
         </w:rPr>
       </w:pPr>
       <w:r>
@@ -8532,6 +8454,7 @@
           <w:rFonts w:ascii="Times New Roman" w:eastAsia="Times New Roman" w:hAnsi="Times New Roman" w:cs="Times New Roman"/>
           <w:b/>
           <w:bCs/>
+          <w:lang w:val="en-US"/>
         </w:rPr>
       </w:pPr>
     </w:p>
@@ -8543,6 +8466,7 @@
           <w:rFonts w:ascii="Times New Roman" w:eastAsia="Times New Roman" w:hAnsi="Times New Roman" w:cs="Times New Roman"/>
           <w:b/>
           <w:bCs/>
+          <w:lang w:val="en-US"/>
         </w:rPr>
       </w:pPr>
     </w:p>
@@ -8554,6 +8478,7 @@
           <w:rFonts w:ascii="Times New Roman" w:eastAsia="Times New Roman" w:hAnsi="Times New Roman" w:cs="Times New Roman"/>
           <w:b/>
           <w:bCs/>
+          <w:lang w:val="en-US"/>
         </w:rPr>
       </w:pPr>
       <w:r>
@@ -8885,6 +8810,7 @@
           <w:rFonts w:ascii="Times New Roman" w:eastAsia="Times New Roman" w:hAnsi="Times New Roman" w:cs="Times New Roman"/>
           <w:b/>
           <w:bCs/>
+          <w:lang w:val="en-US"/>
         </w:rPr>
       </w:pPr>
       <w:r>
@@ -8892,6 +8818,7 @@
           <w:rFonts w:ascii="Times New Roman" w:eastAsia="Times New Roman" w:hAnsi="Times New Roman" w:cs="Times New Roman"/>
           <w:b/>
           <w:bCs/>
+          <w:lang w:val="en-US"/>
         </w:rPr>
         <w:t xml:space="preserve"> </w:t>
       </w:r>
@@ -8902,6 +8829,1902 @@
         <w:ind w:left="0"/>
         <w:rPr>
           <w:rFonts w:ascii="Times New Roman" w:eastAsia="Times New Roman" w:hAnsi="Times New Roman" w:cs="Times New Roman"/>
+          <w:lang w:val="en-US"/>
+        </w:rPr>
+      </w:pPr>
+    </w:p>
+    <w:p>
+      <w:pPr>
+        <w:pStyle w:val="Prrafodelista"/>
+        <w:ind w:left="0"/>
+        <w:rPr>
+          <w:rFonts w:ascii="Times New Roman" w:eastAsia="Times New Roman" w:hAnsi="Times New Roman" w:cs="Times New Roman"/>
+          <w:lang w:val="en-US"/>
+        </w:rPr>
+      </w:pPr>
+      <w:r>
+        <w:rPr>
+          <w:rFonts w:ascii="Times New Roman" w:eastAsia="Times New Roman" w:hAnsi="Times New Roman" w:cs="Times New Roman"/>
+          <w:lang w:val="en-US"/>
+        </w:rPr>
+        <w:tab/>
+      </w:r>
+    </w:p>
+    <w:p>
+      <w:pPr>
+        <w:pStyle w:val="Prrafodelista"/>
+        <w:ind w:left="0" w:firstLine="708"/>
+        <w:rPr>
+          <w:rFonts w:ascii="Times New Roman" w:eastAsia="Times New Roman" w:hAnsi="Times New Roman" w:cs="Times New Roman"/>
+        </w:rPr>
+      </w:pPr>
+      <w:r>
+        <w:rPr>
+          <w:rFonts w:ascii="Times New Roman" w:eastAsia="Times New Roman" w:hAnsi="Times New Roman" w:cs="Times New Roman"/>
+          <w:b/>
+          <w:bCs/>
+        </w:rPr>
+        <w:t>3.2 Etapa análisis sintáctico</w:t>
+      </w:r>
+      <w:r>
+        <w:rPr>
+          <w:rFonts w:ascii="Times New Roman" w:eastAsia="Times New Roman" w:hAnsi="Times New Roman" w:cs="Times New Roman"/>
+        </w:rPr>
+        <w:t xml:space="preserve"> </w:t>
+      </w:r>
+    </w:p>
+    <w:p>
+      <w:pPr>
+        <w:pStyle w:val="Prrafodelista"/>
+        <w:ind w:left="0"/>
+        <w:rPr>
+          <w:rFonts w:ascii="Times New Roman" w:eastAsia="Times New Roman" w:hAnsi="Times New Roman" w:cs="Times New Roman"/>
+        </w:rPr>
+      </w:pPr>
+      <w:r>
+        <w:rPr>
+          <w:rFonts w:ascii="Times New Roman" w:eastAsia="Times New Roman" w:hAnsi="Times New Roman" w:cs="Times New Roman"/>
+        </w:rPr>
+        <w:t xml:space="preserve">Para HOOP se diseñó un </w:t>
+      </w:r>
+      <w:proofErr w:type="spellStart"/>
+      <w:r>
+        <w:rPr>
+          <w:rFonts w:ascii="Times New Roman" w:eastAsia="Times New Roman" w:hAnsi="Times New Roman" w:cs="Times New Roman"/>
+        </w:rPr>
+        <w:t>parser</w:t>
+      </w:r>
+      <w:proofErr w:type="spellEnd"/>
+      <w:r>
+        <w:rPr>
+          <w:rFonts w:ascii="Times New Roman" w:eastAsia="Times New Roman" w:hAnsi="Times New Roman" w:cs="Times New Roman"/>
+        </w:rPr>
+        <w:t xml:space="preserve"> estilo </w:t>
+      </w:r>
+      <w:r>
+        <w:rPr>
+          <w:rFonts w:ascii="Times New Roman" w:eastAsia="Times New Roman" w:hAnsi="Times New Roman" w:cs="Times New Roman"/>
+          <w:b/>
+          <w:bCs/>
+        </w:rPr>
+        <w:t>YACC</w:t>
+      </w:r>
+      <w:r>
+        <w:rPr>
+          <w:rFonts w:ascii="Times New Roman" w:eastAsia="Times New Roman" w:hAnsi="Times New Roman" w:cs="Times New Roman"/>
+        </w:rPr>
+        <w:t xml:space="preserve"> (</w:t>
+      </w:r>
+      <w:proofErr w:type="spellStart"/>
+      <w:r>
+        <w:rPr>
+          <w:rFonts w:ascii="Times New Roman" w:eastAsia="Times New Roman" w:hAnsi="Times New Roman" w:cs="Times New Roman"/>
+        </w:rPr>
+        <w:t>Yet</w:t>
+      </w:r>
+      <w:proofErr w:type="spellEnd"/>
+      <w:r>
+        <w:rPr>
+          <w:rFonts w:ascii="Times New Roman" w:eastAsia="Times New Roman" w:hAnsi="Times New Roman" w:cs="Times New Roman"/>
+        </w:rPr>
+        <w:t xml:space="preserve"> </w:t>
+      </w:r>
+      <w:proofErr w:type="spellStart"/>
+      <w:r>
+        <w:rPr>
+          <w:rFonts w:ascii="Times New Roman" w:eastAsia="Times New Roman" w:hAnsi="Times New Roman" w:cs="Times New Roman"/>
+        </w:rPr>
+        <w:t>Another</w:t>
+      </w:r>
+      <w:proofErr w:type="spellEnd"/>
+      <w:r>
+        <w:rPr>
+          <w:rFonts w:ascii="Times New Roman" w:eastAsia="Times New Roman" w:hAnsi="Times New Roman" w:cs="Times New Roman"/>
+        </w:rPr>
+        <w:t xml:space="preserve"> </w:t>
+      </w:r>
+      <w:proofErr w:type="spellStart"/>
+      <w:r>
+        <w:rPr>
+          <w:rFonts w:ascii="Times New Roman" w:eastAsia="Times New Roman" w:hAnsi="Times New Roman" w:cs="Times New Roman"/>
+        </w:rPr>
+        <w:t>Compiler</w:t>
+      </w:r>
+      <w:proofErr w:type="spellEnd"/>
+      <w:r>
+        <w:rPr>
+          <w:rFonts w:ascii="Times New Roman" w:eastAsia="Times New Roman" w:hAnsi="Times New Roman" w:cs="Times New Roman"/>
+        </w:rPr>
+        <w:t xml:space="preserve"> </w:t>
+      </w:r>
+      <w:proofErr w:type="spellStart"/>
+      <w:r>
+        <w:rPr>
+          <w:rFonts w:ascii="Times New Roman" w:eastAsia="Times New Roman" w:hAnsi="Times New Roman" w:cs="Times New Roman"/>
+        </w:rPr>
+        <w:t>Compiler</w:t>
+      </w:r>
+      <w:proofErr w:type="spellEnd"/>
+      <w:r>
+        <w:rPr>
+          <w:rFonts w:ascii="Times New Roman" w:eastAsia="Times New Roman" w:hAnsi="Times New Roman" w:cs="Times New Roman"/>
+        </w:rPr>
+        <w:t xml:space="preserve">). Este </w:t>
+      </w:r>
+      <w:proofErr w:type="spellStart"/>
+      <w:r>
+        <w:rPr>
+          <w:rFonts w:ascii="Times New Roman" w:eastAsia="Times New Roman" w:hAnsi="Times New Roman" w:cs="Times New Roman"/>
+        </w:rPr>
+        <w:t>parser</w:t>
+      </w:r>
+      <w:proofErr w:type="spellEnd"/>
+      <w:r>
+        <w:rPr>
+          <w:rFonts w:ascii="Times New Roman" w:eastAsia="Times New Roman" w:hAnsi="Times New Roman" w:cs="Times New Roman"/>
+        </w:rPr>
+        <w:t xml:space="preserve"> analiza la secuencia de tokens generados por el leer mencionado en el paso anterior, y los utiliza para construir un </w:t>
+      </w:r>
+      <w:proofErr w:type="spellStart"/>
+      <w:r>
+        <w:rPr>
+          <w:rFonts w:ascii="Times New Roman" w:eastAsia="Times New Roman" w:hAnsi="Times New Roman" w:cs="Times New Roman"/>
+          <w:b/>
+          <w:bCs/>
+        </w:rPr>
+        <w:t>Arbol</w:t>
+      </w:r>
+      <w:proofErr w:type="spellEnd"/>
+      <w:r>
+        <w:rPr>
+          <w:rFonts w:ascii="Times New Roman" w:eastAsia="Times New Roman" w:hAnsi="Times New Roman" w:cs="Times New Roman"/>
+          <w:b/>
+          <w:bCs/>
+        </w:rPr>
+        <w:t xml:space="preserve"> de</w:t>
+      </w:r>
+      <w:r>
+        <w:rPr>
+          <w:rFonts w:ascii="Times New Roman" w:eastAsia="Times New Roman" w:hAnsi="Times New Roman" w:cs="Times New Roman"/>
+        </w:rPr>
+        <w:t xml:space="preserve"> </w:t>
+      </w:r>
+      <w:r>
+        <w:rPr>
+          <w:rFonts w:ascii="Times New Roman" w:eastAsia="Times New Roman" w:hAnsi="Times New Roman" w:cs="Times New Roman"/>
+          <w:b/>
+          <w:bCs/>
+        </w:rPr>
+        <w:t>Sintaxis Abstracta (AST)</w:t>
+      </w:r>
+      <w:r>
+        <w:rPr>
+          <w:rFonts w:ascii="Times New Roman" w:eastAsia="Times New Roman" w:hAnsi="Times New Roman" w:cs="Times New Roman"/>
+        </w:rPr>
+        <w:t xml:space="preserve"> o detectar errores sintácticos. No usa librerías externas; todo es implementado manual. Este </w:t>
+      </w:r>
+      <w:proofErr w:type="spellStart"/>
+      <w:r>
+        <w:rPr>
+          <w:rFonts w:ascii="Times New Roman" w:eastAsia="Times New Roman" w:hAnsi="Times New Roman" w:cs="Times New Roman"/>
+        </w:rPr>
+        <w:t>parser</w:t>
+      </w:r>
+      <w:proofErr w:type="spellEnd"/>
+      <w:r>
+        <w:rPr>
+          <w:rFonts w:ascii="Times New Roman" w:eastAsia="Times New Roman" w:hAnsi="Times New Roman" w:cs="Times New Roman"/>
+        </w:rPr>
+        <w:t xml:space="preserve"> importa listas del le</w:t>
+      </w:r>
+      <w:r>
+        <w:rPr>
+          <w:rFonts w:ascii="Times New Roman" w:eastAsia="Times New Roman" w:hAnsi="Times New Roman" w:cs="Times New Roman"/>
+        </w:rPr>
+        <w:t>x</w:t>
+      </w:r>
+      <w:r>
+        <w:rPr>
+          <w:rFonts w:ascii="Times New Roman" w:eastAsia="Times New Roman" w:hAnsi="Times New Roman" w:cs="Times New Roman"/>
+        </w:rPr>
+        <w:t>er como RESERVADAS (</w:t>
+      </w:r>
+      <w:proofErr w:type="spellStart"/>
+      <w:r>
+        <w:rPr>
+          <w:rFonts w:ascii="Times New Roman" w:eastAsia="Times New Roman" w:hAnsi="Times New Roman" w:cs="Times New Roman"/>
+        </w:rPr>
+        <w:t>mold</w:t>
+      </w:r>
+      <w:proofErr w:type="spellEnd"/>
+      <w:r>
+        <w:rPr>
+          <w:rFonts w:ascii="Times New Roman" w:eastAsia="Times New Roman" w:hAnsi="Times New Roman" w:cs="Times New Roman"/>
+        </w:rPr>
+        <w:t xml:space="preserve">, </w:t>
+      </w:r>
+      <w:proofErr w:type="spellStart"/>
+      <w:r>
+        <w:rPr>
+          <w:rFonts w:ascii="Times New Roman" w:eastAsia="Times New Roman" w:hAnsi="Times New Roman" w:cs="Times New Roman"/>
+        </w:rPr>
+        <w:t>when</w:t>
+      </w:r>
+      <w:proofErr w:type="spellEnd"/>
+      <w:r>
+        <w:rPr>
+          <w:rFonts w:ascii="Times New Roman" w:eastAsia="Times New Roman" w:hAnsi="Times New Roman" w:cs="Times New Roman"/>
+        </w:rPr>
+        <w:t xml:space="preserve">, </w:t>
+      </w:r>
+      <w:proofErr w:type="spellStart"/>
+      <w:r>
+        <w:rPr>
+          <w:rFonts w:ascii="Times New Roman" w:eastAsia="Times New Roman" w:hAnsi="Times New Roman" w:cs="Times New Roman"/>
+        </w:rPr>
+        <w:t>cycle</w:t>
+      </w:r>
+      <w:proofErr w:type="spellEnd"/>
+      <w:r>
+        <w:rPr>
+          <w:rFonts w:ascii="Times New Roman" w:eastAsia="Times New Roman" w:hAnsi="Times New Roman" w:cs="Times New Roman"/>
+        </w:rPr>
+        <w:t>…</w:t>
+      </w:r>
+      <w:r>
+        <w:rPr>
+          <w:rFonts w:ascii="Times New Roman" w:eastAsia="Times New Roman" w:hAnsi="Times New Roman" w:cs="Times New Roman"/>
+        </w:rPr>
+        <w:t>), T</w:t>
+      </w:r>
+      <w:r>
+        <w:rPr>
+          <w:rFonts w:ascii="Times New Roman" w:eastAsia="Times New Roman" w:hAnsi="Times New Roman" w:cs="Times New Roman"/>
+        </w:rPr>
+        <w:t>IPOS</w:t>
+      </w:r>
+      <w:r>
+        <w:rPr>
+          <w:rFonts w:ascii="Times New Roman" w:eastAsia="Times New Roman" w:hAnsi="Times New Roman" w:cs="Times New Roman"/>
+        </w:rPr>
+        <w:t>(</w:t>
+      </w:r>
+      <w:proofErr w:type="spellStart"/>
+      <w:r>
+        <w:rPr>
+          <w:rFonts w:ascii="Times New Roman" w:eastAsia="Times New Roman" w:hAnsi="Times New Roman" w:cs="Times New Roman"/>
+        </w:rPr>
+        <w:t>whole</w:t>
+      </w:r>
+      <w:proofErr w:type="spellEnd"/>
+      <w:r>
+        <w:rPr>
+          <w:rFonts w:ascii="Times New Roman" w:eastAsia="Times New Roman" w:hAnsi="Times New Roman" w:cs="Times New Roman"/>
+        </w:rPr>
+        <w:t xml:space="preserve">, </w:t>
+      </w:r>
+      <w:proofErr w:type="spellStart"/>
+      <w:r>
+        <w:rPr>
+          <w:rFonts w:ascii="Times New Roman" w:eastAsia="Times New Roman" w:hAnsi="Times New Roman" w:cs="Times New Roman"/>
+        </w:rPr>
+        <w:t>fract</w:t>
+      </w:r>
+      <w:proofErr w:type="spellEnd"/>
+      <w:r>
+        <w:rPr>
+          <w:rFonts w:ascii="Times New Roman" w:eastAsia="Times New Roman" w:hAnsi="Times New Roman" w:cs="Times New Roman"/>
+        </w:rPr>
+        <w:t xml:space="preserve">, </w:t>
+      </w:r>
+      <w:proofErr w:type="spellStart"/>
+      <w:r>
+        <w:rPr>
+          <w:rFonts w:ascii="Times New Roman" w:eastAsia="Times New Roman" w:hAnsi="Times New Roman" w:cs="Times New Roman"/>
+        </w:rPr>
+        <w:t>logic</w:t>
+      </w:r>
+      <w:proofErr w:type="spellEnd"/>
+      <w:r>
+        <w:rPr>
+          <w:rFonts w:ascii="Times New Roman" w:eastAsia="Times New Roman" w:hAnsi="Times New Roman" w:cs="Times New Roman"/>
+        </w:rPr>
+        <w:t>…)</w:t>
+      </w:r>
+      <w:r>
+        <w:rPr>
+          <w:rFonts w:ascii="Times New Roman" w:eastAsia="Times New Roman" w:hAnsi="Times New Roman" w:cs="Times New Roman"/>
+        </w:rPr>
+        <w:t xml:space="preserve"> </w:t>
+      </w:r>
+      <w:r>
+        <w:rPr>
+          <w:rFonts w:ascii="Times New Roman" w:eastAsia="Times New Roman" w:hAnsi="Times New Roman" w:cs="Times New Roman"/>
+        </w:rPr>
+        <w:t>OPERADORES_PALABRAS</w:t>
+      </w:r>
+      <w:r>
+        <w:rPr>
+          <w:rFonts w:ascii="Times New Roman" w:eastAsia="Times New Roman" w:hAnsi="Times New Roman" w:cs="Times New Roman"/>
+        </w:rPr>
+        <w:t xml:space="preserve"> (set, plus, </w:t>
+      </w:r>
+      <w:proofErr w:type="spellStart"/>
+      <w:r>
+        <w:rPr>
+          <w:rFonts w:ascii="Times New Roman" w:eastAsia="Times New Roman" w:hAnsi="Times New Roman" w:cs="Times New Roman"/>
+        </w:rPr>
+        <w:t>minus</w:t>
+      </w:r>
+      <w:proofErr w:type="spellEnd"/>
+      <w:r>
+        <w:rPr>
+          <w:rFonts w:ascii="Times New Roman" w:eastAsia="Times New Roman" w:hAnsi="Times New Roman" w:cs="Times New Roman"/>
+        </w:rPr>
+        <w:t>…) y PALABRAS_</w:t>
+      </w:r>
+      <w:r>
+        <w:rPr>
+          <w:rFonts w:ascii="Times New Roman" w:eastAsia="Times New Roman" w:hAnsi="Times New Roman" w:cs="Times New Roman"/>
+        </w:rPr>
+        <w:t xml:space="preserve">PREGONADAS </w:t>
+      </w:r>
+      <w:r>
+        <w:rPr>
+          <w:rFonts w:ascii="Times New Roman" w:eastAsia="Times New Roman" w:hAnsi="Times New Roman" w:cs="Times New Roman"/>
+        </w:rPr>
+        <w:lastRenderedPageBreak/>
+        <w:t>(</w:t>
+      </w:r>
+      <w:proofErr w:type="spellStart"/>
+      <w:r>
+        <w:rPr>
+          <w:rFonts w:ascii="Times New Roman" w:eastAsia="Times New Roman" w:hAnsi="Times New Roman" w:cs="Times New Roman"/>
+        </w:rPr>
+        <w:t>length</w:t>
+      </w:r>
+      <w:proofErr w:type="spellEnd"/>
+      <w:r>
+        <w:rPr>
+          <w:rFonts w:ascii="Times New Roman" w:eastAsia="Times New Roman" w:hAnsi="Times New Roman" w:cs="Times New Roman"/>
+        </w:rPr>
+        <w:t xml:space="preserve">, </w:t>
+      </w:r>
+      <w:proofErr w:type="spellStart"/>
+      <w:r>
+        <w:rPr>
+          <w:rFonts w:ascii="Times New Roman" w:eastAsia="Times New Roman" w:hAnsi="Times New Roman" w:cs="Times New Roman"/>
+        </w:rPr>
+        <w:t>size</w:t>
+      </w:r>
+      <w:proofErr w:type="spellEnd"/>
+      <w:r>
+        <w:rPr>
+          <w:rFonts w:ascii="Times New Roman" w:eastAsia="Times New Roman" w:hAnsi="Times New Roman" w:cs="Times New Roman"/>
+        </w:rPr>
+        <w:t xml:space="preserve">, </w:t>
+      </w:r>
+      <w:proofErr w:type="spellStart"/>
+      <w:r>
+        <w:rPr>
+          <w:rFonts w:ascii="Times New Roman" w:eastAsia="Times New Roman" w:hAnsi="Times New Roman" w:cs="Times New Roman"/>
+        </w:rPr>
+        <w:t>type</w:t>
+      </w:r>
+      <w:proofErr w:type="spellEnd"/>
+      <w:r>
+        <w:rPr>
+          <w:rFonts w:ascii="Times New Roman" w:eastAsia="Times New Roman" w:hAnsi="Times New Roman" w:cs="Times New Roman"/>
+        </w:rPr>
+        <w:t xml:space="preserve">…). </w:t>
+      </w:r>
+      <w:r>
+        <w:rPr>
+          <w:rFonts w:ascii="Times New Roman" w:eastAsia="Times New Roman" w:hAnsi="Times New Roman" w:cs="Times New Roman"/>
+        </w:rPr>
+        <w:t xml:space="preserve">Estas se utilizan para validación y sugerencia de corrección. Como sabemos el lexer produce una lista de tokens anteriormente vista en la etapa anterior, el </w:t>
+      </w:r>
+      <w:proofErr w:type="spellStart"/>
+      <w:r>
+        <w:rPr>
+          <w:rFonts w:ascii="Times New Roman" w:eastAsia="Times New Roman" w:hAnsi="Times New Roman" w:cs="Times New Roman"/>
+        </w:rPr>
+        <w:t>parser</w:t>
+      </w:r>
+      <w:proofErr w:type="spellEnd"/>
+      <w:r>
+        <w:rPr>
+          <w:rFonts w:ascii="Times New Roman" w:eastAsia="Times New Roman" w:hAnsi="Times New Roman" w:cs="Times New Roman"/>
+        </w:rPr>
+        <w:t xml:space="preserve"> recibe esta lista y la procesa secuencialmente, avanzando posición por posición sobre cada uno de los tokens entregados, si hay errores léxicos, el lexer los reporta inicialmente, pero el </w:t>
+      </w:r>
+      <w:proofErr w:type="spellStart"/>
+      <w:r>
+        <w:rPr>
+          <w:rFonts w:ascii="Times New Roman" w:eastAsia="Times New Roman" w:hAnsi="Times New Roman" w:cs="Times New Roman"/>
+        </w:rPr>
+        <w:t>parser</w:t>
+      </w:r>
+      <w:proofErr w:type="spellEnd"/>
+      <w:r>
+        <w:rPr>
+          <w:rFonts w:ascii="Times New Roman" w:eastAsia="Times New Roman" w:hAnsi="Times New Roman" w:cs="Times New Roman"/>
+        </w:rPr>
+        <w:t xml:space="preserve"> asume tokens únicamente validos y se enfoca en revisar errores sintácticos sobre ellos (alguna secuencia incorrecta, o estructura mal redactada). </w:t>
+      </w:r>
+      <w:r>
+        <w:rPr>
+          <w:rFonts w:ascii="Times New Roman" w:eastAsia="Times New Roman" w:hAnsi="Times New Roman" w:cs="Times New Roman"/>
+        </w:rPr>
+        <w:t>Lo hace basándose en si el token actual coincide con el tipo de token que fue declarado</w:t>
+      </w:r>
+      <w:r>
+        <w:rPr>
+          <w:rFonts w:ascii="Times New Roman" w:eastAsia="Times New Roman" w:hAnsi="Times New Roman" w:cs="Times New Roman"/>
+        </w:rPr>
+        <w:t xml:space="preserve"> y con el valor si es necesario </w:t>
+      </w:r>
+      <w:r>
+        <w:rPr>
+          <w:rFonts w:ascii="Times New Roman" w:eastAsia="Times New Roman" w:hAnsi="Times New Roman" w:cs="Times New Roman"/>
+          <w:b/>
+          <w:bCs/>
+        </w:rPr>
+        <w:t>(</w:t>
+      </w:r>
+      <w:r>
+        <w:rPr>
+          <w:rFonts w:ascii="Times New Roman" w:eastAsia="Times New Roman" w:hAnsi="Times New Roman" w:cs="Times New Roman"/>
+          <w:b/>
+          <w:bCs/>
+        </w:rPr>
+        <w:t>e</w:t>
+      </w:r>
+      <w:r>
+        <w:rPr>
+          <w:rFonts w:ascii="Times New Roman" w:eastAsia="Times New Roman" w:hAnsi="Times New Roman" w:cs="Times New Roman"/>
+          <w:b/>
+          <w:bCs/>
+        </w:rPr>
+        <w:t xml:space="preserve">s decir hay tokens donde mi valor realmente no importan al </w:t>
+      </w:r>
+      <w:proofErr w:type="spellStart"/>
+      <w:r>
+        <w:rPr>
+          <w:rFonts w:ascii="Times New Roman" w:eastAsia="Times New Roman" w:hAnsi="Times New Roman" w:cs="Times New Roman"/>
+          <w:b/>
+          <w:bCs/>
+        </w:rPr>
+        <w:t>parser</w:t>
+      </w:r>
+      <w:proofErr w:type="spellEnd"/>
+      <w:r>
+        <w:rPr>
+          <w:rFonts w:ascii="Times New Roman" w:eastAsia="Times New Roman" w:hAnsi="Times New Roman" w:cs="Times New Roman"/>
+          <w:b/>
+          <w:bCs/>
+        </w:rPr>
+        <w:t xml:space="preserve"> como el valor de un IDENTIFIER, pero si es importante conocer el valor de un token marcado como KEYWORD para detectar precisamente cuál será su estructura buscada)</w:t>
+      </w:r>
+      <w:r>
+        <w:rPr>
+          <w:rFonts w:ascii="Times New Roman" w:eastAsia="Times New Roman" w:hAnsi="Times New Roman" w:cs="Times New Roman"/>
+          <w:b/>
+          <w:bCs/>
+        </w:rPr>
+        <w:t>,</w:t>
+      </w:r>
+      <w:r>
+        <w:rPr>
+          <w:rFonts w:ascii="Times New Roman" w:eastAsia="Times New Roman" w:hAnsi="Times New Roman" w:cs="Times New Roman"/>
+        </w:rPr>
+        <w:t xml:space="preserve"> si no es así entonces registra un error (esperado vs encontrado), si el token es correcto entonces avanza. </w:t>
+      </w:r>
+    </w:p>
+    <w:p>
+      <w:pPr>
+        <w:pStyle w:val="Prrafodelista"/>
+        <w:ind w:left="0"/>
+        <w:rPr>
+          <w:rFonts w:ascii="Times New Roman" w:eastAsia="Times New Roman" w:hAnsi="Times New Roman" w:cs="Times New Roman"/>
+        </w:rPr>
+      </w:pPr>
+    </w:p>
+    <w:p>
+      <w:pPr>
+        <w:pStyle w:val="Prrafodelista"/>
+        <w:ind w:left="0" w:firstLine="708"/>
+        <w:rPr>
+          <w:rFonts w:ascii="Times New Roman" w:eastAsia="Times New Roman" w:hAnsi="Times New Roman" w:cs="Times New Roman"/>
+          <w:b/>
+          <w:bCs/>
+        </w:rPr>
+      </w:pPr>
+      <w:r>
+        <w:rPr>
+          <w:rFonts w:ascii="Times New Roman" w:eastAsia="Times New Roman" w:hAnsi="Times New Roman" w:cs="Times New Roman"/>
+          <w:b/>
+          <w:bCs/>
+        </w:rPr>
+        <w:t xml:space="preserve">3.3 </w:t>
+      </w:r>
+      <w:r>
+        <w:rPr>
+          <w:rFonts w:ascii="Times New Roman" w:eastAsia="Times New Roman" w:hAnsi="Times New Roman" w:cs="Times New Roman"/>
+          <w:b/>
+          <w:bCs/>
+        </w:rPr>
+        <w:t>Declaraciones BNF de HOOP</w:t>
+      </w:r>
+    </w:p>
+    <w:tbl>
+      <w:tblPr>
+        <w:tblStyle w:val="Tablaconcuadrcula"/>
+        <w:tblpPr w:leftFromText="141" w:rightFromText="141" w:vertAnchor="text" w:horzAnchor="margin" w:tblpX="-714" w:tblpY="436"/>
+        <w:tblW w:w="10632" w:type="dxa"/>
+        <w:tblLook w:val="04A0" w:firstRow="1" w:lastRow="0" w:firstColumn="1" w:lastColumn="0" w:noHBand="0" w:noVBand="1"/>
+      </w:tblPr>
+      <w:tblGrid>
+        <w:gridCol w:w="10632"/>
+      </w:tblGrid>
+      <w:tr>
+        <w:trPr>
+          <w:trHeight w:val="558"/>
+        </w:trPr>
+        <w:tc>
+          <w:tcPr>
+            <w:tcW w:w="10632" w:type="dxa"/>
+            <w:vAlign w:val="center"/>
+          </w:tcPr>
+          <w:p>
+            <w:pPr>
+              <w:pStyle w:val="Prrafodelista"/>
+              <w:ind w:left="0"/>
+              <w:rPr>
+                <w:rFonts w:ascii="Courier New" w:eastAsia="Times New Roman" w:hAnsi="Courier New" w:cs="Courier New"/>
+                <w:sz w:val="22"/>
+                <w:szCs w:val="22"/>
+              </w:rPr>
+            </w:pPr>
+            <w:r>
+              <w:rPr>
+                <w:rFonts w:ascii="Courier New" w:eastAsia="Times New Roman" w:hAnsi="Courier New" w:cs="Courier New"/>
+                <w:sz w:val="22"/>
+                <w:szCs w:val="22"/>
+              </w:rPr>
+              <w:t>&lt;programa&gt; ::= (&lt;</w:t>
+            </w:r>
+            <w:proofErr w:type="spellStart"/>
+            <w:r>
+              <w:rPr>
+                <w:rFonts w:ascii="Courier New" w:eastAsia="Times New Roman" w:hAnsi="Courier New" w:cs="Courier New"/>
+                <w:sz w:val="22"/>
+                <w:szCs w:val="22"/>
+              </w:rPr>
+              <w:t>declaracion</w:t>
+            </w:r>
+            <w:proofErr w:type="spellEnd"/>
+            <w:r>
+              <w:rPr>
+                <w:rFonts w:ascii="Courier New" w:eastAsia="Times New Roman" w:hAnsi="Courier New" w:cs="Courier New"/>
+                <w:sz w:val="22"/>
+                <w:szCs w:val="22"/>
+              </w:rPr>
+              <w:t>&gt; | &lt;clase&gt; | &lt;</w:t>
+            </w:r>
+            <w:proofErr w:type="spellStart"/>
+            <w:r>
+              <w:rPr>
+                <w:rFonts w:ascii="Courier New" w:eastAsia="Times New Roman" w:hAnsi="Courier New" w:cs="Courier New"/>
+                <w:sz w:val="22"/>
+                <w:szCs w:val="22"/>
+              </w:rPr>
+              <w:t>funcion</w:t>
+            </w:r>
+            <w:proofErr w:type="spellEnd"/>
+            <w:r>
+              <w:rPr>
+                <w:rFonts w:ascii="Courier New" w:eastAsia="Times New Roman" w:hAnsi="Courier New" w:cs="Courier New"/>
+                <w:sz w:val="22"/>
+                <w:szCs w:val="22"/>
+              </w:rPr>
+              <w:t>&gt; | &lt;</w:t>
+            </w:r>
+            <w:proofErr w:type="spellStart"/>
+            <w:r>
+              <w:rPr>
+                <w:rFonts w:ascii="Courier New" w:eastAsia="Times New Roman" w:hAnsi="Courier New" w:cs="Courier New"/>
+                <w:sz w:val="22"/>
+                <w:szCs w:val="22"/>
+              </w:rPr>
+              <w:t>statement</w:t>
+            </w:r>
+            <w:proofErr w:type="spellEnd"/>
+            <w:r>
+              <w:rPr>
+                <w:rFonts w:ascii="Courier New" w:eastAsia="Times New Roman" w:hAnsi="Courier New" w:cs="Courier New"/>
+                <w:sz w:val="22"/>
+                <w:szCs w:val="22"/>
+              </w:rPr>
+              <w:t>&gt;)* &lt;EOF&gt;</w:t>
+            </w:r>
+          </w:p>
+        </w:tc>
+      </w:tr>
+      <w:tr>
+        <w:trPr>
+          <w:trHeight w:val="554"/>
+        </w:trPr>
+        <w:tc>
+          <w:tcPr>
+            <w:tcW w:w="10632" w:type="dxa"/>
+            <w:vAlign w:val="center"/>
+          </w:tcPr>
+          <w:p>
+            <w:pPr>
+              <w:pStyle w:val="Prrafodelista"/>
+              <w:ind w:left="0"/>
+              <w:rPr>
+                <w:rFonts w:ascii="Courier New" w:eastAsia="Times New Roman" w:hAnsi="Courier New" w:cs="Courier New"/>
+                <w:sz w:val="22"/>
+                <w:szCs w:val="22"/>
+              </w:rPr>
+            </w:pPr>
+            <w:r>
+              <w:rPr>
+                <w:rFonts w:ascii="Courier New" w:eastAsia="Times New Roman" w:hAnsi="Courier New" w:cs="Courier New"/>
+                <w:sz w:val="22"/>
+                <w:szCs w:val="22"/>
+              </w:rPr>
+              <w:t>&lt;</w:t>
+            </w:r>
+            <w:proofErr w:type="spellStart"/>
+            <w:r>
+              <w:rPr>
+                <w:rFonts w:ascii="Courier New" w:eastAsia="Times New Roman" w:hAnsi="Courier New" w:cs="Courier New"/>
+                <w:sz w:val="22"/>
+                <w:szCs w:val="22"/>
+              </w:rPr>
+              <w:t>declaracion</w:t>
+            </w:r>
+            <w:proofErr w:type="spellEnd"/>
+            <w:r>
+              <w:rPr>
+                <w:rFonts w:ascii="Courier New" w:eastAsia="Times New Roman" w:hAnsi="Courier New" w:cs="Courier New"/>
+                <w:sz w:val="22"/>
+                <w:szCs w:val="22"/>
+              </w:rPr>
+              <w:t>&gt; ::= "data" &lt;IDENTIFIER&gt; "set" &lt;</w:t>
+            </w:r>
+            <w:proofErr w:type="spellStart"/>
+            <w:r>
+              <w:rPr>
+                <w:rFonts w:ascii="Courier New" w:eastAsia="Times New Roman" w:hAnsi="Courier New" w:cs="Courier New"/>
+                <w:sz w:val="22"/>
+                <w:szCs w:val="22"/>
+              </w:rPr>
+              <w:t>expresion</w:t>
+            </w:r>
+            <w:proofErr w:type="spellEnd"/>
+            <w:r>
+              <w:rPr>
+                <w:rFonts w:ascii="Courier New" w:eastAsia="Times New Roman" w:hAnsi="Courier New" w:cs="Courier New"/>
+                <w:sz w:val="22"/>
+                <w:szCs w:val="22"/>
+              </w:rPr>
+              <w:t>&gt; ";"</w:t>
+            </w:r>
+          </w:p>
+        </w:tc>
+      </w:tr>
+      <w:tr>
+        <w:trPr>
+          <w:trHeight w:val="561"/>
+        </w:trPr>
+        <w:tc>
+          <w:tcPr>
+            <w:tcW w:w="10632" w:type="dxa"/>
+            <w:vAlign w:val="center"/>
+          </w:tcPr>
+          <w:p>
+            <w:pPr>
+              <w:pStyle w:val="Prrafodelista"/>
+              <w:ind w:left="0"/>
+              <w:rPr>
+                <w:rFonts w:ascii="Courier New" w:eastAsia="Times New Roman" w:hAnsi="Courier New" w:cs="Courier New"/>
+                <w:sz w:val="22"/>
+                <w:szCs w:val="22"/>
+              </w:rPr>
+            </w:pPr>
+            <w:r>
+              <w:rPr>
+                <w:rFonts w:ascii="Courier New" w:eastAsia="Times New Roman" w:hAnsi="Courier New" w:cs="Courier New"/>
+                <w:sz w:val="22"/>
+                <w:szCs w:val="22"/>
+              </w:rPr>
+              <w:t>&lt;</w:t>
+            </w:r>
+            <w:proofErr w:type="spellStart"/>
+            <w:r>
+              <w:rPr>
+                <w:rFonts w:ascii="Courier New" w:eastAsia="Times New Roman" w:hAnsi="Courier New" w:cs="Courier New"/>
+                <w:sz w:val="22"/>
+                <w:szCs w:val="22"/>
+              </w:rPr>
+              <w:t>funcion</w:t>
+            </w:r>
+            <w:proofErr w:type="spellEnd"/>
+            <w:r>
+              <w:rPr>
+                <w:rFonts w:ascii="Courier New" w:eastAsia="Times New Roman" w:hAnsi="Courier New" w:cs="Courier New"/>
+                <w:sz w:val="22"/>
+                <w:szCs w:val="22"/>
+              </w:rPr>
+              <w:t>&gt; ::= "</w:t>
+            </w:r>
+            <w:proofErr w:type="spellStart"/>
+            <w:r>
+              <w:rPr>
+                <w:rFonts w:ascii="Courier New" w:eastAsia="Times New Roman" w:hAnsi="Courier New" w:cs="Courier New"/>
+                <w:sz w:val="22"/>
+                <w:szCs w:val="22"/>
+              </w:rPr>
+              <w:t>action</w:t>
+            </w:r>
+            <w:proofErr w:type="spellEnd"/>
+            <w:r>
+              <w:rPr>
+                <w:rFonts w:ascii="Courier New" w:eastAsia="Times New Roman" w:hAnsi="Courier New" w:cs="Courier New"/>
+                <w:sz w:val="22"/>
+                <w:szCs w:val="22"/>
+              </w:rPr>
+              <w:t>" &lt;IDENTIFIER&gt; "(" &lt;</w:t>
+            </w:r>
+            <w:proofErr w:type="spellStart"/>
+            <w:r>
+              <w:rPr>
+                <w:rFonts w:ascii="Courier New" w:eastAsia="Times New Roman" w:hAnsi="Courier New" w:cs="Courier New"/>
+                <w:sz w:val="22"/>
+                <w:szCs w:val="22"/>
+              </w:rPr>
+              <w:t>parametros</w:t>
+            </w:r>
+            <w:proofErr w:type="spellEnd"/>
+            <w:r>
+              <w:rPr>
+                <w:rFonts w:ascii="Courier New" w:eastAsia="Times New Roman" w:hAnsi="Courier New" w:cs="Courier New"/>
+                <w:sz w:val="22"/>
+                <w:szCs w:val="22"/>
+              </w:rPr>
+              <w:t>&gt;? ")" "{" &lt;</w:t>
+            </w:r>
+            <w:proofErr w:type="spellStart"/>
+            <w:r>
+              <w:rPr>
+                <w:rFonts w:ascii="Courier New" w:eastAsia="Times New Roman" w:hAnsi="Courier New" w:cs="Courier New"/>
+                <w:sz w:val="22"/>
+                <w:szCs w:val="22"/>
+              </w:rPr>
+              <w:t>statements</w:t>
+            </w:r>
+            <w:proofErr w:type="spellEnd"/>
+            <w:r>
+              <w:rPr>
+                <w:rFonts w:ascii="Courier New" w:eastAsia="Times New Roman" w:hAnsi="Courier New" w:cs="Courier New"/>
+                <w:sz w:val="22"/>
+                <w:szCs w:val="22"/>
+              </w:rPr>
+              <w:t>&gt; "}"</w:t>
+            </w:r>
+          </w:p>
+        </w:tc>
+      </w:tr>
+      <w:tr>
+        <w:trPr>
+          <w:trHeight w:val="556"/>
+        </w:trPr>
+        <w:tc>
+          <w:tcPr>
+            <w:tcW w:w="10632" w:type="dxa"/>
+            <w:vAlign w:val="center"/>
+          </w:tcPr>
+          <w:p>
+            <w:pPr>
+              <w:pStyle w:val="Prrafodelista"/>
+              <w:ind w:left="0"/>
+              <w:rPr>
+                <w:rFonts w:ascii="Courier New" w:eastAsia="Times New Roman" w:hAnsi="Courier New" w:cs="Courier New"/>
+                <w:sz w:val="22"/>
+                <w:szCs w:val="22"/>
+              </w:rPr>
+            </w:pPr>
+            <w:r>
+              <w:rPr>
+                <w:rFonts w:ascii="Courier New" w:eastAsia="Times New Roman" w:hAnsi="Courier New" w:cs="Courier New"/>
+                <w:sz w:val="22"/>
+                <w:szCs w:val="22"/>
+              </w:rPr>
+              <w:t>&lt;</w:t>
+            </w:r>
+            <w:proofErr w:type="spellStart"/>
+            <w:r>
+              <w:rPr>
+                <w:rFonts w:ascii="Courier New" w:eastAsia="Times New Roman" w:hAnsi="Courier New" w:cs="Courier New"/>
+                <w:sz w:val="22"/>
+                <w:szCs w:val="22"/>
+              </w:rPr>
+              <w:t>parametros</w:t>
+            </w:r>
+            <w:proofErr w:type="spellEnd"/>
+            <w:r>
+              <w:rPr>
+                <w:rFonts w:ascii="Courier New" w:eastAsia="Times New Roman" w:hAnsi="Courier New" w:cs="Courier New"/>
+                <w:sz w:val="22"/>
+                <w:szCs w:val="22"/>
+              </w:rPr>
+              <w:t>&gt; ::= &lt;TIPO&gt; &lt;IDENTIFIER&gt; ("," &lt;TIPO&gt; &lt;IDENTIFIER&gt;)*</w:t>
+            </w:r>
+          </w:p>
+        </w:tc>
+      </w:tr>
+      <w:tr>
+        <w:trPr>
+          <w:trHeight w:val="691"/>
+        </w:trPr>
+        <w:tc>
+          <w:tcPr>
+            <w:tcW w:w="10632" w:type="dxa"/>
+            <w:vAlign w:val="center"/>
+          </w:tcPr>
+          <w:p>
+            <w:pPr>
+              <w:pStyle w:val="Prrafodelista"/>
+              <w:ind w:left="0"/>
+              <w:rPr>
+                <w:rFonts w:ascii="Courier New" w:eastAsia="Times New Roman" w:hAnsi="Courier New" w:cs="Courier New"/>
+                <w:sz w:val="22"/>
+                <w:szCs w:val="22"/>
+              </w:rPr>
+            </w:pPr>
+            <w:r>
+              <w:rPr>
+                <w:rFonts w:ascii="Courier New" w:eastAsia="Times New Roman" w:hAnsi="Courier New" w:cs="Courier New"/>
+                <w:sz w:val="22"/>
+                <w:szCs w:val="22"/>
+              </w:rPr>
+              <w:t>&lt;clase&gt; ::= "</w:t>
+            </w:r>
+            <w:proofErr w:type="spellStart"/>
+            <w:r>
+              <w:rPr>
+                <w:rFonts w:ascii="Courier New" w:eastAsia="Times New Roman" w:hAnsi="Courier New" w:cs="Courier New"/>
+                <w:sz w:val="22"/>
+                <w:szCs w:val="22"/>
+              </w:rPr>
+              <w:t>mold</w:t>
+            </w:r>
+            <w:proofErr w:type="spellEnd"/>
+            <w:r>
+              <w:rPr>
+                <w:rFonts w:ascii="Courier New" w:eastAsia="Times New Roman" w:hAnsi="Courier New" w:cs="Courier New"/>
+                <w:sz w:val="22"/>
+                <w:szCs w:val="22"/>
+              </w:rPr>
+              <w:t>" &lt;IDENTIFIER&gt; "{" &lt;</w:t>
+            </w:r>
+            <w:proofErr w:type="spellStart"/>
+            <w:r>
+              <w:rPr>
+                <w:rFonts w:ascii="Courier New" w:eastAsia="Times New Roman" w:hAnsi="Courier New" w:cs="Courier New"/>
+                <w:sz w:val="22"/>
+                <w:szCs w:val="22"/>
+              </w:rPr>
+              <w:t>clase_cuerpo</w:t>
+            </w:r>
+            <w:proofErr w:type="spellEnd"/>
+            <w:r>
+              <w:rPr>
+                <w:rFonts w:ascii="Courier New" w:eastAsia="Times New Roman" w:hAnsi="Courier New" w:cs="Courier New"/>
+                <w:sz w:val="22"/>
+                <w:szCs w:val="22"/>
+              </w:rPr>
+              <w:t>&gt; "}"</w:t>
+            </w:r>
+          </w:p>
+        </w:tc>
+      </w:tr>
+      <w:tr>
+        <w:trPr>
+          <w:trHeight w:val="559"/>
+        </w:trPr>
+        <w:tc>
+          <w:tcPr>
+            <w:tcW w:w="10632" w:type="dxa"/>
+            <w:vAlign w:val="center"/>
+          </w:tcPr>
+          <w:p>
+            <w:pPr>
+              <w:pStyle w:val="Prrafodelista"/>
+              <w:ind w:left="0"/>
+              <w:rPr>
+                <w:rFonts w:ascii="Courier New" w:eastAsia="Times New Roman" w:hAnsi="Courier New" w:cs="Courier New"/>
+                <w:sz w:val="22"/>
+                <w:szCs w:val="22"/>
+              </w:rPr>
+            </w:pPr>
+            <w:r>
+              <w:rPr>
+                <w:rFonts w:ascii="Courier New" w:eastAsia="Times New Roman" w:hAnsi="Courier New" w:cs="Courier New"/>
+                <w:sz w:val="22"/>
+                <w:szCs w:val="22"/>
+              </w:rPr>
+              <w:t>&lt;</w:t>
+            </w:r>
+            <w:proofErr w:type="spellStart"/>
+            <w:r>
+              <w:rPr>
+                <w:rFonts w:ascii="Courier New" w:eastAsia="Times New Roman" w:hAnsi="Courier New" w:cs="Courier New"/>
+                <w:sz w:val="22"/>
+                <w:szCs w:val="22"/>
+              </w:rPr>
+              <w:t>clase_cuerpo</w:t>
+            </w:r>
+            <w:proofErr w:type="spellEnd"/>
+            <w:r>
+              <w:rPr>
+                <w:rFonts w:ascii="Courier New" w:eastAsia="Times New Roman" w:hAnsi="Courier New" w:cs="Courier New"/>
+                <w:sz w:val="22"/>
+                <w:szCs w:val="22"/>
+              </w:rPr>
+              <w:t>&gt; ::= (&lt;atributo&gt; | &lt;</w:t>
+            </w:r>
+            <w:proofErr w:type="spellStart"/>
+            <w:r>
+              <w:rPr>
+                <w:rFonts w:ascii="Courier New" w:eastAsia="Times New Roman" w:hAnsi="Courier New" w:cs="Courier New"/>
+                <w:sz w:val="22"/>
+                <w:szCs w:val="22"/>
+              </w:rPr>
+              <w:t>metodo</w:t>
+            </w:r>
+            <w:proofErr w:type="spellEnd"/>
+            <w:r>
+              <w:rPr>
+                <w:rFonts w:ascii="Courier New" w:eastAsia="Times New Roman" w:hAnsi="Courier New" w:cs="Courier New"/>
+                <w:sz w:val="22"/>
+                <w:szCs w:val="22"/>
+              </w:rPr>
+              <w:t>&gt;)*</w:t>
+            </w:r>
+          </w:p>
+        </w:tc>
+      </w:tr>
+      <w:tr>
+        <w:trPr>
+          <w:trHeight w:val="1843"/>
+        </w:trPr>
+        <w:tc>
+          <w:tcPr>
+            <w:tcW w:w="10632" w:type="dxa"/>
+            <w:vAlign w:val="center"/>
+          </w:tcPr>
+          <w:p>
+            <w:pPr>
+              <w:pStyle w:val="Prrafodelista"/>
+              <w:rPr>
+                <w:rFonts w:ascii="Courier New" w:eastAsia="Times New Roman" w:hAnsi="Courier New" w:cs="Courier New"/>
+                <w:sz w:val="22"/>
+                <w:szCs w:val="22"/>
+                <w:lang w:val="en-US"/>
+              </w:rPr>
+            </w:pPr>
+            <w:r>
+              <w:rPr>
+                <w:rFonts w:ascii="Courier New" w:eastAsia="Times New Roman" w:hAnsi="Courier New" w:cs="Courier New"/>
+                <w:sz w:val="22"/>
+                <w:szCs w:val="22"/>
+                <w:lang w:val="en-US"/>
+              </w:rPr>
+              <w:t>&lt;statements&gt; ::= (&lt;statement&gt;)*</w:t>
+            </w:r>
+          </w:p>
+          <w:p>
+            <w:pPr>
+              <w:pStyle w:val="Prrafodelista"/>
+              <w:rPr>
+                <w:rFonts w:ascii="Courier New" w:eastAsia="Times New Roman" w:hAnsi="Courier New" w:cs="Courier New"/>
+                <w:sz w:val="22"/>
+                <w:szCs w:val="22"/>
+                <w:lang w:val="en-US"/>
+              </w:rPr>
+            </w:pPr>
+          </w:p>
+          <w:p>
+            <w:pPr>
+              <w:pStyle w:val="Prrafodelista"/>
+              <w:rPr>
+                <w:rFonts w:ascii="Courier New" w:eastAsia="Times New Roman" w:hAnsi="Courier New" w:cs="Courier New"/>
+                <w:sz w:val="22"/>
+                <w:szCs w:val="22"/>
+                <w:lang w:val="en-US"/>
+              </w:rPr>
+            </w:pPr>
+            <w:r>
+              <w:rPr>
+                <w:rFonts w:ascii="Courier New" w:eastAsia="Times New Roman" w:hAnsi="Courier New" w:cs="Courier New"/>
+                <w:sz w:val="22"/>
+                <w:szCs w:val="22"/>
+                <w:lang w:val="en-US"/>
+              </w:rPr>
+              <w:t>&lt;statement&gt; ::= &lt;</w:t>
+            </w:r>
+            <w:proofErr w:type="spellStart"/>
+            <w:r>
+              <w:rPr>
+                <w:rFonts w:ascii="Courier New" w:eastAsia="Times New Roman" w:hAnsi="Courier New" w:cs="Courier New"/>
+                <w:sz w:val="22"/>
+                <w:szCs w:val="22"/>
+                <w:lang w:val="en-US"/>
+              </w:rPr>
+              <w:t>if_statement</w:t>
+            </w:r>
+            <w:proofErr w:type="spellEnd"/>
+            <w:r>
+              <w:rPr>
+                <w:rFonts w:ascii="Courier New" w:eastAsia="Times New Roman" w:hAnsi="Courier New" w:cs="Courier New"/>
+                <w:sz w:val="22"/>
+                <w:szCs w:val="22"/>
+                <w:lang w:val="en-US"/>
+              </w:rPr>
+              <w:t>&gt;</w:t>
+            </w:r>
+          </w:p>
+          <w:p>
+            <w:pPr>
+              <w:pStyle w:val="Prrafodelista"/>
+              <w:rPr>
+                <w:rFonts w:ascii="Courier New" w:eastAsia="Times New Roman" w:hAnsi="Courier New" w:cs="Courier New"/>
+                <w:sz w:val="22"/>
+                <w:szCs w:val="22"/>
+                <w:lang w:val="en-US"/>
+              </w:rPr>
+            </w:pPr>
+            <w:r>
+              <w:rPr>
+                <w:rFonts w:ascii="Courier New" w:eastAsia="Times New Roman" w:hAnsi="Courier New" w:cs="Courier New"/>
+                <w:sz w:val="22"/>
+                <w:szCs w:val="22"/>
+                <w:lang w:val="en-US"/>
+              </w:rPr>
+              <w:t xml:space="preserve">              | &lt;</w:t>
+            </w:r>
+            <w:proofErr w:type="spellStart"/>
+            <w:r>
+              <w:rPr>
+                <w:rFonts w:ascii="Courier New" w:eastAsia="Times New Roman" w:hAnsi="Courier New" w:cs="Courier New"/>
+                <w:sz w:val="22"/>
+                <w:szCs w:val="22"/>
+                <w:lang w:val="en-US"/>
+              </w:rPr>
+              <w:t>cycle_statement</w:t>
+            </w:r>
+            <w:proofErr w:type="spellEnd"/>
+            <w:r>
+              <w:rPr>
+                <w:rFonts w:ascii="Courier New" w:eastAsia="Times New Roman" w:hAnsi="Courier New" w:cs="Courier New"/>
+                <w:sz w:val="22"/>
+                <w:szCs w:val="22"/>
+                <w:lang w:val="en-US"/>
+              </w:rPr>
+              <w:t>&gt;</w:t>
+            </w:r>
+          </w:p>
+          <w:p>
+            <w:pPr>
+              <w:pStyle w:val="Prrafodelista"/>
+              <w:rPr>
+                <w:rFonts w:ascii="Courier New" w:eastAsia="Times New Roman" w:hAnsi="Courier New" w:cs="Courier New"/>
+                <w:sz w:val="22"/>
+                <w:szCs w:val="22"/>
+                <w:lang w:val="en-US"/>
+              </w:rPr>
+            </w:pPr>
+            <w:r>
+              <w:rPr>
+                <w:rFonts w:ascii="Courier New" w:eastAsia="Times New Roman" w:hAnsi="Courier New" w:cs="Courier New"/>
+                <w:sz w:val="22"/>
+                <w:szCs w:val="22"/>
+                <w:lang w:val="en-US"/>
+              </w:rPr>
+              <w:t xml:space="preserve">              | &lt;</w:t>
+            </w:r>
+            <w:proofErr w:type="spellStart"/>
+            <w:r>
+              <w:rPr>
+                <w:rFonts w:ascii="Courier New" w:eastAsia="Times New Roman" w:hAnsi="Courier New" w:cs="Courier New"/>
+                <w:sz w:val="22"/>
+                <w:szCs w:val="22"/>
+                <w:lang w:val="en-US"/>
+              </w:rPr>
+              <w:t>simple_statement</w:t>
+            </w:r>
+            <w:proofErr w:type="spellEnd"/>
+            <w:r>
+              <w:rPr>
+                <w:rFonts w:ascii="Courier New" w:eastAsia="Times New Roman" w:hAnsi="Courier New" w:cs="Courier New"/>
+                <w:sz w:val="22"/>
+                <w:szCs w:val="22"/>
+                <w:lang w:val="en-US"/>
+              </w:rPr>
+              <w:t>&gt;</w:t>
+            </w:r>
+          </w:p>
+          <w:p>
+            <w:pPr>
+              <w:pStyle w:val="Prrafodelista"/>
+              <w:ind w:left="0"/>
+              <w:rPr>
+                <w:rFonts w:ascii="Courier New" w:eastAsia="Times New Roman" w:hAnsi="Courier New" w:cs="Courier New"/>
+                <w:sz w:val="22"/>
+                <w:szCs w:val="22"/>
+                <w:lang w:val="en-US"/>
+              </w:rPr>
+            </w:pPr>
+            <w:r>
+              <w:rPr>
+                <w:rFonts w:ascii="Courier New" w:eastAsia="Times New Roman" w:hAnsi="Courier New" w:cs="Courier New"/>
+                <w:sz w:val="22"/>
+                <w:szCs w:val="22"/>
+                <w:lang w:val="en-US"/>
+              </w:rPr>
+              <w:t xml:space="preserve">              | &lt;</w:t>
+            </w:r>
+            <w:proofErr w:type="spellStart"/>
+            <w:r>
+              <w:rPr>
+                <w:rFonts w:ascii="Courier New" w:eastAsia="Times New Roman" w:hAnsi="Courier New" w:cs="Courier New"/>
+                <w:sz w:val="22"/>
+                <w:szCs w:val="22"/>
+                <w:lang w:val="en-US"/>
+              </w:rPr>
+              <w:t>declaracion</w:t>
+            </w:r>
+            <w:proofErr w:type="spellEnd"/>
+            <w:r>
+              <w:rPr>
+                <w:rFonts w:ascii="Courier New" w:eastAsia="Times New Roman" w:hAnsi="Courier New" w:cs="Courier New"/>
+                <w:sz w:val="22"/>
+                <w:szCs w:val="22"/>
+                <w:lang w:val="en-US"/>
+              </w:rPr>
+              <w:t>&gt;</w:t>
+            </w:r>
+          </w:p>
+        </w:tc>
+      </w:tr>
+      <w:tr>
+        <w:trPr>
+          <w:trHeight w:val="835"/>
+        </w:trPr>
+        <w:tc>
+          <w:tcPr>
+            <w:tcW w:w="10632" w:type="dxa"/>
+            <w:vAlign w:val="center"/>
+          </w:tcPr>
+          <w:p>
+            <w:pPr>
+              <w:pStyle w:val="Prrafodelista"/>
+              <w:ind w:left="0"/>
+              <w:rPr>
+                <w:rFonts w:ascii="Courier New" w:eastAsia="Times New Roman" w:hAnsi="Courier New" w:cs="Courier New"/>
+                <w:sz w:val="22"/>
+                <w:szCs w:val="22"/>
+                <w:lang w:val="en-US"/>
+              </w:rPr>
+            </w:pPr>
+            <w:r>
+              <w:rPr>
+                <w:rFonts w:ascii="Courier New" w:eastAsia="Times New Roman" w:hAnsi="Courier New" w:cs="Courier New"/>
+                <w:sz w:val="22"/>
+                <w:szCs w:val="22"/>
+                <w:lang w:val="en-US"/>
+              </w:rPr>
+              <w:t>&lt;</w:t>
+            </w:r>
+            <w:proofErr w:type="spellStart"/>
+            <w:r>
+              <w:rPr>
+                <w:rFonts w:ascii="Courier New" w:eastAsia="Times New Roman" w:hAnsi="Courier New" w:cs="Courier New"/>
+                <w:sz w:val="22"/>
+                <w:szCs w:val="22"/>
+                <w:lang w:val="en-US"/>
+              </w:rPr>
+              <w:t>if_statement</w:t>
+            </w:r>
+            <w:proofErr w:type="spellEnd"/>
+            <w:r>
+              <w:rPr>
+                <w:rFonts w:ascii="Courier New" w:eastAsia="Times New Roman" w:hAnsi="Courier New" w:cs="Courier New"/>
+                <w:sz w:val="22"/>
+                <w:szCs w:val="22"/>
+                <w:lang w:val="en-US"/>
+              </w:rPr>
+              <w:t>&gt; ::= "when" &lt;</w:t>
+            </w:r>
+            <w:proofErr w:type="spellStart"/>
+            <w:r>
+              <w:rPr>
+                <w:rFonts w:ascii="Courier New" w:eastAsia="Times New Roman" w:hAnsi="Courier New" w:cs="Courier New"/>
+                <w:sz w:val="22"/>
+                <w:szCs w:val="22"/>
+                <w:lang w:val="en-US"/>
+              </w:rPr>
+              <w:t>condicion</w:t>
+            </w:r>
+            <w:proofErr w:type="spellEnd"/>
+            <w:r>
+              <w:rPr>
+                <w:rFonts w:ascii="Courier New" w:eastAsia="Times New Roman" w:hAnsi="Courier New" w:cs="Courier New"/>
+                <w:sz w:val="22"/>
+                <w:szCs w:val="22"/>
+                <w:lang w:val="en-US"/>
+              </w:rPr>
+              <w:t>&gt; "{" &lt;statements&gt; "}" ["otherwise" "{" &lt;statements&gt; "}"]</w:t>
+            </w:r>
+          </w:p>
+        </w:tc>
+      </w:tr>
+      <w:tr>
+        <w:trPr>
+          <w:trHeight w:val="832"/>
+        </w:trPr>
+        <w:tc>
+          <w:tcPr>
+            <w:tcW w:w="10632" w:type="dxa"/>
+            <w:vAlign w:val="center"/>
+          </w:tcPr>
+          <w:p>
+            <w:pPr>
+              <w:pStyle w:val="Prrafodelista"/>
+              <w:ind w:left="0"/>
+              <w:rPr>
+                <w:rFonts w:ascii="Courier New" w:eastAsia="Times New Roman" w:hAnsi="Courier New" w:cs="Courier New"/>
+                <w:sz w:val="22"/>
+                <w:szCs w:val="22"/>
+                <w:lang w:val="en-US"/>
+              </w:rPr>
+            </w:pPr>
+            <w:r>
+              <w:rPr>
+                <w:rFonts w:ascii="Courier New" w:eastAsia="Times New Roman" w:hAnsi="Courier New" w:cs="Courier New"/>
+                <w:sz w:val="22"/>
+                <w:szCs w:val="22"/>
+                <w:lang w:val="en-US"/>
+              </w:rPr>
+              <w:t>&lt;</w:t>
+            </w:r>
+            <w:proofErr w:type="spellStart"/>
+            <w:r>
+              <w:rPr>
+                <w:rFonts w:ascii="Courier New" w:eastAsia="Times New Roman" w:hAnsi="Courier New" w:cs="Courier New"/>
+                <w:sz w:val="22"/>
+                <w:szCs w:val="22"/>
+                <w:lang w:val="en-US"/>
+              </w:rPr>
+              <w:t>cycle_statement</w:t>
+            </w:r>
+            <w:proofErr w:type="spellEnd"/>
+            <w:r>
+              <w:rPr>
+                <w:rFonts w:ascii="Courier New" w:eastAsia="Times New Roman" w:hAnsi="Courier New" w:cs="Courier New"/>
+                <w:sz w:val="22"/>
+                <w:szCs w:val="22"/>
+                <w:lang w:val="en-US"/>
+              </w:rPr>
+              <w:t>&gt; ::= "cycle" &lt;IDENTIFIER&gt; ["from" &lt;</w:t>
+            </w:r>
+            <w:proofErr w:type="spellStart"/>
+            <w:r>
+              <w:rPr>
+                <w:rFonts w:ascii="Courier New" w:eastAsia="Times New Roman" w:hAnsi="Courier New" w:cs="Courier New"/>
+                <w:sz w:val="22"/>
+                <w:szCs w:val="22"/>
+                <w:lang w:val="en-US"/>
+              </w:rPr>
+              <w:t>expresion</w:t>
+            </w:r>
+            <w:proofErr w:type="spellEnd"/>
+            <w:r>
+              <w:rPr>
+                <w:rFonts w:ascii="Courier New" w:eastAsia="Times New Roman" w:hAnsi="Courier New" w:cs="Courier New"/>
+                <w:sz w:val="22"/>
+                <w:szCs w:val="22"/>
+                <w:lang w:val="en-US"/>
+              </w:rPr>
+              <w:t>&gt;] ["to" &lt;</w:t>
+            </w:r>
+            <w:proofErr w:type="spellStart"/>
+            <w:r>
+              <w:rPr>
+                <w:rFonts w:ascii="Courier New" w:eastAsia="Times New Roman" w:hAnsi="Courier New" w:cs="Courier New"/>
+                <w:sz w:val="22"/>
+                <w:szCs w:val="22"/>
+                <w:lang w:val="en-US"/>
+              </w:rPr>
+              <w:t>expresion</w:t>
+            </w:r>
+            <w:proofErr w:type="spellEnd"/>
+            <w:r>
+              <w:rPr>
+                <w:rFonts w:ascii="Courier New" w:eastAsia="Times New Roman" w:hAnsi="Courier New" w:cs="Courier New"/>
+                <w:sz w:val="22"/>
+                <w:szCs w:val="22"/>
+                <w:lang w:val="en-US"/>
+              </w:rPr>
+              <w:t>&gt;] "{" &lt;statements&gt; "}"</w:t>
+            </w:r>
+          </w:p>
+        </w:tc>
+      </w:tr>
+      <w:tr>
+        <w:trPr>
+          <w:trHeight w:val="560"/>
+        </w:trPr>
+        <w:tc>
+          <w:tcPr>
+            <w:tcW w:w="10632" w:type="dxa"/>
+            <w:vAlign w:val="center"/>
+          </w:tcPr>
+          <w:p>
+            <w:pPr>
+              <w:pStyle w:val="Prrafodelista"/>
+              <w:ind w:left="0"/>
+              <w:rPr>
+                <w:rFonts w:ascii="Courier New" w:eastAsia="Times New Roman" w:hAnsi="Courier New" w:cs="Courier New"/>
+                <w:sz w:val="22"/>
+                <w:szCs w:val="22"/>
+                <w:lang w:val="en-US"/>
+              </w:rPr>
+            </w:pPr>
+            <w:r>
+              <w:rPr>
+                <w:rFonts w:ascii="Courier New" w:eastAsia="Times New Roman" w:hAnsi="Courier New" w:cs="Courier New"/>
+                <w:sz w:val="22"/>
+                <w:szCs w:val="22"/>
+                <w:lang w:val="en-US"/>
+              </w:rPr>
+              <w:t>&lt;</w:t>
+            </w:r>
+            <w:proofErr w:type="spellStart"/>
+            <w:r>
+              <w:rPr>
+                <w:rFonts w:ascii="Courier New" w:eastAsia="Times New Roman" w:hAnsi="Courier New" w:cs="Courier New"/>
+                <w:sz w:val="22"/>
+                <w:szCs w:val="22"/>
+                <w:lang w:val="en-US"/>
+              </w:rPr>
+              <w:t>simple_statement</w:t>
+            </w:r>
+            <w:proofErr w:type="spellEnd"/>
+            <w:r>
+              <w:rPr>
+                <w:rFonts w:ascii="Courier New" w:eastAsia="Times New Roman" w:hAnsi="Courier New" w:cs="Courier New"/>
+                <w:sz w:val="22"/>
+                <w:szCs w:val="22"/>
+                <w:lang w:val="en-US"/>
+              </w:rPr>
+              <w:t>&gt; ::= &lt;</w:t>
+            </w:r>
+            <w:proofErr w:type="spellStart"/>
+            <w:r>
+              <w:rPr>
+                <w:rFonts w:ascii="Courier New" w:eastAsia="Times New Roman" w:hAnsi="Courier New" w:cs="Courier New"/>
+                <w:sz w:val="22"/>
+                <w:szCs w:val="22"/>
+                <w:lang w:val="en-US"/>
+              </w:rPr>
+              <w:t>expresion</w:t>
+            </w:r>
+            <w:proofErr w:type="spellEnd"/>
+            <w:r>
+              <w:rPr>
+                <w:rFonts w:ascii="Courier New" w:eastAsia="Times New Roman" w:hAnsi="Courier New" w:cs="Courier New"/>
+                <w:sz w:val="22"/>
+                <w:szCs w:val="22"/>
+                <w:lang w:val="en-US"/>
+              </w:rPr>
+              <w:t>&gt; ";"</w:t>
+            </w:r>
+          </w:p>
+        </w:tc>
+      </w:tr>
+      <w:tr>
+        <w:trPr>
+          <w:trHeight w:val="624"/>
+        </w:trPr>
+        <w:tc>
+          <w:tcPr>
+            <w:tcW w:w="10632" w:type="dxa"/>
+            <w:vAlign w:val="center"/>
+          </w:tcPr>
+          <w:p>
+            <w:pPr>
+              <w:pStyle w:val="Prrafodelista"/>
+              <w:ind w:left="0"/>
+              <w:rPr>
+                <w:rFonts w:ascii="Courier New" w:eastAsia="Times New Roman" w:hAnsi="Courier New" w:cs="Courier New"/>
+                <w:sz w:val="22"/>
+                <w:szCs w:val="22"/>
+                <w:lang w:val="en-US"/>
+              </w:rPr>
+            </w:pPr>
+            <w:r>
+              <w:rPr>
+                <w:rFonts w:ascii="Courier New" w:eastAsia="Times New Roman" w:hAnsi="Courier New" w:cs="Courier New"/>
+                <w:sz w:val="22"/>
+                <w:szCs w:val="22"/>
+                <w:lang w:val="en-US"/>
+              </w:rPr>
+              <w:lastRenderedPageBreak/>
+              <w:t>&lt;</w:t>
+            </w:r>
+            <w:proofErr w:type="spellStart"/>
+            <w:r>
+              <w:rPr>
+                <w:rFonts w:ascii="Courier New" w:eastAsia="Times New Roman" w:hAnsi="Courier New" w:cs="Courier New"/>
+                <w:sz w:val="22"/>
+                <w:szCs w:val="22"/>
+                <w:lang w:val="en-US"/>
+              </w:rPr>
+              <w:t>expresion</w:t>
+            </w:r>
+            <w:proofErr w:type="spellEnd"/>
+            <w:r>
+              <w:rPr>
+                <w:rFonts w:ascii="Courier New" w:eastAsia="Times New Roman" w:hAnsi="Courier New" w:cs="Courier New"/>
+                <w:sz w:val="22"/>
+                <w:szCs w:val="22"/>
+                <w:lang w:val="en-US"/>
+              </w:rPr>
+              <w:t>&gt; ::= &lt;literal&gt;</w:t>
+            </w:r>
+          </w:p>
+        </w:tc>
+      </w:tr>
+      <w:tr>
+        <w:trPr>
+          <w:trHeight w:val="557"/>
+        </w:trPr>
+        <w:tc>
+          <w:tcPr>
+            <w:tcW w:w="10632" w:type="dxa"/>
+            <w:vAlign w:val="center"/>
+          </w:tcPr>
+          <w:p>
+            <w:pPr>
+              <w:pStyle w:val="Prrafodelista"/>
+              <w:ind w:left="0"/>
+              <w:rPr>
+                <w:rFonts w:ascii="Courier New" w:eastAsia="Times New Roman" w:hAnsi="Courier New" w:cs="Courier New"/>
+                <w:sz w:val="22"/>
+                <w:szCs w:val="22"/>
+                <w:lang w:val="en-US"/>
+              </w:rPr>
+            </w:pPr>
+            <w:r>
+              <w:rPr>
+                <w:rFonts w:ascii="Courier New" w:eastAsia="Times New Roman" w:hAnsi="Courier New" w:cs="Courier New"/>
+                <w:sz w:val="22"/>
+                <w:szCs w:val="22"/>
+                <w:lang w:val="en-US"/>
+              </w:rPr>
+              <w:t>&lt;literal&gt; ::= &lt;STRING&gt; | &lt;NUMBER&gt; | &lt;BOOLEAN&gt;</w:t>
+            </w:r>
+          </w:p>
+        </w:tc>
+      </w:tr>
+      <w:tr>
+        <w:trPr>
+          <w:trHeight w:val="559"/>
+        </w:trPr>
+        <w:tc>
+          <w:tcPr>
+            <w:tcW w:w="10632" w:type="dxa"/>
+            <w:vAlign w:val="center"/>
+          </w:tcPr>
+          <w:p>
+            <w:pPr>
+              <w:pStyle w:val="Prrafodelista"/>
+              <w:ind w:left="0"/>
+              <w:rPr>
+                <w:rFonts w:ascii="Courier New" w:eastAsia="Times New Roman" w:hAnsi="Courier New" w:cs="Courier New"/>
+                <w:sz w:val="22"/>
+                <w:szCs w:val="22"/>
+                <w:lang w:val="en-US"/>
+              </w:rPr>
+            </w:pPr>
+            <w:r>
+              <w:rPr>
+                <w:rFonts w:ascii="Courier New" w:eastAsia="Times New Roman" w:hAnsi="Courier New" w:cs="Courier New"/>
+                <w:sz w:val="22"/>
+                <w:szCs w:val="22"/>
+                <w:lang w:val="en-US"/>
+              </w:rPr>
+              <w:t>&lt;</w:t>
+            </w:r>
+            <w:proofErr w:type="spellStart"/>
+            <w:r>
+              <w:rPr>
+                <w:rFonts w:ascii="Courier New" w:eastAsia="Times New Roman" w:hAnsi="Courier New" w:cs="Courier New"/>
+                <w:sz w:val="22"/>
+                <w:szCs w:val="22"/>
+                <w:lang w:val="en-US"/>
+              </w:rPr>
+              <w:t>operacion</w:t>
+            </w:r>
+            <w:proofErr w:type="spellEnd"/>
+            <w:r>
+              <w:rPr>
+                <w:rFonts w:ascii="Courier New" w:eastAsia="Times New Roman" w:hAnsi="Courier New" w:cs="Courier New"/>
+                <w:sz w:val="22"/>
+                <w:szCs w:val="22"/>
+                <w:lang w:val="en-US"/>
+              </w:rPr>
+              <w:t>&gt; ::= &lt;IDENTIFIER&gt; &lt;OPERADOR&gt; &lt;IDENTIFIER&gt;</w:t>
+            </w:r>
+          </w:p>
+        </w:tc>
+      </w:tr>
+      <w:tr>
+        <w:trPr>
+          <w:trHeight w:val="553"/>
+        </w:trPr>
+        <w:tc>
+          <w:tcPr>
+            <w:tcW w:w="10632" w:type="dxa"/>
+            <w:vAlign w:val="center"/>
+          </w:tcPr>
+          <w:p>
+            <w:pPr>
+              <w:pStyle w:val="Prrafodelista"/>
+              <w:ind w:left="0"/>
+              <w:rPr>
+                <w:rFonts w:ascii="Courier New" w:eastAsia="Times New Roman" w:hAnsi="Courier New" w:cs="Courier New"/>
+                <w:sz w:val="22"/>
+                <w:szCs w:val="22"/>
+              </w:rPr>
+            </w:pPr>
+            <w:r>
+              <w:rPr>
+                <w:rFonts w:ascii="Courier New" w:eastAsia="Times New Roman" w:hAnsi="Courier New" w:cs="Courier New"/>
+                <w:sz w:val="22"/>
+                <w:szCs w:val="22"/>
+              </w:rPr>
+              <w:t>&lt;</w:t>
+            </w:r>
+            <w:proofErr w:type="spellStart"/>
+            <w:r>
+              <w:rPr>
+                <w:rFonts w:ascii="Courier New" w:eastAsia="Times New Roman" w:hAnsi="Courier New" w:cs="Courier New"/>
+                <w:sz w:val="22"/>
+                <w:szCs w:val="22"/>
+              </w:rPr>
+              <w:t>condicion</w:t>
+            </w:r>
+            <w:proofErr w:type="spellEnd"/>
+            <w:r>
+              <w:rPr>
+                <w:rFonts w:ascii="Courier New" w:eastAsia="Times New Roman" w:hAnsi="Courier New" w:cs="Courier New"/>
+                <w:sz w:val="22"/>
+                <w:szCs w:val="22"/>
+              </w:rPr>
+              <w:t>&gt; ::= &lt;</w:t>
+            </w:r>
+            <w:proofErr w:type="spellStart"/>
+            <w:r>
+              <w:rPr>
+                <w:rFonts w:ascii="Courier New" w:eastAsia="Times New Roman" w:hAnsi="Courier New" w:cs="Courier New"/>
+                <w:sz w:val="22"/>
+                <w:szCs w:val="22"/>
+              </w:rPr>
+              <w:t>expresion</w:t>
+            </w:r>
+            <w:proofErr w:type="spellEnd"/>
+            <w:r>
+              <w:rPr>
+                <w:rFonts w:ascii="Courier New" w:eastAsia="Times New Roman" w:hAnsi="Courier New" w:cs="Courier New"/>
+                <w:sz w:val="22"/>
+                <w:szCs w:val="22"/>
+              </w:rPr>
+              <w:t>&gt; &lt;OPERADOR_COMPARACION&gt; &lt;</w:t>
+            </w:r>
+            <w:proofErr w:type="spellStart"/>
+            <w:r>
+              <w:rPr>
+                <w:rFonts w:ascii="Courier New" w:eastAsia="Times New Roman" w:hAnsi="Courier New" w:cs="Courier New"/>
+                <w:sz w:val="22"/>
+                <w:szCs w:val="22"/>
+              </w:rPr>
+              <w:t>expresion</w:t>
+            </w:r>
+            <w:proofErr w:type="spellEnd"/>
+            <w:r>
+              <w:rPr>
+                <w:rFonts w:ascii="Courier New" w:eastAsia="Times New Roman" w:hAnsi="Courier New" w:cs="Courier New"/>
+                <w:sz w:val="22"/>
+                <w:szCs w:val="22"/>
+              </w:rPr>
+              <w:t>&gt;</w:t>
+            </w:r>
+          </w:p>
+        </w:tc>
+      </w:tr>
+      <w:tr>
+        <w:trPr>
+          <w:trHeight w:val="560"/>
+        </w:trPr>
+        <w:tc>
+          <w:tcPr>
+            <w:tcW w:w="10632" w:type="dxa"/>
+            <w:vAlign w:val="center"/>
+          </w:tcPr>
+          <w:p>
+            <w:pPr>
+              <w:pStyle w:val="Prrafodelista"/>
+              <w:ind w:left="0"/>
+              <w:rPr>
+                <w:rFonts w:ascii="Courier New" w:eastAsia="Times New Roman" w:hAnsi="Courier New" w:cs="Courier New"/>
+                <w:sz w:val="22"/>
+                <w:szCs w:val="22"/>
+                <w:lang w:val="en-US"/>
+              </w:rPr>
+            </w:pPr>
+            <w:r>
+              <w:rPr>
+                <w:rFonts w:ascii="Courier New" w:eastAsia="Times New Roman" w:hAnsi="Courier New" w:cs="Courier New"/>
+                <w:sz w:val="22"/>
+                <w:szCs w:val="22"/>
+                <w:lang w:val="en-US"/>
+              </w:rPr>
+              <w:t>&lt;OPERADOR&gt; ::= "plus" | "minus" | "times" | "divide" | "mod"</w:t>
+            </w:r>
+          </w:p>
+        </w:tc>
+      </w:tr>
+      <w:tr>
+        <w:trPr>
+          <w:trHeight w:val="838"/>
+        </w:trPr>
+        <w:tc>
+          <w:tcPr>
+            <w:tcW w:w="10632" w:type="dxa"/>
+            <w:vAlign w:val="center"/>
+          </w:tcPr>
+          <w:p>
+            <w:pPr>
+              <w:pStyle w:val="Prrafodelista"/>
+              <w:ind w:left="0"/>
+              <w:rPr>
+                <w:rFonts w:ascii="Courier New" w:eastAsia="Times New Roman" w:hAnsi="Courier New" w:cs="Courier New"/>
+                <w:sz w:val="22"/>
+                <w:szCs w:val="22"/>
+                <w:lang w:val="en-US"/>
+              </w:rPr>
+            </w:pPr>
+            <w:r>
+              <w:rPr>
+                <w:rFonts w:ascii="Courier New" w:eastAsia="Times New Roman" w:hAnsi="Courier New" w:cs="Courier New"/>
+                <w:sz w:val="22"/>
+                <w:szCs w:val="22"/>
+                <w:lang w:val="en-US"/>
+              </w:rPr>
+              <w:t>&lt;OPERADOR_COMPARACION&gt; ::= "equals" | "</w:t>
+            </w:r>
+            <w:proofErr w:type="spellStart"/>
+            <w:r>
+              <w:rPr>
+                <w:rFonts w:ascii="Courier New" w:eastAsia="Times New Roman" w:hAnsi="Courier New" w:cs="Courier New"/>
+                <w:sz w:val="22"/>
+                <w:szCs w:val="22"/>
+                <w:lang w:val="en-US"/>
+              </w:rPr>
+              <w:t>notequals</w:t>
+            </w:r>
+            <w:proofErr w:type="spellEnd"/>
+            <w:r>
+              <w:rPr>
+                <w:rFonts w:ascii="Courier New" w:eastAsia="Times New Roman" w:hAnsi="Courier New" w:cs="Courier New"/>
+                <w:sz w:val="22"/>
+                <w:szCs w:val="22"/>
+                <w:lang w:val="en-US"/>
+              </w:rPr>
+              <w:t>" | "greater" | "less" | "</w:t>
+            </w:r>
+            <w:proofErr w:type="spellStart"/>
+            <w:r>
+              <w:rPr>
+                <w:rFonts w:ascii="Courier New" w:eastAsia="Times New Roman" w:hAnsi="Courier New" w:cs="Courier New"/>
+                <w:sz w:val="22"/>
+                <w:szCs w:val="22"/>
+                <w:lang w:val="en-US"/>
+              </w:rPr>
+              <w:t>greatereq</w:t>
+            </w:r>
+            <w:proofErr w:type="spellEnd"/>
+            <w:r>
+              <w:rPr>
+                <w:rFonts w:ascii="Courier New" w:eastAsia="Times New Roman" w:hAnsi="Courier New" w:cs="Courier New"/>
+                <w:sz w:val="22"/>
+                <w:szCs w:val="22"/>
+                <w:lang w:val="en-US"/>
+              </w:rPr>
+              <w:t>" | "</w:t>
+            </w:r>
+            <w:proofErr w:type="spellStart"/>
+            <w:r>
+              <w:rPr>
+                <w:rFonts w:ascii="Courier New" w:eastAsia="Times New Roman" w:hAnsi="Courier New" w:cs="Courier New"/>
+                <w:sz w:val="22"/>
+                <w:szCs w:val="22"/>
+                <w:lang w:val="en-US"/>
+              </w:rPr>
+              <w:t>lesseq</w:t>
+            </w:r>
+            <w:proofErr w:type="spellEnd"/>
+            <w:r>
+              <w:rPr>
+                <w:rFonts w:ascii="Courier New" w:eastAsia="Times New Roman" w:hAnsi="Courier New" w:cs="Courier New"/>
+                <w:sz w:val="22"/>
+                <w:szCs w:val="22"/>
+                <w:lang w:val="en-US"/>
+              </w:rPr>
+              <w:t>"</w:t>
+            </w:r>
+          </w:p>
+        </w:tc>
+      </w:tr>
+      <w:tr>
+        <w:trPr>
+          <w:trHeight w:val="553"/>
+        </w:trPr>
+        <w:tc>
+          <w:tcPr>
+            <w:tcW w:w="10632" w:type="dxa"/>
+            <w:vAlign w:val="center"/>
+          </w:tcPr>
+          <w:p>
+            <w:pPr>
+              <w:pStyle w:val="Prrafodelista"/>
+              <w:ind w:left="0"/>
+              <w:rPr>
+                <w:rFonts w:ascii="Courier New" w:eastAsia="Times New Roman" w:hAnsi="Courier New" w:cs="Courier New"/>
+                <w:sz w:val="22"/>
+                <w:szCs w:val="22"/>
+                <w:lang w:val="en-US"/>
+              </w:rPr>
+            </w:pPr>
+            <w:r>
+              <w:rPr>
+                <w:rFonts w:ascii="Courier New" w:eastAsia="Times New Roman" w:hAnsi="Courier New" w:cs="Courier New"/>
+                <w:sz w:val="22"/>
+                <w:szCs w:val="22"/>
+                <w:lang w:val="en-US"/>
+              </w:rPr>
+              <w:t>&lt;TIPO&gt; ::= "logic" | "whole" | "</w:t>
+            </w:r>
+            <w:proofErr w:type="spellStart"/>
+            <w:r>
+              <w:rPr>
+                <w:rFonts w:ascii="Courier New" w:eastAsia="Times New Roman" w:hAnsi="Courier New" w:cs="Courier New"/>
+                <w:sz w:val="22"/>
+                <w:szCs w:val="22"/>
+                <w:lang w:val="en-US"/>
+              </w:rPr>
+              <w:t>fract</w:t>
+            </w:r>
+            <w:proofErr w:type="spellEnd"/>
+            <w:r>
+              <w:rPr>
+                <w:rFonts w:ascii="Courier New" w:eastAsia="Times New Roman" w:hAnsi="Courier New" w:cs="Courier New"/>
+                <w:sz w:val="22"/>
+                <w:szCs w:val="22"/>
+                <w:lang w:val="en-US"/>
+              </w:rPr>
+              <w:t>" | "text" | "char" | "grid" | "chain"</w:t>
+            </w:r>
+          </w:p>
+        </w:tc>
+      </w:tr>
+      <w:tr>
+        <w:trPr>
+          <w:trHeight w:val="783"/>
+        </w:trPr>
+        <w:tc>
+          <w:tcPr>
+            <w:tcW w:w="10632" w:type="dxa"/>
+            <w:vAlign w:val="center"/>
+          </w:tcPr>
+          <w:p>
+            <w:pPr>
+              <w:pStyle w:val="Prrafodelista"/>
+              <w:ind w:left="0"/>
+              <w:rPr>
+                <w:rFonts w:ascii="Courier New" w:eastAsia="Times New Roman" w:hAnsi="Courier New" w:cs="Courier New"/>
+                <w:sz w:val="22"/>
+                <w:szCs w:val="22"/>
+                <w:lang w:val="en-US"/>
+              </w:rPr>
+            </w:pPr>
+            <w:r>
+              <w:rPr>
+                <w:rFonts w:ascii="Courier New" w:eastAsia="Times New Roman" w:hAnsi="Courier New" w:cs="Courier New"/>
+                <w:sz w:val="22"/>
+                <w:szCs w:val="22"/>
+                <w:lang w:val="en-US"/>
+              </w:rPr>
+              <w:t>&lt;KEYWORD&gt; ::= "mold" | "data" | "action" | "when" | "otherwise" | "cycle" | "from" | "to" | "set"</w:t>
+            </w:r>
+          </w:p>
+        </w:tc>
+      </w:tr>
+    </w:tbl>
+    <w:p>
+      <w:pPr>
+        <w:pStyle w:val="Prrafodelista"/>
+        <w:ind w:left="0"/>
+        <w:rPr>
+          <w:rFonts w:ascii="Times New Roman" w:eastAsia="Times New Roman" w:hAnsi="Times New Roman" w:cs="Times New Roman"/>
+          <w:lang w:val="en-US"/>
+        </w:rPr>
+      </w:pPr>
+    </w:p>
+    <w:p>
+      <w:pPr>
+        <w:pStyle w:val="Prrafodelista"/>
+        <w:ind w:left="0"/>
+        <w:rPr>
+          <w:rFonts w:ascii="Times New Roman" w:eastAsia="Times New Roman" w:hAnsi="Times New Roman" w:cs="Times New Roman"/>
+          <w:lang w:val="en-US"/>
+        </w:rPr>
+      </w:pPr>
+    </w:p>
+    <w:p>
+      <w:pPr>
+        <w:pStyle w:val="Prrafodelista"/>
+        <w:ind w:left="0"/>
+        <w:rPr>
+          <w:rFonts w:ascii="Times New Roman" w:eastAsia="Times New Roman" w:hAnsi="Times New Roman" w:cs="Times New Roman"/>
+          <w:lang w:val="en-US"/>
+        </w:rPr>
+      </w:pPr>
+    </w:p>
+    <w:p>
+      <w:pPr>
+        <w:pStyle w:val="Prrafodelista"/>
+        <w:ind w:left="0"/>
+        <w:rPr>
+          <w:rFonts w:ascii="Times New Roman" w:eastAsia="Times New Roman" w:hAnsi="Times New Roman" w:cs="Times New Roman"/>
+          <w:lang w:val="en-US"/>
         </w:rPr>
       </w:pPr>
     </w:p>
@@ -9757,6 +11580,7 @@
   <w:style w:type="character" w:default="1" w:styleId="Fuentedeprrafopredeter">
     <w:name w:val="Default Paragraph Font"/>
     <w:uiPriority w:val="1"/>
+    <w:semiHidden/>
     <w:unhideWhenUsed/>
   </w:style>
   <w:style w:type="table" w:default="1" w:styleId="Tablanormal">

</xml_diff>

<commit_message>
Update HOOP.docx and add HOOP.pdf
Updated the HOOP.docx document and added a new HOOP.pdf file to the docs directory. This provides both editable and PDF versions of the document.
</commit_message>
<xml_diff>
--- a/docs/HOOP.docx
+++ b/docs/HOOP.docx
@@ -6208,12 +6208,14 @@
         </w:rPr>
         <w:t xml:space="preserve">, por </w:t>
       </w:r>
+      <w:proofErr w:type="gramStart"/>
       <w:r>
         <w:rPr>
           <w:rFonts w:ascii="Times New Roman" w:eastAsia="Times New Roman" w:hAnsi="Times New Roman" w:cs="Times New Roman"/>
         </w:rPr>
         <w:t>último</w:t>
       </w:r>
+      <w:proofErr w:type="gramEnd"/>
       <w:r>
         <w:rPr>
           <w:rFonts w:ascii="Times New Roman" w:eastAsia="Times New Roman" w:hAnsi="Times New Roman" w:cs="Times New Roman"/>
@@ -9095,7 +9097,14 @@
         <w:rPr>
           <w:rFonts w:ascii="Times New Roman" w:eastAsia="Times New Roman" w:hAnsi="Times New Roman" w:cs="Times New Roman"/>
         </w:rPr>
-        <w:t>), T</w:t>
+        <w:t xml:space="preserve">), </w:t>
+      </w:r>
+      <w:proofErr w:type="gramStart"/>
+      <w:r>
+        <w:rPr>
+          <w:rFonts w:ascii="Times New Roman" w:eastAsia="Times New Roman" w:hAnsi="Times New Roman" w:cs="Times New Roman"/>
+        </w:rPr>
+        <w:t>T</w:t>
       </w:r>
       <w:r>
         <w:rPr>
@@ -9110,6 +9119,7 @@
         <w:t>(</w:t>
       </w:r>
       <w:proofErr w:type="spellStart"/>
+      <w:proofErr w:type="gramEnd"/>
       <w:r>
         <w:rPr>
           <w:rFonts w:ascii="Times New Roman" w:eastAsia="Times New Roman" w:hAnsi="Times New Roman" w:cs="Times New Roman"/>
@@ -9412,7 +9422,25 @@
                 <w:sz w:val="22"/>
                 <w:szCs w:val="22"/>
               </w:rPr>
-              <w:t>&lt;programa&gt; ::= (&lt;</w:t>
+              <w:t>&lt;programa</w:t>
+            </w:r>
+            <w:proofErr w:type="gramStart"/>
+            <w:r>
+              <w:rPr>
+                <w:rFonts w:ascii="Courier New" w:eastAsia="Times New Roman" w:hAnsi="Courier New" w:cs="Courier New"/>
+                <w:sz w:val="22"/>
+                <w:szCs w:val="22"/>
+              </w:rPr>
+              <w:t>&gt; ::=</w:t>
+            </w:r>
+            <w:proofErr w:type="gramEnd"/>
+            <w:r>
+              <w:rPr>
+                <w:rFonts w:ascii="Courier New" w:eastAsia="Times New Roman" w:hAnsi="Courier New" w:cs="Courier New"/>
+                <w:sz w:val="22"/>
+                <w:szCs w:val="22"/>
+              </w:rPr>
+              <w:t xml:space="preserve"> (&lt;</w:t>
             </w:r>
             <w:proofErr w:type="spellStart"/>
             <w:r>
@@ -9460,13 +9488,23 @@
               <w:t>statement</w:t>
             </w:r>
             <w:proofErr w:type="spellEnd"/>
-            <w:r>
-              <w:rPr>
-                <w:rFonts w:ascii="Courier New" w:eastAsia="Times New Roman" w:hAnsi="Courier New" w:cs="Courier New"/>
-                <w:sz w:val="22"/>
-                <w:szCs w:val="22"/>
-              </w:rPr>
-              <w:t>&gt;)* &lt;EOF&gt;</w:t>
+            <w:proofErr w:type="gramStart"/>
+            <w:r>
+              <w:rPr>
+                <w:rFonts w:ascii="Courier New" w:eastAsia="Times New Roman" w:hAnsi="Courier New" w:cs="Courier New"/>
+                <w:sz w:val="22"/>
+                <w:szCs w:val="22"/>
+              </w:rPr>
+              <w:t>&gt;)*</w:t>
+            </w:r>
+            <w:proofErr w:type="gramEnd"/>
+            <w:r>
+              <w:rPr>
+                <w:rFonts w:ascii="Courier New" w:eastAsia="Times New Roman" w:hAnsi="Courier New" w:cs="Courier New"/>
+                <w:sz w:val="22"/>
+                <w:szCs w:val="22"/>
+              </w:rPr>
+              <w:t xml:space="preserve"> &lt;EOF&gt;</w:t>
             </w:r>
           </w:p>
         </w:tc>
@@ -9508,13 +9546,23 @@
               <w:t>declaracion</w:t>
             </w:r>
             <w:proofErr w:type="spellEnd"/>
-            <w:r>
-              <w:rPr>
-                <w:rFonts w:ascii="Courier New" w:eastAsia="Times New Roman" w:hAnsi="Courier New" w:cs="Courier New"/>
-                <w:sz w:val="22"/>
-                <w:szCs w:val="22"/>
-              </w:rPr>
-              <w:t>&gt; ::= "data" &lt;IDENTIFIER&gt; "set" &lt;</w:t>
+            <w:proofErr w:type="gramStart"/>
+            <w:r>
+              <w:rPr>
+                <w:rFonts w:ascii="Courier New" w:eastAsia="Times New Roman" w:hAnsi="Courier New" w:cs="Courier New"/>
+                <w:sz w:val="22"/>
+                <w:szCs w:val="22"/>
+              </w:rPr>
+              <w:t>&gt; ::=</w:t>
+            </w:r>
+            <w:proofErr w:type="gramEnd"/>
+            <w:r>
+              <w:rPr>
+                <w:rFonts w:ascii="Courier New" w:eastAsia="Times New Roman" w:hAnsi="Courier New" w:cs="Courier New"/>
+                <w:sz w:val="22"/>
+                <w:szCs w:val="22"/>
+              </w:rPr>
+              <w:t xml:space="preserve"> "data" &lt;IDENTIFIER&gt; "set" &lt;</w:t>
             </w:r>
             <w:proofErr w:type="spellStart"/>
             <w:r>
@@ -9574,13 +9622,23 @@
               <w:t>funcion</w:t>
             </w:r>
             <w:proofErr w:type="spellEnd"/>
-            <w:r>
-              <w:rPr>
-                <w:rFonts w:ascii="Courier New" w:eastAsia="Times New Roman" w:hAnsi="Courier New" w:cs="Courier New"/>
-                <w:sz w:val="22"/>
-                <w:szCs w:val="22"/>
-              </w:rPr>
-              <w:t>&gt; ::= "</w:t>
+            <w:proofErr w:type="gramStart"/>
+            <w:r>
+              <w:rPr>
+                <w:rFonts w:ascii="Courier New" w:eastAsia="Times New Roman" w:hAnsi="Courier New" w:cs="Courier New"/>
+                <w:sz w:val="22"/>
+                <w:szCs w:val="22"/>
+              </w:rPr>
+              <w:t>&gt; ::=</w:t>
+            </w:r>
+            <w:proofErr w:type="gramEnd"/>
+            <w:r>
+              <w:rPr>
+                <w:rFonts w:ascii="Courier New" w:eastAsia="Times New Roman" w:hAnsi="Courier New" w:cs="Courier New"/>
+                <w:sz w:val="22"/>
+                <w:szCs w:val="22"/>
+              </w:rPr>
+              <w:t xml:space="preserve"> "</w:t>
             </w:r>
             <w:proofErr w:type="spellStart"/>
             <w:r>
@@ -9598,7 +9656,16 @@
                 <w:sz w:val="22"/>
                 <w:szCs w:val="22"/>
               </w:rPr>
-              <w:t>" &lt;IDENTIFIER&gt; "(" &lt;</w:t>
+              <w:t>" &lt;IDENTIFIER&gt; "(</w:t>
+            </w:r>
+            <w:proofErr w:type="gramStart"/>
+            <w:r>
+              <w:rPr>
+                <w:rFonts w:ascii="Courier New" w:eastAsia="Times New Roman" w:hAnsi="Courier New" w:cs="Courier New"/>
+                <w:sz w:val="22"/>
+                <w:szCs w:val="22"/>
+              </w:rPr>
+              <w:t>" &lt;</w:t>
             </w:r>
             <w:proofErr w:type="spellStart"/>
             <w:r>
@@ -9616,7 +9683,16 @@
                 <w:sz w:val="22"/>
                 <w:szCs w:val="22"/>
               </w:rPr>
-              <w:t>&gt;? ")" "{" &lt;</w:t>
+              <w:t>&gt;?</w:t>
+            </w:r>
+            <w:proofErr w:type="gramEnd"/>
+            <w:r>
+              <w:rPr>
+                <w:rFonts w:ascii="Courier New" w:eastAsia="Times New Roman" w:hAnsi="Courier New" w:cs="Courier New"/>
+                <w:sz w:val="22"/>
+                <w:szCs w:val="22"/>
+              </w:rPr>
+              <w:t xml:space="preserve"> ")" "{" &lt;</w:t>
             </w:r>
             <w:proofErr w:type="spellStart"/>
             <w:r>
@@ -9636,6 +9712,232 @@
               </w:rPr>
               <w:t>&gt; "}"</w:t>
             </w:r>
+          </w:p>
+        </w:tc>
+      </w:tr>
+      <w:tr>
+        <w:trPr>
+          <w:trHeight w:val="696"/>
+        </w:trPr>
+        <w:tc>
+          <w:tcPr>
+            <w:tcW w:w="10632" w:type="dxa"/>
+            <w:vAlign w:val="center"/>
+          </w:tcPr>
+          <w:p>
+            <w:pPr>
+              <w:pStyle w:val="Prrafodelista"/>
+              <w:ind w:left="0"/>
+              <w:rPr>
+                <w:rFonts w:ascii="Courier New" w:eastAsia="Times New Roman" w:hAnsi="Courier New" w:cs="Courier New"/>
+                <w:sz w:val="22"/>
+                <w:szCs w:val="22"/>
+              </w:rPr>
+            </w:pPr>
+            <w:r>
+              <w:rPr>
+                <w:rFonts w:ascii="Courier New" w:eastAsia="Times New Roman" w:hAnsi="Courier New" w:cs="Courier New"/>
+                <w:sz w:val="22"/>
+                <w:szCs w:val="22"/>
+              </w:rPr>
+              <w:t>&lt;</w:t>
+            </w:r>
+            <w:proofErr w:type="spellStart"/>
+            <w:r>
+              <w:rPr>
+                <w:rFonts w:ascii="Courier New" w:eastAsia="Times New Roman" w:hAnsi="Courier New" w:cs="Courier New"/>
+                <w:sz w:val="22"/>
+                <w:szCs w:val="22"/>
+              </w:rPr>
+              <w:t>funcion_global</w:t>
+            </w:r>
+            <w:proofErr w:type="spellEnd"/>
+            <w:proofErr w:type="gramStart"/>
+            <w:r>
+              <w:rPr>
+                <w:rFonts w:ascii="Courier New" w:eastAsia="Times New Roman" w:hAnsi="Courier New" w:cs="Courier New"/>
+                <w:sz w:val="22"/>
+                <w:szCs w:val="22"/>
+              </w:rPr>
+              <w:t>&gt; ::=</w:t>
+            </w:r>
+            <w:proofErr w:type="gramEnd"/>
+            <w:r>
+              <w:rPr>
+                <w:rFonts w:ascii="Courier New" w:eastAsia="Times New Roman" w:hAnsi="Courier New" w:cs="Courier New"/>
+                <w:sz w:val="22"/>
+                <w:szCs w:val="22"/>
+              </w:rPr>
+              <w:t xml:space="preserve"> "</w:t>
+            </w:r>
+            <w:proofErr w:type="spellStart"/>
+            <w:r>
+              <w:rPr>
+                <w:rFonts w:ascii="Courier New" w:eastAsia="Times New Roman" w:hAnsi="Courier New" w:cs="Courier New"/>
+                <w:sz w:val="22"/>
+                <w:szCs w:val="22"/>
+              </w:rPr>
+              <w:t>action</w:t>
+            </w:r>
+            <w:proofErr w:type="spellEnd"/>
+            <w:r>
+              <w:rPr>
+                <w:rFonts w:ascii="Courier New" w:eastAsia="Times New Roman" w:hAnsi="Courier New" w:cs="Courier New"/>
+                <w:sz w:val="22"/>
+                <w:szCs w:val="22"/>
+              </w:rPr>
+              <w:t>" &lt;IDENTIFIER&gt; "(</w:t>
+            </w:r>
+            <w:proofErr w:type="gramStart"/>
+            <w:r>
+              <w:rPr>
+                <w:rFonts w:ascii="Courier New" w:eastAsia="Times New Roman" w:hAnsi="Courier New" w:cs="Courier New"/>
+                <w:sz w:val="22"/>
+                <w:szCs w:val="22"/>
+              </w:rPr>
+              <w:t>" &lt;</w:t>
+            </w:r>
+            <w:proofErr w:type="spellStart"/>
+            <w:r>
+              <w:rPr>
+                <w:rFonts w:ascii="Courier New" w:eastAsia="Times New Roman" w:hAnsi="Courier New" w:cs="Courier New"/>
+                <w:sz w:val="22"/>
+                <w:szCs w:val="22"/>
+              </w:rPr>
+              <w:t>parametros</w:t>
+            </w:r>
+            <w:proofErr w:type="spellEnd"/>
+            <w:r>
+              <w:rPr>
+                <w:rFonts w:ascii="Courier New" w:eastAsia="Times New Roman" w:hAnsi="Courier New" w:cs="Courier New"/>
+                <w:sz w:val="22"/>
+                <w:szCs w:val="22"/>
+              </w:rPr>
+              <w:t>&gt;?</w:t>
+            </w:r>
+            <w:proofErr w:type="gramEnd"/>
+            <w:r>
+              <w:rPr>
+                <w:rFonts w:ascii="Courier New" w:eastAsia="Times New Roman" w:hAnsi="Courier New" w:cs="Courier New"/>
+                <w:sz w:val="22"/>
+                <w:szCs w:val="22"/>
+              </w:rPr>
+              <w:t xml:space="preserve"> ")" "{" &lt;</w:t>
+            </w:r>
+            <w:proofErr w:type="spellStart"/>
+            <w:r>
+              <w:rPr>
+                <w:rFonts w:ascii="Courier New" w:eastAsia="Times New Roman" w:hAnsi="Courier New" w:cs="Courier New"/>
+                <w:sz w:val="22"/>
+                <w:szCs w:val="22"/>
+              </w:rPr>
+              <w:t>statements</w:t>
+            </w:r>
+            <w:proofErr w:type="spellEnd"/>
+            <w:r>
+              <w:rPr>
+                <w:rFonts w:ascii="Courier New" w:eastAsia="Times New Roman" w:hAnsi="Courier New" w:cs="Courier New"/>
+                <w:sz w:val="22"/>
+                <w:szCs w:val="22"/>
+              </w:rPr>
+              <w:t>&gt; "}"</w:t>
+            </w:r>
+          </w:p>
+        </w:tc>
+      </w:tr>
+      <w:tr>
+        <w:trPr>
+          <w:trHeight w:val="690"/>
+        </w:trPr>
+        <w:tc>
+          <w:tcPr>
+            <w:tcW w:w="10632" w:type="dxa"/>
+            <w:vAlign w:val="center"/>
+          </w:tcPr>
+          <w:p>
+            <w:pPr>
+              <w:pStyle w:val="Prrafodelista"/>
+              <w:ind w:left="0"/>
+              <w:rPr>
+                <w:rFonts w:ascii="Courier New" w:eastAsia="Times New Roman" w:hAnsi="Courier New" w:cs="Courier New"/>
+                <w:sz w:val="22"/>
+                <w:szCs w:val="22"/>
+              </w:rPr>
+            </w:pPr>
+            <w:r>
+              <w:rPr>
+                <w:rFonts w:ascii="Courier New" w:eastAsia="Times New Roman" w:hAnsi="Courier New" w:cs="Courier New"/>
+                <w:sz w:val="22"/>
+                <w:szCs w:val="22"/>
+              </w:rPr>
+              <w:t>&lt;</w:t>
+            </w:r>
+            <w:proofErr w:type="spellStart"/>
+            <w:r>
+              <w:rPr>
+                <w:rFonts w:ascii="Courier New" w:eastAsia="Times New Roman" w:hAnsi="Courier New" w:cs="Courier New"/>
+                <w:sz w:val="22"/>
+                <w:szCs w:val="22"/>
+              </w:rPr>
+              <w:t>parametros</w:t>
+            </w:r>
+            <w:proofErr w:type="spellEnd"/>
+            <w:proofErr w:type="gramStart"/>
+            <w:r>
+              <w:rPr>
+                <w:rFonts w:ascii="Courier New" w:eastAsia="Times New Roman" w:hAnsi="Courier New" w:cs="Courier New"/>
+                <w:sz w:val="22"/>
+                <w:szCs w:val="22"/>
+              </w:rPr>
+              <w:t>&gt; ::=</w:t>
+            </w:r>
+            <w:proofErr w:type="gramEnd"/>
+            <w:r>
+              <w:rPr>
+                <w:rFonts w:ascii="Courier New" w:eastAsia="Times New Roman" w:hAnsi="Courier New" w:cs="Courier New"/>
+                <w:sz w:val="22"/>
+                <w:szCs w:val="22"/>
+              </w:rPr>
+              <w:t xml:space="preserve"> &lt;</w:t>
+            </w:r>
+            <w:proofErr w:type="spellStart"/>
+            <w:r>
+              <w:rPr>
+                <w:rFonts w:ascii="Courier New" w:eastAsia="Times New Roman" w:hAnsi="Courier New" w:cs="Courier New"/>
+                <w:sz w:val="22"/>
+                <w:szCs w:val="22"/>
+              </w:rPr>
+              <w:t>parametro</w:t>
+            </w:r>
+            <w:proofErr w:type="spellEnd"/>
+            <w:r>
+              <w:rPr>
+                <w:rFonts w:ascii="Courier New" w:eastAsia="Times New Roman" w:hAnsi="Courier New" w:cs="Courier New"/>
+                <w:sz w:val="22"/>
+                <w:szCs w:val="22"/>
+              </w:rPr>
+              <w:t>&gt; ("," &lt;</w:t>
+            </w:r>
+            <w:proofErr w:type="spellStart"/>
+            <w:r>
+              <w:rPr>
+                <w:rFonts w:ascii="Courier New" w:eastAsia="Times New Roman" w:hAnsi="Courier New" w:cs="Courier New"/>
+                <w:sz w:val="22"/>
+                <w:szCs w:val="22"/>
+              </w:rPr>
+              <w:t>parametro</w:t>
+            </w:r>
+            <w:proofErr w:type="spellEnd"/>
+            <w:proofErr w:type="gramStart"/>
+            <w:r>
+              <w:rPr>
+                <w:rFonts w:ascii="Courier New" w:eastAsia="Times New Roman" w:hAnsi="Courier New" w:cs="Courier New"/>
+                <w:sz w:val="22"/>
+                <w:szCs w:val="22"/>
+              </w:rPr>
+              <w:t>&gt;)*</w:t>
+            </w:r>
+            <w:proofErr w:type="gramEnd"/>
           </w:p>
         </w:tc>
       </w:tr>
@@ -9676,14 +9978,34 @@
               <w:t>parametros</w:t>
             </w:r>
             <w:proofErr w:type="spellEnd"/>
-            <w:r>
-              <w:rPr>
-                <w:rFonts w:ascii="Courier New" w:eastAsia="Times New Roman" w:hAnsi="Courier New" w:cs="Courier New"/>
-                <w:sz w:val="22"/>
-                <w:szCs w:val="22"/>
-              </w:rPr>
-              <w:t>&gt; ::= &lt;TIPO&gt; &lt;IDENTIFIER&gt; ("," &lt;TIPO&gt; &lt;IDENTIFIER&gt;)*</w:t>
-            </w:r>
+            <w:proofErr w:type="gramStart"/>
+            <w:r>
+              <w:rPr>
+                <w:rFonts w:ascii="Courier New" w:eastAsia="Times New Roman" w:hAnsi="Courier New" w:cs="Courier New"/>
+                <w:sz w:val="22"/>
+                <w:szCs w:val="22"/>
+              </w:rPr>
+              <w:t>&gt; ::=</w:t>
+            </w:r>
+            <w:proofErr w:type="gramEnd"/>
+            <w:r>
+              <w:rPr>
+                <w:rFonts w:ascii="Courier New" w:eastAsia="Times New Roman" w:hAnsi="Courier New" w:cs="Courier New"/>
+                <w:sz w:val="22"/>
+                <w:szCs w:val="22"/>
+              </w:rPr>
+              <w:t xml:space="preserve"> &lt;TIPO&gt; &lt;IDENTIFIER&gt; ("," &lt;TIPO&gt; &lt;IDENTIFIER</w:t>
+            </w:r>
+            <w:proofErr w:type="gramStart"/>
+            <w:r>
+              <w:rPr>
+                <w:rFonts w:ascii="Courier New" w:eastAsia="Times New Roman" w:hAnsi="Courier New" w:cs="Courier New"/>
+                <w:sz w:val="22"/>
+                <w:szCs w:val="22"/>
+              </w:rPr>
+              <w:t>&gt;)*</w:t>
+            </w:r>
+            <w:proofErr w:type="gramEnd"/>
           </w:p>
         </w:tc>
       </w:tr>
@@ -9712,7 +10034,25 @@
                 <w:sz w:val="22"/>
                 <w:szCs w:val="22"/>
               </w:rPr>
-              <w:t>&lt;clase&gt; ::= "</w:t>
+              <w:t>&lt;clase</w:t>
+            </w:r>
+            <w:proofErr w:type="gramStart"/>
+            <w:r>
+              <w:rPr>
+                <w:rFonts w:ascii="Courier New" w:eastAsia="Times New Roman" w:hAnsi="Courier New" w:cs="Courier New"/>
+                <w:sz w:val="22"/>
+                <w:szCs w:val="22"/>
+              </w:rPr>
+              <w:t>&gt; ::=</w:t>
+            </w:r>
+            <w:proofErr w:type="gramEnd"/>
+            <w:r>
+              <w:rPr>
+                <w:rFonts w:ascii="Courier New" w:eastAsia="Times New Roman" w:hAnsi="Courier New" w:cs="Courier New"/>
+                <w:sz w:val="22"/>
+                <w:szCs w:val="22"/>
+              </w:rPr>
+              <w:t xml:space="preserve"> "</w:t>
             </w:r>
             <w:proofErr w:type="spellStart"/>
             <w:r>
@@ -9790,13 +10130,23 @@
               <w:t>clase_cuerpo</w:t>
             </w:r>
             <w:proofErr w:type="spellEnd"/>
-            <w:r>
-              <w:rPr>
-                <w:rFonts w:ascii="Courier New" w:eastAsia="Times New Roman" w:hAnsi="Courier New" w:cs="Courier New"/>
-                <w:sz w:val="22"/>
-                <w:szCs w:val="22"/>
-              </w:rPr>
-              <w:t>&gt; ::= (&lt;atributo&gt; | &lt;</w:t>
+            <w:proofErr w:type="gramStart"/>
+            <w:r>
+              <w:rPr>
+                <w:rFonts w:ascii="Courier New" w:eastAsia="Times New Roman" w:hAnsi="Courier New" w:cs="Courier New"/>
+                <w:sz w:val="22"/>
+                <w:szCs w:val="22"/>
+              </w:rPr>
+              <w:t>&gt; ::=</w:t>
+            </w:r>
+            <w:proofErr w:type="gramEnd"/>
+            <w:r>
+              <w:rPr>
+                <w:rFonts w:ascii="Courier New" w:eastAsia="Times New Roman" w:hAnsi="Courier New" w:cs="Courier New"/>
+                <w:sz w:val="22"/>
+                <w:szCs w:val="22"/>
+              </w:rPr>
+              <w:t xml:space="preserve"> (&lt;atributo&gt; | &lt;</w:t>
             </w:r>
             <w:proofErr w:type="spellStart"/>
             <w:r>
@@ -9808,6 +10158,7 @@
               <w:t>metodo</w:t>
             </w:r>
             <w:proofErr w:type="spellEnd"/>
+            <w:proofErr w:type="gramStart"/>
             <w:r>
               <w:rPr>
                 <w:rFonts w:ascii="Courier New" w:eastAsia="Times New Roman" w:hAnsi="Courier New" w:cs="Courier New"/>
@@ -9816,6 +10167,7 @@
               </w:rPr>
               <w:t>&gt;)*</w:t>
             </w:r>
+            <w:proofErr w:type="gramEnd"/>
           </w:p>
         </w:tc>
       </w:tr>
@@ -9845,30 +10197,29 @@
                 <w:szCs w:val="22"/>
                 <w:lang w:val="en-US"/>
               </w:rPr>
-              <w:t>&lt;statements&gt; ::= (&lt;statement&gt;)*</w:t>
-            </w:r>
-          </w:p>
-          <w:p>
-            <w:pPr>
-              <w:pStyle w:val="Prrafodelista"/>
+              <w:t>&lt;statements</w:t>
+            </w:r>
+            <w:proofErr w:type="gramStart"/>
+            <w:r>
               <w:rPr>
                 <w:rFonts w:ascii="Courier New" w:eastAsia="Times New Roman" w:hAnsi="Courier New" w:cs="Courier New"/>
                 <w:sz w:val="22"/>
                 <w:szCs w:val="22"/>
                 <w:lang w:val="en-US"/>
               </w:rPr>
-            </w:pPr>
-          </w:p>
-          <w:p>
-            <w:pPr>
-              <w:pStyle w:val="Prrafodelista"/>
+              <w:t>&gt; ::=</w:t>
+            </w:r>
+            <w:proofErr w:type="gramEnd"/>
+            <w:r>
               <w:rPr>
                 <w:rFonts w:ascii="Courier New" w:eastAsia="Times New Roman" w:hAnsi="Courier New" w:cs="Courier New"/>
                 <w:sz w:val="22"/>
                 <w:szCs w:val="22"/>
                 <w:lang w:val="en-US"/>
               </w:rPr>
-            </w:pPr>
+              <w:t xml:space="preserve"> (&lt;statement</w:t>
+            </w:r>
+            <w:proofErr w:type="gramStart"/>
             <w:r>
               <w:rPr>
                 <w:rFonts w:ascii="Courier New" w:eastAsia="Times New Roman" w:hAnsi="Courier New" w:cs="Courier New"/>
@@ -9876,7 +10227,59 @@
                 <w:szCs w:val="22"/>
                 <w:lang w:val="en-US"/>
               </w:rPr>
-              <w:t>&lt;statement&gt; ::= &lt;</w:t>
+              <w:t>&gt;)*</w:t>
+            </w:r>
+            <w:proofErr w:type="gramEnd"/>
+          </w:p>
+          <w:p>
+            <w:pPr>
+              <w:pStyle w:val="Prrafodelista"/>
+              <w:rPr>
+                <w:rFonts w:ascii="Courier New" w:eastAsia="Times New Roman" w:hAnsi="Courier New" w:cs="Courier New"/>
+                <w:sz w:val="22"/>
+                <w:szCs w:val="22"/>
+                <w:lang w:val="en-US"/>
+              </w:rPr>
+            </w:pPr>
+          </w:p>
+          <w:p>
+            <w:pPr>
+              <w:pStyle w:val="Prrafodelista"/>
+              <w:rPr>
+                <w:rFonts w:ascii="Courier New" w:eastAsia="Times New Roman" w:hAnsi="Courier New" w:cs="Courier New"/>
+                <w:sz w:val="22"/>
+                <w:szCs w:val="22"/>
+                <w:lang w:val="en-US"/>
+              </w:rPr>
+            </w:pPr>
+            <w:r>
+              <w:rPr>
+                <w:rFonts w:ascii="Courier New" w:eastAsia="Times New Roman" w:hAnsi="Courier New" w:cs="Courier New"/>
+                <w:sz w:val="22"/>
+                <w:szCs w:val="22"/>
+                <w:lang w:val="en-US"/>
+              </w:rPr>
+              <w:t>&lt;statement</w:t>
+            </w:r>
+            <w:proofErr w:type="gramStart"/>
+            <w:r>
+              <w:rPr>
+                <w:rFonts w:ascii="Courier New" w:eastAsia="Times New Roman" w:hAnsi="Courier New" w:cs="Courier New"/>
+                <w:sz w:val="22"/>
+                <w:szCs w:val="22"/>
+                <w:lang w:val="en-US"/>
+              </w:rPr>
+              <w:t>&gt; ::=</w:t>
+            </w:r>
+            <w:proofErr w:type="gramEnd"/>
+            <w:r>
+              <w:rPr>
+                <w:rFonts w:ascii="Courier New" w:eastAsia="Times New Roman" w:hAnsi="Courier New" w:cs="Courier New"/>
+                <w:sz w:val="22"/>
+                <w:szCs w:val="22"/>
+                <w:lang w:val="en-US"/>
+              </w:rPr>
+              <w:t xml:space="preserve"> &lt;</w:t>
             </w:r>
             <w:proofErr w:type="spellStart"/>
             <w:r>
@@ -10062,6 +10465,7 @@
               <w:t>if_statement</w:t>
             </w:r>
             <w:proofErr w:type="spellEnd"/>
+            <w:proofErr w:type="gramStart"/>
             <w:r>
               <w:rPr>
                 <w:rFonts w:ascii="Courier New" w:eastAsia="Times New Roman" w:hAnsi="Courier New" w:cs="Courier New"/>
@@ -10069,7 +10473,17 @@
                 <w:szCs w:val="22"/>
                 <w:lang w:val="en-US"/>
               </w:rPr>
-              <w:t>&gt; ::= "when" &lt;</w:t>
+              <w:t>&gt; ::=</w:t>
+            </w:r>
+            <w:proofErr w:type="gramEnd"/>
+            <w:r>
+              <w:rPr>
+                <w:rFonts w:ascii="Courier New" w:eastAsia="Times New Roman" w:hAnsi="Courier New" w:cs="Courier New"/>
+                <w:sz w:val="22"/>
+                <w:szCs w:val="22"/>
+                <w:lang w:val="en-US"/>
+              </w:rPr>
+              <w:t xml:space="preserve"> "when" &lt;</w:t>
             </w:r>
             <w:proofErr w:type="spellStart"/>
             <w:r>
@@ -10082,6 +10496,7 @@
               <w:t>condicion</w:t>
             </w:r>
             <w:proofErr w:type="spellEnd"/>
+            <w:proofErr w:type="gramStart"/>
             <w:r>
               <w:rPr>
                 <w:rFonts w:ascii="Courier New" w:eastAsia="Times New Roman" w:hAnsi="Courier New" w:cs="Courier New"/>
@@ -10089,7 +10504,77 @@
                 <w:szCs w:val="22"/>
                 <w:lang w:val="en-US"/>
               </w:rPr>
-              <w:t>&gt; "{" &lt;statements&gt; "}" ["otherwise" "{" &lt;statements&gt; "}"]</w:t>
+              <w:t>&gt; "{</w:t>
+            </w:r>
+            <w:proofErr w:type="gramEnd"/>
+            <w:r>
+              <w:rPr>
+                <w:rFonts w:ascii="Courier New" w:eastAsia="Times New Roman" w:hAnsi="Courier New" w:cs="Courier New"/>
+                <w:sz w:val="22"/>
+                <w:szCs w:val="22"/>
+                <w:lang w:val="en-US"/>
+              </w:rPr>
+              <w:t>" &lt;statements</w:t>
+            </w:r>
+            <w:proofErr w:type="gramStart"/>
+            <w:r>
+              <w:rPr>
+                <w:rFonts w:ascii="Courier New" w:eastAsia="Times New Roman" w:hAnsi="Courier New" w:cs="Courier New"/>
+                <w:sz w:val="22"/>
+                <w:szCs w:val="22"/>
+                <w:lang w:val="en-US"/>
+              </w:rPr>
+              <w:t>&gt; "}</w:t>
+            </w:r>
+            <w:proofErr w:type="gramEnd"/>
+            <w:r>
+              <w:rPr>
+                <w:rFonts w:ascii="Courier New" w:eastAsia="Times New Roman" w:hAnsi="Courier New" w:cs="Courier New"/>
+                <w:sz w:val="22"/>
+                <w:szCs w:val="22"/>
+                <w:lang w:val="en-US"/>
+              </w:rPr>
+              <w:t>" ["otherwise</w:t>
+            </w:r>
+            <w:proofErr w:type="gramStart"/>
+            <w:r>
+              <w:rPr>
+                <w:rFonts w:ascii="Courier New" w:eastAsia="Times New Roman" w:hAnsi="Courier New" w:cs="Courier New"/>
+                <w:sz w:val="22"/>
+                <w:szCs w:val="22"/>
+                <w:lang w:val="en-US"/>
+              </w:rPr>
+              <w:t>" "{</w:t>
+            </w:r>
+            <w:proofErr w:type="gramEnd"/>
+            <w:r>
+              <w:rPr>
+                <w:rFonts w:ascii="Courier New" w:eastAsia="Times New Roman" w:hAnsi="Courier New" w:cs="Courier New"/>
+                <w:sz w:val="22"/>
+                <w:szCs w:val="22"/>
+                <w:lang w:val="en-US"/>
+              </w:rPr>
+              <w:t>" &lt;statements</w:t>
+            </w:r>
+            <w:proofErr w:type="gramStart"/>
+            <w:r>
+              <w:rPr>
+                <w:rFonts w:ascii="Courier New" w:eastAsia="Times New Roman" w:hAnsi="Courier New" w:cs="Courier New"/>
+                <w:sz w:val="22"/>
+                <w:szCs w:val="22"/>
+                <w:lang w:val="en-US"/>
+              </w:rPr>
+              <w:t>&gt; "}"</w:t>
+            </w:r>
+            <w:proofErr w:type="gramEnd"/>
+            <w:r>
+              <w:rPr>
+                <w:rFonts w:ascii="Courier New" w:eastAsia="Times New Roman" w:hAnsi="Courier New" w:cs="Courier New"/>
+                <w:sz w:val="22"/>
+                <w:szCs w:val="22"/>
+                <w:lang w:val="en-US"/>
+              </w:rPr>
+              <w:t>]</w:t>
             </w:r>
           </w:p>
         </w:tc>
@@ -10121,6 +10606,7 @@
                 <w:szCs w:val="22"/>
                 <w:lang w:val="en-US"/>
               </w:rPr>
+              <w:lastRenderedPageBreak/>
               <w:t>&lt;</w:t>
             </w:r>
             <w:proofErr w:type="spellStart"/>
@@ -10134,6 +10620,7 @@
               <w:t>cycle_statement</w:t>
             </w:r>
             <w:proofErr w:type="spellEnd"/>
+            <w:proofErr w:type="gramStart"/>
             <w:r>
               <w:rPr>
                 <w:rFonts w:ascii="Courier New" w:eastAsia="Times New Roman" w:hAnsi="Courier New" w:cs="Courier New"/>
@@ -10141,7 +10628,17 @@
                 <w:szCs w:val="22"/>
                 <w:lang w:val="en-US"/>
               </w:rPr>
-              <w:t>&gt; ::= "cycle" &lt;IDENTIFIER&gt; ["from" &lt;</w:t>
+              <w:t>&gt; ::=</w:t>
+            </w:r>
+            <w:proofErr w:type="gramEnd"/>
+            <w:r>
+              <w:rPr>
+                <w:rFonts w:ascii="Courier New" w:eastAsia="Times New Roman" w:hAnsi="Courier New" w:cs="Courier New"/>
+                <w:sz w:val="22"/>
+                <w:szCs w:val="22"/>
+                <w:lang w:val="en-US"/>
+              </w:rPr>
+              <w:t xml:space="preserve"> "cycle" &lt;IDENTIFIER&gt; ["from" &lt;</w:t>
             </w:r>
             <w:proofErr w:type="spellStart"/>
             <w:r>
@@ -10181,7 +10678,27 @@
                 <w:szCs w:val="22"/>
                 <w:lang w:val="en-US"/>
               </w:rPr>
-              <w:t>&gt;] "{" &lt;statements&gt; "}"</w:t>
+              <w:t>&gt;</w:t>
+            </w:r>
+            <w:proofErr w:type="gramStart"/>
+            <w:r>
+              <w:rPr>
+                <w:rFonts w:ascii="Courier New" w:eastAsia="Times New Roman" w:hAnsi="Courier New" w:cs="Courier New"/>
+                <w:sz w:val="22"/>
+                <w:szCs w:val="22"/>
+                <w:lang w:val="en-US"/>
+              </w:rPr>
+              <w:t>] "{</w:t>
+            </w:r>
+            <w:proofErr w:type="gramEnd"/>
+            <w:r>
+              <w:rPr>
+                <w:rFonts w:ascii="Courier New" w:eastAsia="Times New Roman" w:hAnsi="Courier New" w:cs="Courier New"/>
+                <w:sz w:val="22"/>
+                <w:szCs w:val="22"/>
+                <w:lang w:val="en-US"/>
+              </w:rPr>
+              <w:t>" &lt;statements&gt; "}"</w:t>
             </w:r>
           </w:p>
         </w:tc>
@@ -10226,6 +10743,7 @@
               <w:t>simple_statement</w:t>
             </w:r>
             <w:proofErr w:type="spellEnd"/>
+            <w:proofErr w:type="gramStart"/>
             <w:r>
               <w:rPr>
                 <w:rFonts w:ascii="Courier New" w:eastAsia="Times New Roman" w:hAnsi="Courier New" w:cs="Courier New"/>
@@ -10233,7 +10751,17 @@
                 <w:szCs w:val="22"/>
                 <w:lang w:val="en-US"/>
               </w:rPr>
-              <w:t>&gt; ::= &lt;</w:t>
+              <w:t>&gt; ::=</w:t>
+            </w:r>
+            <w:proofErr w:type="gramEnd"/>
+            <w:r>
+              <w:rPr>
+                <w:rFonts w:ascii="Courier New" w:eastAsia="Times New Roman" w:hAnsi="Courier New" w:cs="Courier New"/>
+                <w:sz w:val="22"/>
+                <w:szCs w:val="22"/>
+                <w:lang w:val="en-US"/>
+              </w:rPr>
+              <w:t xml:space="preserve"> &lt;</w:t>
             </w:r>
             <w:proofErr w:type="spellStart"/>
             <w:r>
@@ -10285,7 +10813,6 @@
                 <w:szCs w:val="22"/>
                 <w:lang w:val="en-US"/>
               </w:rPr>
-              <w:lastRenderedPageBreak/>
               <w:t>&lt;</w:t>
             </w:r>
             <w:proofErr w:type="spellStart"/>
@@ -10299,6 +10826,7 @@
               <w:t>expresion</w:t>
             </w:r>
             <w:proofErr w:type="spellEnd"/>
+            <w:proofErr w:type="gramStart"/>
             <w:r>
               <w:rPr>
                 <w:rFonts w:ascii="Courier New" w:eastAsia="Times New Roman" w:hAnsi="Courier New" w:cs="Courier New"/>
@@ -10306,7 +10834,17 @@
                 <w:szCs w:val="22"/>
                 <w:lang w:val="en-US"/>
               </w:rPr>
-              <w:t>&gt; ::= &lt;literal&gt;</w:t>
+              <w:t>&gt; ::=</w:t>
+            </w:r>
+            <w:proofErr w:type="gramEnd"/>
+            <w:r>
+              <w:rPr>
+                <w:rFonts w:ascii="Courier New" w:eastAsia="Times New Roman" w:hAnsi="Courier New" w:cs="Courier New"/>
+                <w:sz w:val="22"/>
+                <w:szCs w:val="22"/>
+                <w:lang w:val="en-US"/>
+              </w:rPr>
+              <w:t xml:space="preserve"> &lt;literal&gt;</w:t>
             </w:r>
           </w:p>
         </w:tc>
@@ -10338,7 +10876,27 @@
                 <w:szCs w:val="22"/>
                 <w:lang w:val="en-US"/>
               </w:rPr>
-              <w:t>&lt;literal&gt; ::= &lt;STRING&gt; | &lt;NUMBER&gt; | &lt;BOOLEAN&gt;</w:t>
+              <w:t>&lt;literal</w:t>
+            </w:r>
+            <w:proofErr w:type="gramStart"/>
+            <w:r>
+              <w:rPr>
+                <w:rFonts w:ascii="Courier New" w:eastAsia="Times New Roman" w:hAnsi="Courier New" w:cs="Courier New"/>
+                <w:sz w:val="22"/>
+                <w:szCs w:val="22"/>
+                <w:lang w:val="en-US"/>
+              </w:rPr>
+              <w:t>&gt; ::=</w:t>
+            </w:r>
+            <w:proofErr w:type="gramEnd"/>
+            <w:r>
+              <w:rPr>
+                <w:rFonts w:ascii="Courier New" w:eastAsia="Times New Roman" w:hAnsi="Courier New" w:cs="Courier New"/>
+                <w:sz w:val="22"/>
+                <w:szCs w:val="22"/>
+                <w:lang w:val="en-US"/>
+              </w:rPr>
+              <w:t xml:space="preserve"> &lt;STRING&gt; | &lt;NUMBER&gt; | &lt;BOOLEAN&gt;</w:t>
             </w:r>
           </w:p>
         </w:tc>
@@ -10383,6 +10941,7 @@
               <w:t>operacion</w:t>
             </w:r>
             <w:proofErr w:type="spellEnd"/>
+            <w:proofErr w:type="gramStart"/>
             <w:r>
               <w:rPr>
                 <w:rFonts w:ascii="Courier New" w:eastAsia="Times New Roman" w:hAnsi="Courier New" w:cs="Courier New"/>
@@ -10390,7 +10949,17 @@
                 <w:szCs w:val="22"/>
                 <w:lang w:val="en-US"/>
               </w:rPr>
-              <w:t>&gt; ::= &lt;IDENTIFIER&gt; &lt;OPERADOR&gt; &lt;IDENTIFIER&gt;</w:t>
+              <w:t>&gt; ::=</w:t>
+            </w:r>
+            <w:proofErr w:type="gramEnd"/>
+            <w:r>
+              <w:rPr>
+                <w:rFonts w:ascii="Courier New" w:eastAsia="Times New Roman" w:hAnsi="Courier New" w:cs="Courier New"/>
+                <w:sz w:val="22"/>
+                <w:szCs w:val="22"/>
+                <w:lang w:val="en-US"/>
+              </w:rPr>
+              <w:t xml:space="preserve"> &lt;IDENTIFIER&gt; &lt;OPERADOR&gt; &lt;IDENTIFIER&gt;</w:t>
             </w:r>
           </w:p>
         </w:tc>
@@ -10432,13 +11001,23 @@
               <w:t>condicion</w:t>
             </w:r>
             <w:proofErr w:type="spellEnd"/>
-            <w:r>
-              <w:rPr>
-                <w:rFonts w:ascii="Courier New" w:eastAsia="Times New Roman" w:hAnsi="Courier New" w:cs="Courier New"/>
-                <w:sz w:val="22"/>
-                <w:szCs w:val="22"/>
-              </w:rPr>
-              <w:t>&gt; ::= &lt;</w:t>
+            <w:proofErr w:type="gramStart"/>
+            <w:r>
+              <w:rPr>
+                <w:rFonts w:ascii="Courier New" w:eastAsia="Times New Roman" w:hAnsi="Courier New" w:cs="Courier New"/>
+                <w:sz w:val="22"/>
+                <w:szCs w:val="22"/>
+              </w:rPr>
+              <w:t>&gt; ::=</w:t>
+            </w:r>
+            <w:proofErr w:type="gramEnd"/>
+            <w:r>
+              <w:rPr>
+                <w:rFonts w:ascii="Courier New" w:eastAsia="Times New Roman" w:hAnsi="Courier New" w:cs="Courier New"/>
+                <w:sz w:val="22"/>
+                <w:szCs w:val="22"/>
+              </w:rPr>
+              <w:t xml:space="preserve"> &lt;</w:t>
             </w:r>
             <w:proofErr w:type="spellStart"/>
             <w:r>
@@ -10506,7 +11085,27 @@
                 <w:szCs w:val="22"/>
                 <w:lang w:val="en-US"/>
               </w:rPr>
-              <w:t>&lt;OPERADOR&gt; ::= "plus" | "minus" | "times" | "divide" | "mod"</w:t>
+              <w:t>&lt;OPERADOR</w:t>
+            </w:r>
+            <w:proofErr w:type="gramStart"/>
+            <w:r>
+              <w:rPr>
+                <w:rFonts w:ascii="Courier New" w:eastAsia="Times New Roman" w:hAnsi="Courier New" w:cs="Courier New"/>
+                <w:sz w:val="22"/>
+                <w:szCs w:val="22"/>
+                <w:lang w:val="en-US"/>
+              </w:rPr>
+              <w:t>&gt; ::=</w:t>
+            </w:r>
+            <w:proofErr w:type="gramEnd"/>
+            <w:r>
+              <w:rPr>
+                <w:rFonts w:ascii="Courier New" w:eastAsia="Times New Roman" w:hAnsi="Courier New" w:cs="Courier New"/>
+                <w:sz w:val="22"/>
+                <w:szCs w:val="22"/>
+                <w:lang w:val="en-US"/>
+              </w:rPr>
+              <w:t xml:space="preserve"> "plus" | "minus" | "times" | "divide" | "mod"</w:t>
             </w:r>
           </w:p>
         </w:tc>
@@ -10538,7 +11137,27 @@
                 <w:szCs w:val="22"/>
                 <w:lang w:val="en-US"/>
               </w:rPr>
-              <w:t>&lt;OPERADOR_COMPARACION&gt; ::= "equals" | "</w:t>
+              <w:t>&lt;OPERADOR_COMPARACION</w:t>
+            </w:r>
+            <w:proofErr w:type="gramStart"/>
+            <w:r>
+              <w:rPr>
+                <w:rFonts w:ascii="Courier New" w:eastAsia="Times New Roman" w:hAnsi="Courier New" w:cs="Courier New"/>
+                <w:sz w:val="22"/>
+                <w:szCs w:val="22"/>
+                <w:lang w:val="en-US"/>
+              </w:rPr>
+              <w:t>&gt; ::=</w:t>
+            </w:r>
+            <w:proofErr w:type="gramEnd"/>
+            <w:r>
+              <w:rPr>
+                <w:rFonts w:ascii="Courier New" w:eastAsia="Times New Roman" w:hAnsi="Courier New" w:cs="Courier New"/>
+                <w:sz w:val="22"/>
+                <w:szCs w:val="22"/>
+                <w:lang w:val="en-US"/>
+              </w:rPr>
+              <w:t xml:space="preserve"> "equals" | "</w:t>
             </w:r>
             <w:proofErr w:type="spellStart"/>
             <w:r>
@@ -10630,7 +11249,27 @@
                 <w:szCs w:val="22"/>
                 <w:lang w:val="en-US"/>
               </w:rPr>
-              <w:t>&lt;TIPO&gt; ::= "logic" | "whole" | "</w:t>
+              <w:t>&lt;TIPO</w:t>
+            </w:r>
+            <w:proofErr w:type="gramStart"/>
+            <w:r>
+              <w:rPr>
+                <w:rFonts w:ascii="Courier New" w:eastAsia="Times New Roman" w:hAnsi="Courier New" w:cs="Courier New"/>
+                <w:sz w:val="22"/>
+                <w:szCs w:val="22"/>
+                <w:lang w:val="en-US"/>
+              </w:rPr>
+              <w:t>&gt; ::=</w:t>
+            </w:r>
+            <w:proofErr w:type="gramEnd"/>
+            <w:r>
+              <w:rPr>
+                <w:rFonts w:ascii="Courier New" w:eastAsia="Times New Roman" w:hAnsi="Courier New" w:cs="Courier New"/>
+                <w:sz w:val="22"/>
+                <w:szCs w:val="22"/>
+                <w:lang w:val="en-US"/>
+              </w:rPr>
+              <w:t xml:space="preserve"> "logic" | "whole" | "</w:t>
             </w:r>
             <w:proofErr w:type="spellStart"/>
             <w:r>
@@ -10682,7 +11321,27 @@
                 <w:szCs w:val="22"/>
                 <w:lang w:val="en-US"/>
               </w:rPr>
-              <w:t>&lt;KEYWORD&gt; ::= "mold" | "data" | "action" | "when" | "otherwise" | "cycle" | "from" | "to" | "set"</w:t>
+              <w:t>&lt;KEYWORD</w:t>
+            </w:r>
+            <w:proofErr w:type="gramStart"/>
+            <w:r>
+              <w:rPr>
+                <w:rFonts w:ascii="Courier New" w:eastAsia="Times New Roman" w:hAnsi="Courier New" w:cs="Courier New"/>
+                <w:sz w:val="22"/>
+                <w:szCs w:val="22"/>
+                <w:lang w:val="en-US"/>
+              </w:rPr>
+              <w:t>&gt; ::=</w:t>
+            </w:r>
+            <w:proofErr w:type="gramEnd"/>
+            <w:r>
+              <w:rPr>
+                <w:rFonts w:ascii="Courier New" w:eastAsia="Times New Roman" w:hAnsi="Courier New" w:cs="Courier New"/>
+                <w:sz w:val="22"/>
+                <w:szCs w:val="22"/>
+                <w:lang w:val="en-US"/>
+              </w:rPr>
+              <w:t xml:space="preserve"> "mold" | "data" | "action" | "when" | "otherwise" | "cycle" | "from" | "to" | "set"</w:t>
             </w:r>
           </w:p>
         </w:tc>

</xml_diff>